<commit_message>
docs: add last version of technical document in git
</commit_message>
<xml_diff>
--- a/documents/Петренко_Тигранян_ТЗ.docx
+++ b/documents/Петренко_Тигранян_ТЗ.docx
@@ -1,6 +1,6 @@
 
 <file path=word/document.xml><?xml version="1.0" encoding="utf-8"?>
-<w:document xmlns:wpc="http://schemas.microsoft.com/office/word/2010/wordprocessingCanvas" xmlns:cx="http://schemas.microsoft.com/office/drawing/2014/chartex" xmlns:cx1="http://schemas.microsoft.com/office/drawing/2015/9/8/chartex" xmlns:cx2="http://schemas.microsoft.com/office/drawing/2015/10/21/chartex" xmlns:cx3="http://schemas.microsoft.com/office/drawing/2016/5/9/chartex" xmlns:cx4="http://schemas.microsoft.com/office/drawing/2016/5/10/chartex" xmlns:cx5="http://schemas.microsoft.com/office/drawing/2016/5/11/chartex" xmlns:cx6="http://schemas.microsoft.com/office/drawing/2016/5/12/chartex" xmlns:cx7="http://schemas.microsoft.com/office/drawing/2016/5/13/chartex" xmlns:cx8="http://schemas.microsoft.com/office/drawing/2016/5/14/chartex" xmlns:mc="http://schemas.openxmlformats.org/markup-compatibility/2006" xmlns:aink="http://schemas.microsoft.com/office/drawing/2016/ink" xmlns:am3d="http://schemas.microsoft.com/office/drawing/2017/model3d" xmlns:o="urn:schemas-microsoft-com:office:office" xmlns:oel="http://schemas.microsoft.com/office/2019/extlst" xmlns:r="http://schemas.openxmlformats.org/officeDocument/2006/relationships" xmlns:m="http://schemas.openxmlformats.org/officeDocument/2006/math" xmlns:v="urn:schemas-microsoft-com:vml" xmlns:wp14="http://schemas.microsoft.com/office/word/2010/wordprocessingDrawing" xmlns:wp="http://schemas.openxmlformats.org/drawingml/2006/wordprocessingDrawing" xmlns:w10="urn:schemas-microsoft-com:office:word" xmlns:w="http://schemas.openxmlformats.org/wordprocessingml/2006/main" xmlns:w14="http://schemas.microsoft.com/office/word/2010/wordml" xmlns:w15="http://schemas.microsoft.com/office/word/2012/wordml" xmlns:w16cex="http://schemas.microsoft.com/office/word/2018/wordml/cex" xmlns:w16cid="http://schemas.microsoft.com/office/word/2016/wordml/cid" xmlns:w16="http://schemas.microsoft.com/office/word/2018/wordml" xmlns:w16sdtdh="http://schemas.microsoft.com/office/word/2020/wordml/sdtdatahash" xmlns:w16se="http://schemas.microsoft.com/office/word/2015/wordml/symex" xmlns:wpg="http://schemas.microsoft.com/office/word/2010/wordprocessingGroup" xmlns:wpi="http://schemas.microsoft.com/office/word/2010/wordprocessingInk" xmlns:wne="http://schemas.microsoft.com/office/word/2006/wordml" xmlns:wps="http://schemas.microsoft.com/office/word/2010/wordprocessingShape" mc:Ignorable="w14 w15 w16se w16cid w16 w16cex w16sdtdh wp14">
+<w:document xmlns:wpc="http://schemas.microsoft.com/office/word/2010/wordprocessingCanvas" xmlns:cx="http://schemas.microsoft.com/office/drawing/2014/chartex" xmlns:cx1="http://schemas.microsoft.com/office/drawing/2015/9/8/chartex" xmlns:cx2="http://schemas.microsoft.com/office/drawing/2015/10/21/chartex" xmlns:cx3="http://schemas.microsoft.com/office/drawing/2016/5/9/chartex" xmlns:cx4="http://schemas.microsoft.com/office/drawing/2016/5/10/chartex" xmlns:cx5="http://schemas.microsoft.com/office/drawing/2016/5/11/chartex" xmlns:cx6="http://schemas.microsoft.com/office/drawing/2016/5/12/chartex" xmlns:cx7="http://schemas.microsoft.com/office/drawing/2016/5/13/chartex" xmlns:cx8="http://schemas.microsoft.com/office/drawing/2016/5/14/chartex" xmlns:mc="http://schemas.openxmlformats.org/markup-compatibility/2006" xmlns:aink="http://schemas.microsoft.com/office/drawing/2016/ink" xmlns:am3d="http://schemas.microsoft.com/office/drawing/2017/model3d" xmlns:o="urn:schemas-microsoft-com:office:office" xmlns:oel="http://schemas.microsoft.com/office/2019/extlst" xmlns:r="http://schemas.openxmlformats.org/officeDocument/2006/relationships" xmlns:m="http://schemas.openxmlformats.org/officeDocument/2006/math" xmlns:v="urn:schemas-microsoft-com:vml" xmlns:wp14="http://schemas.microsoft.com/office/word/2010/wordprocessingDrawing" xmlns:wp="http://schemas.openxmlformats.org/drawingml/2006/wordprocessingDrawing" xmlns:w10="urn:schemas-microsoft-com:office:word" xmlns:w="http://schemas.openxmlformats.org/wordprocessingml/2006/main" xmlns:w14="http://schemas.microsoft.com/office/word/2010/wordml" xmlns:w15="http://schemas.microsoft.com/office/word/2012/wordml" xmlns:w16cex="http://schemas.microsoft.com/office/word/2018/wordml/cex" xmlns:w16cid="http://schemas.microsoft.com/office/word/2016/wordml/cid" xmlns:w16="http://schemas.microsoft.com/office/word/2018/wordml" xmlns:w16du="http://schemas.microsoft.com/office/word/2023/wordml/word16du" xmlns:w16sdtdh="http://schemas.microsoft.com/office/word/2020/wordml/sdtdatahash" xmlns:w16sdtfl="http://schemas.microsoft.com/office/word/2024/wordml/sdtformatlock" xmlns:w16se="http://schemas.microsoft.com/office/word/2015/wordml/symex" xmlns:wpg="http://schemas.microsoft.com/office/word/2010/wordprocessingGroup" xmlns:wpi="http://schemas.microsoft.com/office/word/2010/wordprocessingInk" xmlns:wne="http://schemas.microsoft.com/office/word/2006/wordml" xmlns:wps="http://schemas.microsoft.com/office/word/2010/wordprocessingShape" mc:Ignorable="w14 w15 w16se w16cid w16 w16cex w16sdtdh w16sdtfl w16du wp14">
   <w:body>
     <w:p>
       <w:pPr>
@@ -52,6 +52,7 @@
         <w:rPr>
           <w:sz w:val="34"/>
           <w:szCs w:val="34"/>
+          <w:lang w:val="ru-RU"/>
         </w:rPr>
       </w:pPr>
       <w:r>
@@ -59,23 +60,7 @@
           <w:sz w:val="34"/>
           <w:szCs w:val="34"/>
         </w:rPr>
-        <w:t xml:space="preserve">Первой задачей проекта является создание единого </w:t>
-      </w:r>
-      <w:proofErr w:type="spellStart"/>
-      <w:r>
-        <w:rPr>
-          <w:sz w:val="34"/>
-          <w:szCs w:val="34"/>
-        </w:rPr>
-        <w:t>web</w:t>
-      </w:r>
-      <w:proofErr w:type="spellEnd"/>
-      <w:r>
-        <w:rPr>
-          <w:sz w:val="34"/>
-          <w:szCs w:val="34"/>
-        </w:rPr>
-        <w:t>-интерфейса для централизованного управления и мониторинга.</w:t>
+        <w:t>Первой задачей проекта является создание единого web-интерфейса для централизованного управления и мониторинга.</w:t>
       </w:r>
     </w:p>
     <w:p>
@@ -136,7 +121,7 @@
       <w:sdtContent>
         <w:p>
           <w:pPr>
-            <w:pStyle w:val="TOCHeading"/>
+            <w:pStyle w:val="aa"/>
             <w:rPr>
               <w:rFonts w:ascii="Times New Roman" w:hAnsi="Times New Roman" w:cs="Times New Roman"/>
               <w:color w:val="000000" w:themeColor="text1"/>
@@ -152,7 +137,7 @@
         </w:p>
         <w:p>
           <w:pPr>
-            <w:pStyle w:val="TOC1"/>
+            <w:pStyle w:val="11"/>
             <w:tabs>
               <w:tab w:val="left" w:pos="1320"/>
               <w:tab w:val="right" w:leader="dot" w:pos="9019"/>
@@ -177,7 +162,7 @@
           <w:hyperlink w:anchor="_Toc212823943" w:history="1">
             <w:r>
               <w:rPr>
-                <w:rStyle w:val="Hyperlink"/>
+                <w:rStyle w:val="ab"/>
                 <w:noProof/>
               </w:rPr>
               <w:t>1.</w:t>
@@ -194,7 +179,7 @@
             </w:r>
             <w:r>
               <w:rPr>
-                <w:rStyle w:val="Hyperlink"/>
+                <w:rStyle w:val="ab"/>
                 <w:noProof/>
                 <w:lang w:val="ru-RU"/>
               </w:rPr>
@@ -252,7 +237,7 @@
         </w:p>
         <w:p>
           <w:pPr>
-            <w:pStyle w:val="TOC2"/>
+            <w:pStyle w:val="21"/>
             <w:tabs>
               <w:tab w:val="right" w:leader="dot" w:pos="9019"/>
             </w:tabs>
@@ -267,7 +252,7 @@
           <w:hyperlink w:anchor="_Toc212823944" w:history="1">
             <w:r>
               <w:rPr>
-                <w:rStyle w:val="Hyperlink"/>
+                <w:rStyle w:val="ab"/>
                 <w:noProof/>
                 <w:lang w:val="ru-RU"/>
               </w:rPr>
@@ -275,7 +260,7 @@
             </w:r>
             <w:r>
               <w:rPr>
-                <w:rStyle w:val="Hyperlink"/>
+                <w:rStyle w:val="ab"/>
                 <w:noProof/>
               </w:rPr>
               <w:t>адачи проекта</w:t>
@@ -332,7 +317,7 @@
         </w:p>
         <w:p>
           <w:pPr>
-            <w:pStyle w:val="TOC2"/>
+            <w:pStyle w:val="21"/>
             <w:tabs>
               <w:tab w:val="right" w:leader="dot" w:pos="9019"/>
             </w:tabs>
@@ -347,7 +332,7 @@
           <w:hyperlink w:anchor="_Toc212823945" w:history="1">
             <w:r>
               <w:rPr>
-                <w:rStyle w:val="Hyperlink"/>
+                <w:rStyle w:val="ab"/>
                 <w:noProof/>
                 <w:lang w:val="ru-RU"/>
               </w:rPr>
@@ -355,7 +340,7 @@
             </w:r>
             <w:r>
               <w:rPr>
-                <w:rStyle w:val="Hyperlink"/>
+                <w:rStyle w:val="ab"/>
                 <w:noProof/>
               </w:rPr>
               <w:t>Термины и определения</w:t>
@@ -412,7 +397,7 @@
         </w:p>
         <w:p>
           <w:pPr>
-            <w:pStyle w:val="TOC1"/>
+            <w:pStyle w:val="11"/>
             <w:tabs>
               <w:tab w:val="left" w:pos="1320"/>
               <w:tab w:val="right" w:leader="dot" w:pos="9019"/>
@@ -428,7 +413,7 @@
           <w:hyperlink w:anchor="_Toc212823946" w:history="1">
             <w:r>
               <w:rPr>
-                <w:rStyle w:val="Hyperlink"/>
+                <w:rStyle w:val="ab"/>
                 <w:noProof/>
               </w:rPr>
               <w:t>2.</w:t>
@@ -445,7 +430,7 @@
             </w:r>
             <w:r>
               <w:rPr>
-                <w:rStyle w:val="Hyperlink"/>
+                <w:rStyle w:val="ab"/>
                 <w:noProof/>
               </w:rPr>
               <w:t>Общие сведения о проектируемой системе</w:t>
@@ -502,7 +487,7 @@
         </w:p>
         <w:p>
           <w:pPr>
-            <w:pStyle w:val="TOC2"/>
+            <w:pStyle w:val="21"/>
             <w:tabs>
               <w:tab w:val="left" w:pos="1760"/>
               <w:tab w:val="right" w:leader="dot" w:pos="9019"/>
@@ -518,7 +503,7 @@
           <w:hyperlink w:anchor="_Toc212823947" w:history="1">
             <w:r>
               <w:rPr>
-                <w:rStyle w:val="Hyperlink"/>
+                <w:rStyle w:val="ab"/>
                 <w:noProof/>
               </w:rPr>
               <w:t>2.1.</w:t>
@@ -535,7 +520,7 @@
             </w:r>
             <w:r>
               <w:rPr>
-                <w:rStyle w:val="Hyperlink"/>
+                <w:rStyle w:val="ab"/>
                 <w:noProof/>
                 <w:lang w:val="ru-RU"/>
               </w:rPr>
@@ -593,7 +578,7 @@
         </w:p>
         <w:p>
           <w:pPr>
-            <w:pStyle w:val="TOC2"/>
+            <w:pStyle w:val="21"/>
             <w:tabs>
               <w:tab w:val="left" w:pos="1760"/>
               <w:tab w:val="right" w:leader="dot" w:pos="9019"/>
@@ -609,7 +594,7 @@
           <w:hyperlink w:anchor="_Toc212823948" w:history="1">
             <w:r>
               <w:rPr>
-                <w:rStyle w:val="Hyperlink"/>
+                <w:rStyle w:val="ab"/>
                 <w:noProof/>
               </w:rPr>
               <w:t>2.2.</w:t>
@@ -626,7 +611,7 @@
             </w:r>
             <w:r>
               <w:rPr>
-                <w:rStyle w:val="Hyperlink"/>
+                <w:rStyle w:val="ab"/>
                 <w:noProof/>
               </w:rPr>
               <w:t>Функциональные требования</w:t>
@@ -683,7 +668,7 @@
         </w:p>
         <w:p>
           <w:pPr>
-            <w:pStyle w:val="TOC3"/>
+            <w:pStyle w:val="31"/>
             <w:tabs>
               <w:tab w:val="left" w:pos="2130"/>
               <w:tab w:val="right" w:leader="dot" w:pos="9019"/>
@@ -699,7 +684,7 @@
           <w:hyperlink w:anchor="_Toc212823949" w:history="1">
             <w:r>
               <w:rPr>
-                <w:rStyle w:val="Hyperlink"/>
+                <w:rStyle w:val="ab"/>
                 <w:noProof/>
               </w:rPr>
               <w:t>2.2.1.</w:t>
@@ -716,7 +701,7 @@
             </w:r>
             <w:r>
               <w:rPr>
-                <w:rStyle w:val="Hyperlink"/>
+                <w:rStyle w:val="ab"/>
                 <w:noProof/>
               </w:rPr>
               <w:t>Требование к системе</w:t>
@@ -773,7 +758,7 @@
         </w:p>
         <w:p>
           <w:pPr>
-            <w:pStyle w:val="TOC3"/>
+            <w:pStyle w:val="31"/>
             <w:tabs>
               <w:tab w:val="left" w:pos="2130"/>
               <w:tab w:val="right" w:leader="dot" w:pos="9019"/>
@@ -789,7 +774,7 @@
           <w:hyperlink w:anchor="_Toc212823950" w:history="1">
             <w:r>
               <w:rPr>
-                <w:rStyle w:val="Hyperlink"/>
+                <w:rStyle w:val="ab"/>
                 <w:noProof/>
               </w:rPr>
               <w:t>2.2.2.</w:t>
@@ -806,24 +791,10 @@
             </w:r>
             <w:r>
               <w:rPr>
-                <w:rStyle w:val="Hyperlink"/>
-                <w:noProof/>
-              </w:rPr>
-              <w:t>Требов</w:t>
-            </w:r>
-            <w:r>
-              <w:rPr>
-                <w:rStyle w:val="Hyperlink"/>
-                <w:noProof/>
-              </w:rPr>
-              <w:t>а</w:t>
-            </w:r>
-            <w:r>
-              <w:rPr>
-                <w:rStyle w:val="Hyperlink"/>
-                <w:noProof/>
-              </w:rPr>
-              <w:t>ния к интерфейсу</w:t>
+                <w:rStyle w:val="ab"/>
+                <w:noProof/>
+              </w:rPr>
+              <w:t>Требования к интерфейсу</w:t>
             </w:r>
             <w:r>
               <w:rPr>
@@ -877,7 +848,7 @@
         </w:p>
         <w:p>
           <w:pPr>
-            <w:pStyle w:val="TOC3"/>
+            <w:pStyle w:val="31"/>
             <w:tabs>
               <w:tab w:val="left" w:pos="2130"/>
               <w:tab w:val="right" w:leader="dot" w:pos="9019"/>
@@ -893,7 +864,7 @@
           <w:hyperlink w:anchor="_Toc212823951" w:history="1">
             <w:r>
               <w:rPr>
-                <w:rStyle w:val="Hyperlink"/>
+                <w:rStyle w:val="ab"/>
                 <w:noProof/>
               </w:rPr>
               <w:t>2.2.3.</w:t>
@@ -910,7 +881,7 @@
             </w:r>
             <w:r>
               <w:rPr>
-                <w:rStyle w:val="Hyperlink"/>
+                <w:rStyle w:val="ab"/>
                 <w:noProof/>
               </w:rPr>
               <w:t>Требования к аутентификации и авторизации</w:t>
@@ -967,7 +938,7 @@
         </w:p>
         <w:p>
           <w:pPr>
-            <w:pStyle w:val="TOC3"/>
+            <w:pStyle w:val="31"/>
             <w:tabs>
               <w:tab w:val="left" w:pos="2130"/>
               <w:tab w:val="right" w:leader="dot" w:pos="9019"/>
@@ -983,7 +954,7 @@
           <w:hyperlink w:anchor="_Toc212823952" w:history="1">
             <w:r>
               <w:rPr>
-                <w:rStyle w:val="Hyperlink"/>
+                <w:rStyle w:val="ab"/>
                 <w:noProof/>
               </w:rPr>
               <w:t>2.2.4.</w:t>
@@ -1000,7 +971,7 @@
             </w:r>
             <w:r>
               <w:rPr>
-                <w:rStyle w:val="Hyperlink"/>
+                <w:rStyle w:val="ab"/>
                 <w:noProof/>
               </w:rPr>
               <w:t>Функциональные требования к ролям</w:t>
@@ -1057,7 +1028,7 @@
         </w:p>
         <w:p>
           <w:pPr>
-            <w:pStyle w:val="TOC3"/>
+            <w:pStyle w:val="31"/>
             <w:tabs>
               <w:tab w:val="left" w:pos="1760"/>
               <w:tab w:val="right" w:leader="dot" w:pos="9019"/>
@@ -1073,7 +1044,7 @@
           <w:hyperlink w:anchor="_Toc212823953" w:history="1">
             <w:r>
               <w:rPr>
-                <w:rStyle w:val="Hyperlink"/>
+                <w:rStyle w:val="ab"/>
                 <w:noProof/>
               </w:rPr>
               <w:t>a.</w:t>
@@ -1090,7 +1061,7 @@
             </w:r>
             <w:r>
               <w:rPr>
-                <w:rStyle w:val="Hyperlink"/>
+                <w:rStyle w:val="ab"/>
                 <w:noProof/>
               </w:rPr>
               <w:t>Роль куратора:</w:t>
@@ -1147,7 +1118,7 @@
         </w:p>
         <w:p>
           <w:pPr>
-            <w:pStyle w:val="TOC3"/>
+            <w:pStyle w:val="31"/>
             <w:tabs>
               <w:tab w:val="left" w:pos="1760"/>
               <w:tab w:val="right" w:leader="dot" w:pos="9019"/>
@@ -1163,7 +1134,7 @@
           <w:hyperlink w:anchor="_Toc212823954" w:history="1">
             <w:r>
               <w:rPr>
-                <w:rStyle w:val="Hyperlink"/>
+                <w:rStyle w:val="ab"/>
                 <w:noProof/>
               </w:rPr>
               <w:t>b.</w:t>
@@ -1180,7 +1151,7 @@
             </w:r>
             <w:r>
               <w:rPr>
-                <w:rStyle w:val="Hyperlink"/>
+                <w:rStyle w:val="ab"/>
                 <w:noProof/>
               </w:rPr>
               <w:t>Роль старосты:</w:t>
@@ -1237,7 +1208,7 @@
         </w:p>
         <w:p>
           <w:pPr>
-            <w:pStyle w:val="TOC3"/>
+            <w:pStyle w:val="31"/>
             <w:tabs>
               <w:tab w:val="left" w:pos="1760"/>
               <w:tab w:val="right" w:leader="dot" w:pos="9019"/>
@@ -1253,7 +1224,7 @@
           <w:hyperlink w:anchor="_Toc212823955" w:history="1">
             <w:r>
               <w:rPr>
-                <w:rStyle w:val="Hyperlink"/>
+                <w:rStyle w:val="ab"/>
                 <w:noProof/>
               </w:rPr>
               <w:t>c.</w:t>
@@ -1270,7 +1241,7 @@
             </w:r>
             <w:r>
               <w:rPr>
-                <w:rStyle w:val="Hyperlink"/>
+                <w:rStyle w:val="ab"/>
                 <w:noProof/>
               </w:rPr>
               <w:t>Роль студента:</w:t>
@@ -1327,7 +1298,7 @@
         </w:p>
         <w:p>
           <w:pPr>
-            <w:pStyle w:val="TOC1"/>
+            <w:pStyle w:val="11"/>
             <w:tabs>
               <w:tab w:val="left" w:pos="1320"/>
               <w:tab w:val="right" w:leader="dot" w:pos="9019"/>
@@ -1343,7 +1314,7 @@
           <w:hyperlink w:anchor="_Toc212823956" w:history="1">
             <w:r>
               <w:rPr>
-                <w:rStyle w:val="Hyperlink"/>
+                <w:rStyle w:val="ab"/>
                 <w:noProof/>
               </w:rPr>
               <w:t>3.</w:t>
@@ -1360,7 +1331,7 @@
             </w:r>
             <w:r>
               <w:rPr>
-                <w:rStyle w:val="Hyperlink"/>
+                <w:rStyle w:val="ab"/>
                 <w:noProof/>
                 <w:lang w:val="ru-RU"/>
               </w:rPr>
@@ -1418,7 +1389,7 @@
         </w:p>
         <w:p>
           <w:pPr>
-            <w:pStyle w:val="TOC1"/>
+            <w:pStyle w:val="11"/>
             <w:tabs>
               <w:tab w:val="left" w:pos="1320"/>
               <w:tab w:val="right" w:leader="dot" w:pos="9019"/>
@@ -1434,7 +1405,7 @@
           <w:hyperlink w:anchor="_Toc212823957" w:history="1">
             <w:r>
               <w:rPr>
-                <w:rStyle w:val="Hyperlink"/>
+                <w:rStyle w:val="ab"/>
                 <w:noProof/>
               </w:rPr>
               <w:t>4.</w:t>
@@ -1451,7 +1422,7 @@
             </w:r>
             <w:r>
               <w:rPr>
-                <w:rStyle w:val="Hyperlink"/>
+                <w:rStyle w:val="ab"/>
                 <w:noProof/>
                 <w:lang w:val="ru-RU"/>
               </w:rPr>
@@ -1509,7 +1480,7 @@
         </w:p>
         <w:p>
           <w:pPr>
-            <w:pStyle w:val="TOC1"/>
+            <w:pStyle w:val="11"/>
             <w:tabs>
               <w:tab w:val="left" w:pos="1320"/>
               <w:tab w:val="right" w:leader="dot" w:pos="9019"/>
@@ -1525,7 +1496,7 @@
           <w:hyperlink w:anchor="_Toc212823958" w:history="1">
             <w:r>
               <w:rPr>
-                <w:rStyle w:val="Hyperlink"/>
+                <w:rStyle w:val="ab"/>
                 <w:noProof/>
               </w:rPr>
               <w:t>5.</w:t>
@@ -1542,7 +1513,7 @@
             </w:r>
             <w:r>
               <w:rPr>
-                <w:rStyle w:val="Hyperlink"/>
+                <w:rStyle w:val="ab"/>
                 <w:noProof/>
                 <w:lang w:val="ru-RU"/>
               </w:rPr>
@@ -1600,7 +1571,7 @@
         </w:p>
         <w:p>
           <w:pPr>
-            <w:pStyle w:val="TOC1"/>
+            <w:pStyle w:val="11"/>
             <w:tabs>
               <w:tab w:val="left" w:pos="1320"/>
               <w:tab w:val="right" w:leader="dot" w:pos="9019"/>
@@ -1616,7 +1587,7 @@
           <w:hyperlink w:anchor="_Toc212823959" w:history="1">
             <w:r>
               <w:rPr>
-                <w:rStyle w:val="Hyperlink"/>
+                <w:rStyle w:val="ab"/>
                 <w:noProof/>
                 <w:lang w:val="ru-RU"/>
               </w:rPr>
@@ -1634,7 +1605,7 @@
             </w:r>
             <w:r>
               <w:rPr>
-                <w:rStyle w:val="Hyperlink"/>
+                <w:rStyle w:val="ab"/>
                 <w:noProof/>
                 <w:lang w:val="ru-RU"/>
               </w:rPr>
@@ -1692,7 +1663,7 @@
         </w:p>
         <w:p>
           <w:pPr>
-            <w:pStyle w:val="TOC2"/>
+            <w:pStyle w:val="21"/>
             <w:tabs>
               <w:tab w:val="left" w:pos="1760"/>
               <w:tab w:val="right" w:leader="dot" w:pos="9019"/>
@@ -1708,7 +1679,7 @@
           <w:hyperlink w:anchor="_Toc212823964" w:history="1">
             <w:r>
               <w:rPr>
-                <w:rStyle w:val="Hyperlink"/>
+                <w:rStyle w:val="ab"/>
                 <w:noProof/>
               </w:rPr>
               <w:t>6.1.</w:t>
@@ -1725,7 +1696,7 @@
             </w:r>
             <w:r>
               <w:rPr>
-                <w:rStyle w:val="Hyperlink"/>
+                <w:rStyle w:val="ab"/>
                 <w:noProof/>
                 <w:lang w:val="ru-RU"/>
               </w:rPr>
@@ -1783,7 +1754,7 @@
         </w:p>
         <w:p>
           <w:pPr>
-            <w:pStyle w:val="TOC1"/>
+            <w:pStyle w:val="11"/>
             <w:tabs>
               <w:tab w:val="right" w:leader="dot" w:pos="9019"/>
             </w:tabs>
@@ -1798,7 +1769,7 @@
           <w:hyperlink w:anchor="_Toc212823965" w:history="1">
             <w:r>
               <w:rPr>
-                <w:rStyle w:val="Hyperlink"/>
+                <w:rStyle w:val="ab"/>
                 <w:noProof/>
                 <w:lang w:val="ru-RU"/>
               </w:rPr>
@@ -1806,7 +1777,7 @@
             </w:r>
             <w:r>
               <w:rPr>
-                <w:rStyle w:val="Hyperlink"/>
+                <w:rStyle w:val="ab"/>
                 <w:noProof/>
               </w:rPr>
               <w:t xml:space="preserve"> ПРИЛОЖЕНИЕ 1</w:t>
@@ -1901,7 +1872,7 @@
     </w:p>
     <w:p>
       <w:pPr>
-        <w:pStyle w:val="Heading1"/>
+        <w:pStyle w:val="1"/>
         <w:numPr>
           <w:ilvl w:val="0"/>
           <w:numId w:val="20"/>
@@ -1967,99 +1938,72 @@
     </w:p>
     <w:p>
       <w:r>
-        <w:t xml:space="preserve">Целью проекта является разработка веб, который предоставляет администраторам сети факультета единую точку для мониторинга, настройки и контроля </w:t>
-      </w:r>
-      <w:proofErr w:type="spellStart"/>
-      <w:r>
-        <w:t>основн</w:t>
+        <w:t>Целью проекта является разработка веб, который предоставляет администраторам сети факультета единую точку для мониторинга, настройки и контроля основн</w:t>
       </w:r>
       <w:r>
         <w:rPr>
           <w:lang w:val="ru-RU"/>
         </w:rPr>
-        <w:t>ых</w:t>
-      </w:r>
-      <w:proofErr w:type="spellEnd"/>
+        <w:t>ых процессов связанных с администрированием учётных запис</w:t>
+      </w:r>
       <w:r>
         <w:rPr>
           <w:lang w:val="ru-RU"/>
         </w:rPr>
-        <w:t xml:space="preserve"> процессов связанных с администрированием учётных запис</w:t>
+        <w:t>ей пользователей</w:t>
+      </w:r>
+      <w:r>
+        <w:t>. Интерфейс должен обеспечивать наглядное отображение состояния сети, упрощать выполнение рутинных операций.</w:t>
+      </w:r>
+    </w:p>
+    <w:p>
+      <w:r>
+        <w:t>Веб-интерфейс должен обеспечивать аутентификацию пользователей на выполнение конкретных действий с</w:t>
       </w:r>
       <w:r>
         <w:rPr>
           <w:lang w:val="ru-RU"/>
         </w:rPr>
-        <w:t>ей пользователей</w:t>
-      </w:r>
-      <w:r>
-        <w:t>. Интерфейс должен обеспечивать наглядное отображение состояния сети, упрощать выполнение рутинных операций.</w:t>
-      </w:r>
-    </w:p>
-    <w:p>
-      <w:r>
-        <w:t>Веб-интерфейс должен обеспечивать аутентификацию пользователей на выполнение конкретных действий с</w:t>
-      </w:r>
+        <w:t xml:space="preserve"> учетными записями пользователей</w:t>
+      </w:r>
+      <w:r>
+        <w:t>, которые будут описаны ниже.</w:t>
+      </w:r>
+    </w:p>
+    <w:p>
+      <w:pPr>
+        <w:pStyle w:val="2"/>
+      </w:pPr>
+      <w:bookmarkStart w:id="1" w:name="_Toc212823944"/>
       <w:r>
         <w:rPr>
           <w:lang w:val="ru-RU"/>
         </w:rPr>
-        <w:t xml:space="preserve"> учетными записями пользователей</w:t>
-      </w:r>
-      <w:r>
-        <w:t>, которые будут описаны ниже.</w:t>
-      </w:r>
-    </w:p>
-    <w:p>
-      <w:pPr>
-        <w:pStyle w:val="Heading2"/>
-      </w:pPr>
-      <w:bookmarkStart w:id="1" w:name="_Toc212823944"/>
+        <w:t>1.1 З</w:t>
+      </w:r>
+      <w:r>
+        <w:t>адачи</w:t>
+      </w:r>
+      <w:r>
+        <w:t xml:space="preserve"> проекта</w:t>
+      </w:r>
+      <w:bookmarkEnd w:id="1"/>
       <w:r>
         <w:rPr>
           <w:lang w:val="ru-RU"/>
         </w:rPr>
-        <w:t>1.1 З</w:t>
-      </w:r>
-      <w:proofErr w:type="spellStart"/>
-      <w:r>
-        <w:t>адачи</w:t>
-      </w:r>
-      <w:proofErr w:type="spellEnd"/>
-      <w:r>
-        <w:t xml:space="preserve"> проекта</w:t>
-      </w:r>
-      <w:bookmarkEnd w:id="1"/>
+        <w:t xml:space="preserve"> </w:t>
+      </w:r>
+    </w:p>
+    <w:p>
+      <w:r>
+        <w:t xml:space="preserve">Первой задачей проекта является разработка единого кроссплатформенного веб-интерфейса для централизованного управления и мониторинга </w:t>
+      </w:r>
       <w:r>
         <w:rPr>
           <w:lang w:val="ru-RU"/>
         </w:rPr>
-        <w:t xml:space="preserve"> </w:t>
-      </w:r>
-    </w:p>
-    <w:p>
-      <w:r>
-        <w:t xml:space="preserve">Первой задачей проекта является разработка единого кроссплатформенного веб-интерфейса для централизованного управления и мониторинга </w:t>
-      </w:r>
-      <w:r>
-        <w:rPr>
-          <w:lang w:val="ru-RU"/>
-        </w:rPr>
-        <w:t xml:space="preserve">учетных записей </w:t>
-      </w:r>
-      <w:proofErr w:type="gramStart"/>
-      <w:r>
-        <w:rPr>
-          <w:lang w:val="ru-RU"/>
-        </w:rPr>
-        <w:t>пользователей</w:t>
-      </w:r>
-      <w:proofErr w:type="gramEnd"/>
-      <w:r>
-        <w:rPr>
-          <w:lang w:val="ru-RU"/>
-        </w:rPr>
-        <w:t xml:space="preserve"> подключенных к беспроводной инфраструктуре факультета</w:t>
+        <w:t>учетных записей пользователей подключенных к беспроводной инфраструктуре факультета</w:t>
       </w:r>
       <w:r>
         <w:t xml:space="preserve">. </w:t>
@@ -2072,7 +2016,7 @@
     </w:p>
     <w:p>
       <w:pPr>
-        <w:pStyle w:val="Heading2"/>
+        <w:pStyle w:val="2"/>
       </w:pPr>
       <w:bookmarkStart w:id="2" w:name="_Toc212823945"/>
       <w:r>
@@ -2110,15 +2054,7 @@
     </w:p>
     <w:p>
       <w:r>
-        <w:t>LDAP (</w:t>
-      </w:r>
-      <w:proofErr w:type="spellStart"/>
-      <w:r>
-        <w:t>Lightweight</w:t>
-      </w:r>
-      <w:proofErr w:type="spellEnd"/>
-      <w:r>
-        <w:t xml:space="preserve"> Directory Access Protocol) — это стандартный сетевой протокол для доступа к службам каталогов, которые представляют собой базы данных с иерархической структурой, напоминающие телефонную книгу или адресную книгу.</w:t>
+        <w:t>LDAP (Lightweight Directory Access Protocol) — это стандартный сетевой протокол для доступа к службам каталогов, которые представляют собой базы данных с иерархической структурой, напоминающие телефонную книгу или адресную книгу.</w:t>
       </w:r>
     </w:p>
     <w:p>
@@ -2127,60 +2063,18 @@
       </w:r>
     </w:p>
     <w:p>
-      <w:proofErr w:type="spellStart"/>
-      <w:r>
-        <w:t>SQLi</w:t>
-      </w:r>
-      <w:proofErr w:type="spellEnd"/>
-      <w:r>
-        <w:t xml:space="preserve"> — это внедрение вредоносного SQL-кода в запросы, который может привести к утечке данных или их изменению. </w:t>
-      </w:r>
-    </w:p>
-    <w:p>
-      <w:r>
-        <w:t>Cross-</w:t>
-      </w:r>
-      <w:proofErr w:type="spellStart"/>
-      <w:r>
-        <w:t>Site</w:t>
-      </w:r>
-      <w:proofErr w:type="spellEnd"/>
-      <w:r>
-        <w:t xml:space="preserve"> </w:t>
-      </w:r>
-      <w:proofErr w:type="spellStart"/>
-      <w:r>
-        <w:t>Scripting</w:t>
-      </w:r>
-      <w:proofErr w:type="spellEnd"/>
-      <w:r>
-        <w:t xml:space="preserve"> (XSS) — XSS-атаки позволяют злоумышленнику внедрить вредоносный скрипт в браузер пользователя.</w:t>
-      </w:r>
-    </w:p>
-    <w:p>
-      <w:proofErr w:type="spellStart"/>
-      <w:r>
-        <w:t>Сross-Site</w:t>
-      </w:r>
-      <w:proofErr w:type="spellEnd"/>
-      <w:r>
-        <w:t xml:space="preserve"> </w:t>
-      </w:r>
-      <w:proofErr w:type="spellStart"/>
-      <w:r>
-        <w:t>Request</w:t>
-      </w:r>
-      <w:proofErr w:type="spellEnd"/>
-      <w:r>
-        <w:t xml:space="preserve"> </w:t>
-      </w:r>
-      <w:proofErr w:type="spellStart"/>
-      <w:r>
-        <w:t>Forgery</w:t>
-      </w:r>
-      <w:proofErr w:type="spellEnd"/>
-      <w:r>
-        <w:t xml:space="preserve"> (CSRF) — CSRF заставляет браузер пользователя выполнить нежелательные действия от его имени, используя его аутентификацию.</w:t>
+      <w:r>
+        <w:t xml:space="preserve">SQLi — это внедрение вредоносного SQL-кода в запросы, который может привести к утечке данных или их изменению. </w:t>
+      </w:r>
+    </w:p>
+    <w:p>
+      <w:r>
+        <w:t>Cross-Site Scripting (XSS) — XSS-атаки позволяют злоумышленнику внедрить вредоносный скрипт в браузер пользователя.</w:t>
+      </w:r>
+    </w:p>
+    <w:p>
+      <w:r>
+        <w:t>Сross-Site Request Forgery (CSRF) — CSRF заставляет браузер пользователя выполнить нежелательные действия от его имени, используя его аутентификацию.</w:t>
       </w:r>
     </w:p>
     <w:p>
@@ -2215,7 +2109,7 @@
     </w:p>
     <w:p>
       <w:pPr>
-        <w:pStyle w:val="Heading2"/>
+        <w:pStyle w:val="2"/>
         <w:rPr>
           <w:lang w:val="en-US"/>
         </w:rPr>
@@ -2228,7 +2122,7 @@
     </w:p>
     <w:p>
       <w:pPr>
-        <w:pStyle w:val="Heading1"/>
+        <w:pStyle w:val="1"/>
         <w:numPr>
           <w:ilvl w:val="0"/>
           <w:numId w:val="2"/>
@@ -2247,7 +2141,7 @@
     </w:p>
     <w:p>
       <w:pPr>
-        <w:pStyle w:val="Heading2"/>
+        <w:pStyle w:val="2"/>
         <w:numPr>
           <w:ilvl w:val="1"/>
           <w:numId w:val="2"/>
@@ -2302,7 +2196,7 @@
     </w:p>
     <w:p>
       <w:pPr>
-        <w:pStyle w:val="Heading2"/>
+        <w:pStyle w:val="2"/>
         <w:numPr>
           <w:ilvl w:val="1"/>
           <w:numId w:val="2"/>
@@ -2316,7 +2210,7 @@
     </w:p>
     <w:p>
       <w:pPr>
-        <w:pStyle w:val="Heading3"/>
+        <w:pStyle w:val="3"/>
         <w:numPr>
           <w:ilvl w:val="2"/>
           <w:numId w:val="2"/>
@@ -2360,7 +2254,7 @@
     </w:p>
     <w:p>
       <w:pPr>
-        <w:pStyle w:val="Heading3"/>
+        <w:pStyle w:val="3"/>
         <w:numPr>
           <w:ilvl w:val="2"/>
           <w:numId w:val="2"/>
@@ -2410,13 +2304,8 @@
         </w:rPr>
         <w:t>н</w:t>
       </w:r>
-      <w:proofErr w:type="spellStart"/>
-      <w:r>
-        <w:t>ужно</w:t>
-      </w:r>
-      <w:proofErr w:type="spellEnd"/>
-      <w:r>
-        <w:t xml:space="preserve"> располагать функции и элементы интерфейса </w:t>
+      <w:r>
+        <w:t xml:space="preserve">ужно располагать функции и элементы интерфейса </w:t>
       </w:r>
       <w:r>
         <w:rPr>
@@ -2444,13 +2333,8 @@
         </w:rPr>
         <w:t>о</w:t>
       </w:r>
-      <w:proofErr w:type="spellStart"/>
-      <w:r>
-        <w:t>формление</w:t>
-      </w:r>
-      <w:proofErr w:type="spellEnd"/>
-      <w:r>
-        <w:t xml:space="preserve">, шрифты и цветовая палитра должны быть </w:t>
+      <w:r>
+        <w:t xml:space="preserve">формление, шрифты и цветовая палитра должны быть </w:t>
       </w:r>
       <w:r>
         <w:rPr>
@@ -2489,13 +2373,8 @@
         </w:rPr>
         <w:t>и</w:t>
       </w:r>
-      <w:proofErr w:type="spellStart"/>
-      <w:r>
-        <w:t>нформирование</w:t>
-      </w:r>
-      <w:proofErr w:type="spellEnd"/>
-      <w:r>
-        <w:t xml:space="preserve"> пользователя о том, что происходит, когда он выполняет какое-либо действие</w:t>
+      <w:r>
+        <w:t>нформирование пользователя о том, что происходит, когда он выполняет какое-либо действие</w:t>
       </w:r>
     </w:p>
     <w:p>
@@ -2588,21 +2467,7 @@
         <w:rPr>
           <w:highlight w:val="yellow"/>
         </w:rPr>
-        <w:t>Определение главных целей</w:t>
-      </w:r>
-      <w:proofErr w:type="gramStart"/>
-      <w:r>
-        <w:rPr>
-          <w:highlight w:val="yellow"/>
-        </w:rPr>
-        <w:t>: Необходимо</w:t>
-      </w:r>
-      <w:proofErr w:type="gramEnd"/>
-      <w:r>
-        <w:rPr>
-          <w:highlight w:val="yellow"/>
-        </w:rPr>
-        <w:t xml:space="preserve"> сосредоточить интерфейс на самых важных функциях и задачах, которые должен решать пользователь. </w:t>
+        <w:t xml:space="preserve">Определение главных целей: Необходимо сосредоточить интерфейс на самых важных функциях и задачах, которые должен решать пользователь. </w:t>
       </w:r>
     </w:p>
     <w:p>
@@ -2624,7 +2489,7 @@
     </w:p>
     <w:p>
       <w:pPr>
-        <w:pStyle w:val="Heading3"/>
+        <w:pStyle w:val="3"/>
         <w:numPr>
           <w:ilvl w:val="2"/>
           <w:numId w:val="2"/>
@@ -2682,7 +2547,7 @@
     </w:p>
     <w:p>
       <w:pPr>
-        <w:pStyle w:val="Heading3"/>
+        <w:pStyle w:val="3"/>
         <w:numPr>
           <w:ilvl w:val="2"/>
           <w:numId w:val="2"/>
@@ -2697,7 +2562,7 @@
     </w:p>
     <w:p>
       <w:pPr>
-        <w:pStyle w:val="Heading3"/>
+        <w:pStyle w:val="3"/>
         <w:numPr>
           <w:ilvl w:val="0"/>
           <w:numId w:val="8"/>
@@ -2744,7 +2609,7 @@
     </w:p>
     <w:p>
       <w:pPr>
-        <w:pStyle w:val="Heading3"/>
+        <w:pStyle w:val="3"/>
         <w:numPr>
           <w:ilvl w:val="0"/>
           <w:numId w:val="8"/>
@@ -2802,7 +2667,7 @@
     </w:p>
     <w:p>
       <w:pPr>
-        <w:pStyle w:val="Heading3"/>
+        <w:pStyle w:val="3"/>
         <w:numPr>
           <w:ilvl w:val="0"/>
           <w:numId w:val="8"/>
@@ -2839,7 +2704,7 @@
     </w:p>
     <w:p>
       <w:pPr>
-        <w:pStyle w:val="Heading1"/>
+        <w:pStyle w:val="1"/>
         <w:numPr>
           <w:ilvl w:val="0"/>
           <w:numId w:val="22"/>
@@ -2857,7 +2722,7 @@
     </w:p>
     <w:p>
       <w:pPr>
-        <w:pStyle w:val="ListParagraph"/>
+        <w:pStyle w:val="a9"/>
         <w:numPr>
           <w:ilvl w:val="0"/>
           <w:numId w:val="19"/>
@@ -2906,7 +2771,7 @@
     </w:p>
     <w:p>
       <w:pPr>
-        <w:pStyle w:val="ListParagraph"/>
+        <w:pStyle w:val="a9"/>
         <w:numPr>
           <w:ilvl w:val="0"/>
           <w:numId w:val="19"/>
@@ -2926,15 +2791,7 @@
         <w:ind w:left="1843"/>
       </w:pPr>
       <w:r>
-        <w:t>Защита от OWASP Top 10 (</w:t>
-      </w:r>
-      <w:proofErr w:type="spellStart"/>
-      <w:r>
-        <w:t>SQLi</w:t>
-      </w:r>
-      <w:proofErr w:type="spellEnd"/>
-      <w:r>
-        <w:t>, XSS, CSRF)</w:t>
+        <w:t>Защита от OWASP Top 10 (SQLi, XSS, CSRF)</w:t>
       </w:r>
     </w:p>
     <w:p>
@@ -2975,7 +2832,7 @@
     </w:p>
     <w:p>
       <w:pPr>
-        <w:pStyle w:val="ListParagraph"/>
+        <w:pStyle w:val="a9"/>
         <w:numPr>
           <w:ilvl w:val="0"/>
           <w:numId w:val="19"/>
@@ -3027,7 +2884,7 @@
     </w:p>
     <w:p>
       <w:pPr>
-        <w:pStyle w:val="Heading1"/>
+        <w:pStyle w:val="1"/>
         <w:numPr>
           <w:ilvl w:val="0"/>
           <w:numId w:val="22"/>
@@ -3046,7 +2903,7 @@
     </w:p>
     <w:p>
       <w:pPr>
-        <w:pStyle w:val="ListParagraph"/>
+        <w:pStyle w:val="a9"/>
         <w:numPr>
           <w:ilvl w:val="1"/>
           <w:numId w:val="19"/>
@@ -3064,7 +2921,7 @@
     </w:p>
     <w:p>
       <w:pPr>
-        <w:pStyle w:val="ListParagraph"/>
+        <w:pStyle w:val="a9"/>
         <w:numPr>
           <w:ilvl w:val="1"/>
           <w:numId w:val="31"/>
@@ -3076,7 +2933,7 @@
     </w:p>
     <w:p>
       <w:pPr>
-        <w:pStyle w:val="ListParagraph"/>
+        <w:pStyle w:val="a9"/>
         <w:numPr>
           <w:ilvl w:val="1"/>
           <w:numId w:val="31"/>
@@ -3098,7 +2955,7 @@
     </w:p>
     <w:p>
       <w:pPr>
-        <w:pStyle w:val="Heading1"/>
+        <w:pStyle w:val="1"/>
         <w:numPr>
           <w:ilvl w:val="0"/>
           <w:numId w:val="24"/>
@@ -3142,35 +2999,7 @@
         <w:rPr>
           <w:lang w:val="ru-RU"/>
         </w:rPr>
-        <w:t xml:space="preserve"> (создание </w:t>
-      </w:r>
-      <w:proofErr w:type="spellStart"/>
-      <w:r>
-        <w:rPr>
-          <w:lang w:val="ru-RU"/>
-        </w:rPr>
-        <w:t>мокапов</w:t>
-      </w:r>
-      <w:proofErr w:type="spellEnd"/>
-      <w:r>
-        <w:rPr>
-          <w:lang w:val="ru-RU"/>
-        </w:rPr>
-        <w:t xml:space="preserve"> и </w:t>
-      </w:r>
-      <w:proofErr w:type="spellStart"/>
-      <w:r>
-        <w:rPr>
-          <w:lang w:val="ru-RU"/>
-        </w:rPr>
-        <w:t>юзерфлоу</w:t>
-      </w:r>
-      <w:proofErr w:type="spellEnd"/>
-      <w:r>
-        <w:rPr>
-          <w:lang w:val="ru-RU"/>
-        </w:rPr>
-        <w:t xml:space="preserve"> для каждого типа пользователей)</w:t>
+        <w:t xml:space="preserve"> (создание мокапов и юзерфлоу для каждого типа пользователей)</w:t>
       </w:r>
       <w:r>
         <w:t xml:space="preserve"> и технической архитектуры системы.</w:t>
@@ -3215,35 +3044,7 @@
         <w:rPr>
           <w:lang w:val="ru-RU"/>
         </w:rPr>
-        <w:t xml:space="preserve"> части приложения в соответствии с </w:t>
-      </w:r>
-      <w:proofErr w:type="spellStart"/>
-      <w:r>
-        <w:rPr>
-          <w:lang w:val="ru-RU"/>
-        </w:rPr>
-        <w:t>мокапами</w:t>
-      </w:r>
-      <w:proofErr w:type="spellEnd"/>
-      <w:r>
-        <w:rPr>
-          <w:lang w:val="ru-RU"/>
-        </w:rPr>
-        <w:t xml:space="preserve"> и </w:t>
-      </w:r>
-      <w:proofErr w:type="spellStart"/>
-      <w:r>
-        <w:rPr>
-          <w:lang w:val="ru-RU"/>
-        </w:rPr>
-        <w:t>юзерфлоу</w:t>
-      </w:r>
-      <w:proofErr w:type="spellEnd"/>
-      <w:r>
-        <w:rPr>
-          <w:lang w:val="ru-RU"/>
-        </w:rPr>
-        <w:t xml:space="preserve">, которые были созданы во время стадии проектирования. Итогом работы на данной стадии станет полностью готовый макет приложения со всем </w:t>
+        <w:t xml:space="preserve"> части приложения в соответствии с мокапами и юзерфлоу, которые были созданы во время стадии проектирования. Итогом работы на данной стадии станет полностью готовый макет приложения со всем </w:t>
       </w:r>
       <w:r>
         <w:rPr>
@@ -3266,15 +3067,7 @@
         </w:numPr>
       </w:pPr>
       <w:r>
-        <w:t>Стадия 3 - Тестирование: Всесторонняя проверка системы, включая функциональное тестирование, оценку удобства использования (</w:t>
-      </w:r>
-      <w:proofErr w:type="spellStart"/>
-      <w:r>
-        <w:t>usability</w:t>
-      </w:r>
-      <w:proofErr w:type="spellEnd"/>
-      <w:r>
-        <w:t>) и тестирование безопасности.</w:t>
+        <w:t>Стадия 3 - Тестирование: Всесторонняя проверка системы, включая функциональное тестирование, оценку удобства использования (usability) и тестирование безопасности.</w:t>
       </w:r>
       <w:r>
         <w:rPr>
@@ -3314,7 +3107,7 @@
     </w:p>
     <w:p>
       <w:pPr>
-        <w:pStyle w:val="Heading1"/>
+        <w:pStyle w:val="1"/>
         <w:numPr>
           <w:ilvl w:val="0"/>
           <w:numId w:val="24"/>
@@ -3335,7 +3128,7 @@
     </w:p>
     <w:p>
       <w:pPr>
-        <w:pStyle w:val="ListParagraph"/>
+        <w:pStyle w:val="a9"/>
         <w:keepNext/>
         <w:keepLines/>
         <w:numPr>
@@ -3364,7 +3157,7 @@
     </w:p>
     <w:p>
       <w:pPr>
-        <w:pStyle w:val="ListParagraph"/>
+        <w:pStyle w:val="a9"/>
         <w:keepNext/>
         <w:keepLines/>
         <w:numPr>
@@ -3393,7 +3186,7 @@
     </w:p>
     <w:p>
       <w:pPr>
-        <w:pStyle w:val="ListParagraph"/>
+        <w:pStyle w:val="a9"/>
         <w:keepNext/>
         <w:keepLines/>
         <w:numPr>
@@ -3422,7 +3215,7 @@
     </w:p>
     <w:p>
       <w:pPr>
-        <w:pStyle w:val="ListParagraph"/>
+        <w:pStyle w:val="a9"/>
         <w:keepNext/>
         <w:keepLines/>
         <w:numPr>
@@ -3451,7 +3244,7 @@
     </w:p>
     <w:p>
       <w:pPr>
-        <w:pStyle w:val="Heading2"/>
+        <w:pStyle w:val="2"/>
         <w:numPr>
           <w:ilvl w:val="1"/>
           <w:numId w:val="2"/>
@@ -3468,7 +3261,7 @@
     </w:p>
     <w:p>
       <w:pPr>
-        <w:pStyle w:val="ListParagraph"/>
+        <w:pStyle w:val="a9"/>
         <w:numPr>
           <w:ilvl w:val="1"/>
           <w:numId w:val="28"/>
@@ -3480,7 +3273,7 @@
     </w:p>
     <w:p>
       <w:pPr>
-        <w:pStyle w:val="ListParagraph"/>
+        <w:pStyle w:val="a9"/>
         <w:ind w:left="1440" w:firstLine="0"/>
       </w:pPr>
       <w:r>
@@ -3510,7 +3303,7 @@
     </w:p>
     <w:p>
       <w:pPr>
-        <w:pStyle w:val="ListParagraph"/>
+        <w:pStyle w:val="a9"/>
         <w:numPr>
           <w:ilvl w:val="1"/>
           <w:numId w:val="28"/>
@@ -3522,7 +3315,7 @@
     </w:p>
     <w:p>
       <w:pPr>
-        <w:pStyle w:val="ListParagraph"/>
+        <w:pStyle w:val="a9"/>
         <w:ind w:left="1440" w:firstLine="0"/>
       </w:pPr>
       <w:r>
@@ -3552,7 +3345,7 @@
     </w:p>
     <w:p>
       <w:pPr>
-        <w:pStyle w:val="ListParagraph"/>
+        <w:pStyle w:val="a9"/>
         <w:numPr>
           <w:ilvl w:val="1"/>
           <w:numId w:val="28"/>
@@ -3567,7 +3360,7 @@
     </w:p>
     <w:p>
       <w:pPr>
-        <w:pStyle w:val="ListParagraph"/>
+        <w:pStyle w:val="a9"/>
         <w:ind w:left="1440" w:firstLine="0"/>
         <w:rPr>
           <w:lang w:val="ru-RU"/>
@@ -3586,7 +3379,7 @@
     </w:p>
     <w:p>
       <w:pPr>
-        <w:pStyle w:val="ListParagraph"/>
+        <w:pStyle w:val="a9"/>
         <w:numPr>
           <w:ilvl w:val="1"/>
           <w:numId w:val="28"/>
@@ -3598,7 +3391,7 @@
     </w:p>
     <w:p>
       <w:pPr>
-        <w:pStyle w:val="ListParagraph"/>
+        <w:pStyle w:val="a9"/>
         <w:numPr>
           <w:ilvl w:val="0"/>
           <w:numId w:val="29"/>
@@ -3610,7 +3403,7 @@
     </w:p>
     <w:p>
       <w:pPr>
-        <w:pStyle w:val="ListParagraph"/>
+        <w:pStyle w:val="a9"/>
         <w:numPr>
           <w:ilvl w:val="0"/>
           <w:numId w:val="29"/>
@@ -3622,7 +3415,7 @@
     </w:p>
     <w:p>
       <w:pPr>
-        <w:pStyle w:val="ListParagraph"/>
+        <w:pStyle w:val="a9"/>
         <w:numPr>
           <w:ilvl w:val="0"/>
           <w:numId w:val="29"/>
@@ -3634,7 +3427,7 @@
     </w:p>
     <w:p>
       <w:pPr>
-        <w:pStyle w:val="ListParagraph"/>
+        <w:pStyle w:val="a9"/>
         <w:numPr>
           <w:ilvl w:val="1"/>
           <w:numId w:val="28"/>
@@ -3646,7 +3439,7 @@
     </w:p>
     <w:p>
       <w:pPr>
-        <w:pStyle w:val="ListParagraph"/>
+        <w:pStyle w:val="a9"/>
         <w:numPr>
           <w:ilvl w:val="0"/>
           <w:numId w:val="30"/>
@@ -3680,7 +3473,7 @@
     </w:p>
     <w:p>
       <w:pPr>
-        <w:pStyle w:val="ListParagraph"/>
+        <w:pStyle w:val="a9"/>
         <w:numPr>
           <w:ilvl w:val="0"/>
           <w:numId w:val="30"/>
@@ -3709,7 +3502,7 @@
     </w:p>
     <w:p>
       <w:pPr>
-        <w:pStyle w:val="Heading1"/>
+        <w:pStyle w:val="1"/>
         <w:jc w:val="center"/>
         <w:rPr>
           <w:sz w:val="36"/>
@@ -4006,15 +3799,7 @@
         <w:jc w:val="center"/>
       </w:pPr>
       <w:r>
-        <w:t xml:space="preserve">Рисунок 4 - User </w:t>
-      </w:r>
-      <w:proofErr w:type="spellStart"/>
-      <w:r>
-        <w:t>Flow</w:t>
-      </w:r>
-      <w:proofErr w:type="spellEnd"/>
-      <w:r>
-        <w:t xml:space="preserve"> рядового пользователя</w:t>
+        <w:t>Рисунок 4 - User Flow рядового пользователя</w:t>
       </w:r>
     </w:p>
     <w:sectPr>
@@ -4028,7 +3813,7 @@
 </file>
 
 <file path=word/endnotes.xml><?xml version="1.0" encoding="utf-8"?>
-<w:endnotes xmlns:wpc="http://schemas.microsoft.com/office/word/2010/wordprocessingCanvas" xmlns:cx="http://schemas.microsoft.com/office/drawing/2014/chartex" xmlns:cx1="http://schemas.microsoft.com/office/drawing/2015/9/8/chartex" xmlns:cx2="http://schemas.microsoft.com/office/drawing/2015/10/21/chartex" xmlns:cx3="http://schemas.microsoft.com/office/drawing/2016/5/9/chartex" xmlns:cx4="http://schemas.microsoft.com/office/drawing/2016/5/10/chartex" xmlns:cx5="http://schemas.microsoft.com/office/drawing/2016/5/11/chartex" xmlns:cx6="http://schemas.microsoft.com/office/drawing/2016/5/12/chartex" xmlns:cx7="http://schemas.microsoft.com/office/drawing/2016/5/13/chartex" xmlns:cx8="http://schemas.microsoft.com/office/drawing/2016/5/14/chartex" xmlns:mc="http://schemas.openxmlformats.org/markup-compatibility/2006" xmlns:aink="http://schemas.microsoft.com/office/drawing/2016/ink" xmlns:am3d="http://schemas.microsoft.com/office/drawing/2017/model3d" xmlns:o="urn:schemas-microsoft-com:office:office" xmlns:oel="http://schemas.microsoft.com/office/2019/extlst" xmlns:r="http://schemas.openxmlformats.org/officeDocument/2006/relationships" xmlns:m="http://schemas.openxmlformats.org/officeDocument/2006/math" xmlns:v="urn:schemas-microsoft-com:vml" xmlns:wp14="http://schemas.microsoft.com/office/word/2010/wordprocessingDrawing" xmlns:wp="http://schemas.openxmlformats.org/drawingml/2006/wordprocessingDrawing" xmlns:w10="urn:schemas-microsoft-com:office:word" xmlns:w="http://schemas.openxmlformats.org/wordprocessingml/2006/main" xmlns:w14="http://schemas.microsoft.com/office/word/2010/wordml" xmlns:w15="http://schemas.microsoft.com/office/word/2012/wordml" xmlns:w16cex="http://schemas.microsoft.com/office/word/2018/wordml/cex" xmlns:w16cid="http://schemas.microsoft.com/office/word/2016/wordml/cid" xmlns:w16="http://schemas.microsoft.com/office/word/2018/wordml" xmlns:w16sdtdh="http://schemas.microsoft.com/office/word/2020/wordml/sdtdatahash" xmlns:w16se="http://schemas.microsoft.com/office/word/2015/wordml/symex" xmlns:wpg="http://schemas.microsoft.com/office/word/2010/wordprocessingGroup" xmlns:wpi="http://schemas.microsoft.com/office/word/2010/wordprocessingInk" xmlns:wne="http://schemas.microsoft.com/office/word/2006/wordml" xmlns:wps="http://schemas.microsoft.com/office/word/2010/wordprocessingShape" mc:Ignorable="w14 w15 w16se w16cid w16 w16cex w16sdtdh wp14">
+<w:endnotes xmlns:wpc="http://schemas.microsoft.com/office/word/2010/wordprocessingCanvas" xmlns:cx="http://schemas.microsoft.com/office/drawing/2014/chartex" xmlns:cx1="http://schemas.microsoft.com/office/drawing/2015/9/8/chartex" xmlns:cx2="http://schemas.microsoft.com/office/drawing/2015/10/21/chartex" xmlns:cx3="http://schemas.microsoft.com/office/drawing/2016/5/9/chartex" xmlns:cx4="http://schemas.microsoft.com/office/drawing/2016/5/10/chartex" xmlns:cx5="http://schemas.microsoft.com/office/drawing/2016/5/11/chartex" xmlns:cx6="http://schemas.microsoft.com/office/drawing/2016/5/12/chartex" xmlns:cx7="http://schemas.microsoft.com/office/drawing/2016/5/13/chartex" xmlns:cx8="http://schemas.microsoft.com/office/drawing/2016/5/14/chartex" xmlns:mc="http://schemas.openxmlformats.org/markup-compatibility/2006" xmlns:aink="http://schemas.microsoft.com/office/drawing/2016/ink" xmlns:am3d="http://schemas.microsoft.com/office/drawing/2017/model3d" xmlns:o="urn:schemas-microsoft-com:office:office" xmlns:oel="http://schemas.microsoft.com/office/2019/extlst" xmlns:r="http://schemas.openxmlformats.org/officeDocument/2006/relationships" xmlns:m="http://schemas.openxmlformats.org/officeDocument/2006/math" xmlns:v="urn:schemas-microsoft-com:vml" xmlns:wp14="http://schemas.microsoft.com/office/word/2010/wordprocessingDrawing" xmlns:wp="http://schemas.openxmlformats.org/drawingml/2006/wordprocessingDrawing" xmlns:w10="urn:schemas-microsoft-com:office:word" xmlns:w="http://schemas.openxmlformats.org/wordprocessingml/2006/main" xmlns:w14="http://schemas.microsoft.com/office/word/2010/wordml" xmlns:w15="http://schemas.microsoft.com/office/word/2012/wordml" xmlns:w16cex="http://schemas.microsoft.com/office/word/2018/wordml/cex" xmlns:w16cid="http://schemas.microsoft.com/office/word/2016/wordml/cid" xmlns:w16="http://schemas.microsoft.com/office/word/2018/wordml" xmlns:w16du="http://schemas.microsoft.com/office/word/2023/wordml/word16du" xmlns:w16sdtdh="http://schemas.microsoft.com/office/word/2020/wordml/sdtdatahash" xmlns:w16sdtfl="http://schemas.microsoft.com/office/word/2024/wordml/sdtformatlock" xmlns:w16se="http://schemas.microsoft.com/office/word/2015/wordml/symex" xmlns:wpg="http://schemas.microsoft.com/office/word/2010/wordprocessingGroup" xmlns:wpi="http://schemas.microsoft.com/office/word/2010/wordprocessingInk" xmlns:wne="http://schemas.microsoft.com/office/word/2006/wordml" xmlns:wps="http://schemas.microsoft.com/office/word/2010/wordprocessingShape" mc:Ignorable="w14 w15 w16se w16cid w16 w16cex w16sdtdh w16sdtfl w16du wp14">
   <w:endnote w:type="separator" w:id="-1">
     <w:p>
       <w:pPr>
@@ -4053,7 +3838,7 @@
 </file>
 
 <file path=word/footnotes.xml><?xml version="1.0" encoding="utf-8"?>
-<w:footnotes xmlns:wpc="http://schemas.microsoft.com/office/word/2010/wordprocessingCanvas" xmlns:cx="http://schemas.microsoft.com/office/drawing/2014/chartex" xmlns:cx1="http://schemas.microsoft.com/office/drawing/2015/9/8/chartex" xmlns:cx2="http://schemas.microsoft.com/office/drawing/2015/10/21/chartex" xmlns:cx3="http://schemas.microsoft.com/office/drawing/2016/5/9/chartex" xmlns:cx4="http://schemas.microsoft.com/office/drawing/2016/5/10/chartex" xmlns:cx5="http://schemas.microsoft.com/office/drawing/2016/5/11/chartex" xmlns:cx6="http://schemas.microsoft.com/office/drawing/2016/5/12/chartex" xmlns:cx7="http://schemas.microsoft.com/office/drawing/2016/5/13/chartex" xmlns:cx8="http://schemas.microsoft.com/office/drawing/2016/5/14/chartex" xmlns:mc="http://schemas.openxmlformats.org/markup-compatibility/2006" xmlns:aink="http://schemas.microsoft.com/office/drawing/2016/ink" xmlns:am3d="http://schemas.microsoft.com/office/drawing/2017/model3d" xmlns:o="urn:schemas-microsoft-com:office:office" xmlns:oel="http://schemas.microsoft.com/office/2019/extlst" xmlns:r="http://schemas.openxmlformats.org/officeDocument/2006/relationships" xmlns:m="http://schemas.openxmlformats.org/officeDocument/2006/math" xmlns:v="urn:schemas-microsoft-com:vml" xmlns:wp14="http://schemas.microsoft.com/office/word/2010/wordprocessingDrawing" xmlns:wp="http://schemas.openxmlformats.org/drawingml/2006/wordprocessingDrawing" xmlns:w10="urn:schemas-microsoft-com:office:word" xmlns:w="http://schemas.openxmlformats.org/wordprocessingml/2006/main" xmlns:w14="http://schemas.microsoft.com/office/word/2010/wordml" xmlns:w15="http://schemas.microsoft.com/office/word/2012/wordml" xmlns:w16cex="http://schemas.microsoft.com/office/word/2018/wordml/cex" xmlns:w16cid="http://schemas.microsoft.com/office/word/2016/wordml/cid" xmlns:w16="http://schemas.microsoft.com/office/word/2018/wordml" xmlns:w16sdtdh="http://schemas.microsoft.com/office/word/2020/wordml/sdtdatahash" xmlns:w16se="http://schemas.microsoft.com/office/word/2015/wordml/symex" xmlns:wpg="http://schemas.microsoft.com/office/word/2010/wordprocessingGroup" xmlns:wpi="http://schemas.microsoft.com/office/word/2010/wordprocessingInk" xmlns:wne="http://schemas.microsoft.com/office/word/2006/wordml" xmlns:wps="http://schemas.microsoft.com/office/word/2010/wordprocessingShape" mc:Ignorable="w14 w15 w16se w16cid w16 w16cex w16sdtdh wp14">
+<w:footnotes xmlns:wpc="http://schemas.microsoft.com/office/word/2010/wordprocessingCanvas" xmlns:cx="http://schemas.microsoft.com/office/drawing/2014/chartex" xmlns:cx1="http://schemas.microsoft.com/office/drawing/2015/9/8/chartex" xmlns:cx2="http://schemas.microsoft.com/office/drawing/2015/10/21/chartex" xmlns:cx3="http://schemas.microsoft.com/office/drawing/2016/5/9/chartex" xmlns:cx4="http://schemas.microsoft.com/office/drawing/2016/5/10/chartex" xmlns:cx5="http://schemas.microsoft.com/office/drawing/2016/5/11/chartex" xmlns:cx6="http://schemas.microsoft.com/office/drawing/2016/5/12/chartex" xmlns:cx7="http://schemas.microsoft.com/office/drawing/2016/5/13/chartex" xmlns:cx8="http://schemas.microsoft.com/office/drawing/2016/5/14/chartex" xmlns:mc="http://schemas.openxmlformats.org/markup-compatibility/2006" xmlns:aink="http://schemas.microsoft.com/office/drawing/2016/ink" xmlns:am3d="http://schemas.microsoft.com/office/drawing/2017/model3d" xmlns:o="urn:schemas-microsoft-com:office:office" xmlns:oel="http://schemas.microsoft.com/office/2019/extlst" xmlns:r="http://schemas.openxmlformats.org/officeDocument/2006/relationships" xmlns:m="http://schemas.openxmlformats.org/officeDocument/2006/math" xmlns:v="urn:schemas-microsoft-com:vml" xmlns:wp14="http://schemas.microsoft.com/office/word/2010/wordprocessingDrawing" xmlns:wp="http://schemas.openxmlformats.org/drawingml/2006/wordprocessingDrawing" xmlns:w10="urn:schemas-microsoft-com:office:word" xmlns:w="http://schemas.openxmlformats.org/wordprocessingml/2006/main" xmlns:w14="http://schemas.microsoft.com/office/word/2010/wordml" xmlns:w15="http://schemas.microsoft.com/office/word/2012/wordml" xmlns:w16cex="http://schemas.microsoft.com/office/word/2018/wordml/cex" xmlns:w16cid="http://schemas.microsoft.com/office/word/2016/wordml/cid" xmlns:w16="http://schemas.microsoft.com/office/word/2018/wordml" xmlns:w16du="http://schemas.microsoft.com/office/word/2023/wordml/word16du" xmlns:w16sdtdh="http://schemas.microsoft.com/office/word/2020/wordml/sdtdatahash" xmlns:w16sdtfl="http://schemas.microsoft.com/office/word/2024/wordml/sdtformatlock" xmlns:w16se="http://schemas.microsoft.com/office/word/2015/wordml/symex" xmlns:wpg="http://schemas.microsoft.com/office/word/2010/wordprocessingGroup" xmlns:wpi="http://schemas.microsoft.com/office/word/2010/wordprocessingInk" xmlns:wne="http://schemas.microsoft.com/office/word/2006/wordml" xmlns:wps="http://schemas.microsoft.com/office/word/2010/wordprocessingShape" mc:Ignorable="w14 w15 w16se w16cid w16 w16cex w16sdtdh w16sdtfl w16du wp14">
   <w:footnote w:type="separator" w:id="-1">
     <w:p>
       <w:pPr>
@@ -4078,7 +3863,7 @@
 </file>
 
 <file path=word/numbering.xml><?xml version="1.0" encoding="utf-8"?>
-<w:numbering xmlns:wpc="http://schemas.microsoft.com/office/word/2010/wordprocessingCanvas" xmlns:cx="http://schemas.microsoft.com/office/drawing/2014/chartex" xmlns:cx1="http://schemas.microsoft.com/office/drawing/2015/9/8/chartex" xmlns:cx2="http://schemas.microsoft.com/office/drawing/2015/10/21/chartex" xmlns:cx3="http://schemas.microsoft.com/office/drawing/2016/5/9/chartex" xmlns:cx4="http://schemas.microsoft.com/office/drawing/2016/5/10/chartex" xmlns:cx5="http://schemas.microsoft.com/office/drawing/2016/5/11/chartex" xmlns:cx6="http://schemas.microsoft.com/office/drawing/2016/5/12/chartex" xmlns:cx7="http://schemas.microsoft.com/office/drawing/2016/5/13/chartex" xmlns:cx8="http://schemas.microsoft.com/office/drawing/2016/5/14/chartex" xmlns:mc="http://schemas.openxmlformats.org/markup-compatibility/2006" xmlns:aink="http://schemas.microsoft.com/office/drawing/2016/ink" xmlns:am3d="http://schemas.microsoft.com/office/drawing/2017/model3d" xmlns:o="urn:schemas-microsoft-com:office:office" xmlns:oel="http://schemas.microsoft.com/office/2019/extlst" xmlns:r="http://schemas.openxmlformats.org/officeDocument/2006/relationships" xmlns:m="http://schemas.openxmlformats.org/officeDocument/2006/math" xmlns:v="urn:schemas-microsoft-com:vml" xmlns:wp14="http://schemas.microsoft.com/office/word/2010/wordprocessingDrawing" xmlns:wp="http://schemas.openxmlformats.org/drawingml/2006/wordprocessingDrawing" xmlns:w10="urn:schemas-microsoft-com:office:word" xmlns:w="http://schemas.openxmlformats.org/wordprocessingml/2006/main" xmlns:w14="http://schemas.microsoft.com/office/word/2010/wordml" xmlns:w15="http://schemas.microsoft.com/office/word/2012/wordml" xmlns:w16cex="http://schemas.microsoft.com/office/word/2018/wordml/cex" xmlns:w16cid="http://schemas.microsoft.com/office/word/2016/wordml/cid" xmlns:w16="http://schemas.microsoft.com/office/word/2018/wordml" xmlns:w16sdtdh="http://schemas.microsoft.com/office/word/2020/wordml/sdtdatahash" xmlns:w16se="http://schemas.microsoft.com/office/word/2015/wordml/symex" xmlns:wpg="http://schemas.microsoft.com/office/word/2010/wordprocessingGroup" xmlns:wpi="http://schemas.microsoft.com/office/word/2010/wordprocessingInk" xmlns:wne="http://schemas.microsoft.com/office/word/2006/wordml" xmlns:wps="http://schemas.microsoft.com/office/word/2010/wordprocessingShape" mc:Ignorable="w14 w15 w16se w16cid w16 w16cex w16sdtdh wp14">
+<w:numbering xmlns:wpc="http://schemas.microsoft.com/office/word/2010/wordprocessingCanvas" xmlns:cx="http://schemas.microsoft.com/office/drawing/2014/chartex" xmlns:cx1="http://schemas.microsoft.com/office/drawing/2015/9/8/chartex" xmlns:cx2="http://schemas.microsoft.com/office/drawing/2015/10/21/chartex" xmlns:cx3="http://schemas.microsoft.com/office/drawing/2016/5/9/chartex" xmlns:cx4="http://schemas.microsoft.com/office/drawing/2016/5/10/chartex" xmlns:cx5="http://schemas.microsoft.com/office/drawing/2016/5/11/chartex" xmlns:cx6="http://schemas.microsoft.com/office/drawing/2016/5/12/chartex" xmlns:cx7="http://schemas.microsoft.com/office/drawing/2016/5/13/chartex" xmlns:cx8="http://schemas.microsoft.com/office/drawing/2016/5/14/chartex" xmlns:mc="http://schemas.openxmlformats.org/markup-compatibility/2006" xmlns:aink="http://schemas.microsoft.com/office/drawing/2016/ink" xmlns:am3d="http://schemas.microsoft.com/office/drawing/2017/model3d" xmlns:o="urn:schemas-microsoft-com:office:office" xmlns:oel="http://schemas.microsoft.com/office/2019/extlst" xmlns:r="http://schemas.openxmlformats.org/officeDocument/2006/relationships" xmlns:m="http://schemas.openxmlformats.org/officeDocument/2006/math" xmlns:v="urn:schemas-microsoft-com:vml" xmlns:wp14="http://schemas.microsoft.com/office/word/2010/wordprocessingDrawing" xmlns:wp="http://schemas.openxmlformats.org/drawingml/2006/wordprocessingDrawing" xmlns:w10="urn:schemas-microsoft-com:office:word" xmlns:w="http://schemas.openxmlformats.org/wordprocessingml/2006/main" xmlns:w14="http://schemas.microsoft.com/office/word/2010/wordml" xmlns:w15="http://schemas.microsoft.com/office/word/2012/wordml" xmlns:w16cex="http://schemas.microsoft.com/office/word/2018/wordml/cex" xmlns:w16cid="http://schemas.microsoft.com/office/word/2016/wordml/cid" xmlns:w16="http://schemas.microsoft.com/office/word/2018/wordml" xmlns:w16du="http://schemas.microsoft.com/office/word/2023/wordml/word16du" xmlns:w16sdtdh="http://schemas.microsoft.com/office/word/2020/wordml/sdtdatahash" xmlns:w16sdtfl="http://schemas.microsoft.com/office/word/2024/wordml/sdtformatlock" xmlns:w16se="http://schemas.microsoft.com/office/word/2015/wordml/symex" xmlns:wpg="http://schemas.microsoft.com/office/word/2010/wordprocessingGroup" xmlns:wpi="http://schemas.microsoft.com/office/word/2010/wordprocessingInk" xmlns:wne="http://schemas.microsoft.com/office/word/2006/wordml" xmlns:wps="http://schemas.microsoft.com/office/word/2010/wordprocessingShape" mc:Ignorable="w14 w15 w16se w16cid w16 w16cex w16sdtdh w16sdtfl w16du wp14">
   <w:abstractNum w:abstractNumId="0" w15:restartNumberingAfterBreak="0">
     <w:nsid w:val="01B118DF"/>
     <w:multiLevelType w:val="multilevel"/>
@@ -7336,7 +7121,7 @@
 </file>
 
 <file path=word/styles.xml><?xml version="1.0" encoding="utf-8"?>
-<w:styles xmlns:mc="http://schemas.openxmlformats.org/markup-compatibility/2006" xmlns:r="http://schemas.openxmlformats.org/officeDocument/2006/relationships" xmlns:w="http://schemas.openxmlformats.org/wordprocessingml/2006/main" xmlns:w14="http://schemas.microsoft.com/office/word/2010/wordml" xmlns:w15="http://schemas.microsoft.com/office/word/2012/wordml" xmlns:w16cex="http://schemas.microsoft.com/office/word/2018/wordml/cex" xmlns:w16cid="http://schemas.microsoft.com/office/word/2016/wordml/cid" xmlns:w16="http://schemas.microsoft.com/office/word/2018/wordml" xmlns:w16sdtdh="http://schemas.microsoft.com/office/word/2020/wordml/sdtdatahash" xmlns:w16se="http://schemas.microsoft.com/office/word/2015/wordml/symex" mc:Ignorable="w14 w15 w16se w16cid w16 w16cex w16sdtdh">
+<w:styles xmlns:mc="http://schemas.openxmlformats.org/markup-compatibility/2006" xmlns:r="http://schemas.openxmlformats.org/officeDocument/2006/relationships" xmlns:w="http://schemas.openxmlformats.org/wordprocessingml/2006/main" xmlns:w14="http://schemas.microsoft.com/office/word/2010/wordml" xmlns:w15="http://schemas.microsoft.com/office/word/2012/wordml" xmlns:w16cex="http://schemas.microsoft.com/office/word/2018/wordml/cex" xmlns:w16cid="http://schemas.microsoft.com/office/word/2016/wordml/cid" xmlns:w16="http://schemas.microsoft.com/office/word/2018/wordml" xmlns:w16du="http://schemas.microsoft.com/office/word/2023/wordml/word16du" xmlns:w16sdtdh="http://schemas.microsoft.com/office/word/2020/wordml/sdtdatahash" xmlns:w16sdtfl="http://schemas.microsoft.com/office/word/2024/wordml/sdtformatlock" xmlns:w16se="http://schemas.microsoft.com/office/word/2015/wordml/symex" mc:Ignorable="w14 w15 w16se w16cid w16 w16cex w16sdtdh w16sdtfl w16du">
   <w:docDefaults>
     <w:rPrDefault>
       <w:rPr>
@@ -7730,7 +7515,7 @@
     <w:lsdException w:name="Unresolved Mention" w:semiHidden="1" w:unhideWhenUsed="1"/>
     <w:lsdException w:name="Smart Link" w:semiHidden="1" w:unhideWhenUsed="1"/>
   </w:latentStyles>
-  <w:style w:type="paragraph" w:default="1" w:styleId="Normal">
+  <w:style w:type="paragraph" w:default="1" w:styleId="a">
     <w:name w:val="Normal"/>
     <w:qFormat/>
     <w:rsid w:val="00933E80"/>
@@ -7740,11 +7525,11 @@
       <w:jc w:val="both"/>
     </w:pPr>
   </w:style>
-  <w:style w:type="paragraph" w:styleId="Heading1">
+  <w:style w:type="paragraph" w:styleId="1">
     <w:name w:val="heading 1"/>
-    <w:basedOn w:val="Normal"/>
-    <w:next w:val="Normal"/>
-    <w:link w:val="Heading1Char"/>
+    <w:basedOn w:val="a"/>
+    <w:next w:val="a"/>
+    <w:link w:val="10"/>
     <w:uiPriority w:val="9"/>
     <w:qFormat/>
     <w:rsid w:val="0098524F"/>
@@ -7758,11 +7543,11 @@
       <w:szCs w:val="40"/>
     </w:rPr>
   </w:style>
-  <w:style w:type="paragraph" w:styleId="Heading2">
+  <w:style w:type="paragraph" w:styleId="2">
     <w:name w:val="heading 2"/>
-    <w:basedOn w:val="Normal"/>
-    <w:next w:val="Normal"/>
-    <w:link w:val="Heading2Char"/>
+    <w:basedOn w:val="a"/>
+    <w:next w:val="a"/>
+    <w:link w:val="20"/>
     <w:uiPriority w:val="9"/>
     <w:unhideWhenUsed/>
     <w:qFormat/>
@@ -7778,11 +7563,11 @@
       <w:szCs w:val="36"/>
     </w:rPr>
   </w:style>
-  <w:style w:type="paragraph" w:styleId="Heading3">
+  <w:style w:type="paragraph" w:styleId="3">
     <w:name w:val="heading 3"/>
-    <w:basedOn w:val="Normal"/>
-    <w:next w:val="Normal"/>
-    <w:link w:val="Heading3Char"/>
+    <w:basedOn w:val="a"/>
+    <w:next w:val="a"/>
+    <w:link w:val="30"/>
     <w:uiPriority w:val="9"/>
     <w:unhideWhenUsed/>
     <w:qFormat/>
@@ -7798,10 +7583,10 @@
       <w:szCs w:val="32"/>
     </w:rPr>
   </w:style>
-  <w:style w:type="paragraph" w:styleId="Heading4">
+  <w:style w:type="paragraph" w:styleId="4">
     <w:name w:val="heading 4"/>
-    <w:basedOn w:val="Normal"/>
-    <w:next w:val="Normal"/>
+    <w:basedOn w:val="a"/>
+    <w:next w:val="a"/>
     <w:uiPriority w:val="9"/>
     <w:unhideWhenUsed/>
     <w:qFormat/>
@@ -7817,10 +7602,10 @@
       <w:szCs w:val="24"/>
     </w:rPr>
   </w:style>
-  <w:style w:type="paragraph" w:styleId="Heading5">
+  <w:style w:type="paragraph" w:styleId="5">
     <w:name w:val="heading 5"/>
-    <w:basedOn w:val="Normal"/>
-    <w:next w:val="Normal"/>
+    <w:basedOn w:val="a"/>
+    <w:next w:val="a"/>
     <w:uiPriority w:val="9"/>
     <w:semiHidden/>
     <w:unhideWhenUsed/>
@@ -7837,10 +7622,10 @@
       <w:szCs w:val="22"/>
     </w:rPr>
   </w:style>
-  <w:style w:type="paragraph" w:styleId="Heading6">
+  <w:style w:type="paragraph" w:styleId="6">
     <w:name w:val="heading 6"/>
-    <w:basedOn w:val="Normal"/>
-    <w:next w:val="Normal"/>
+    <w:basedOn w:val="a"/>
+    <w:next w:val="a"/>
     <w:uiPriority w:val="9"/>
     <w:semiHidden/>
     <w:unhideWhenUsed/>
@@ -7858,13 +7643,13 @@
       <w:szCs w:val="22"/>
     </w:rPr>
   </w:style>
-  <w:style w:type="character" w:default="1" w:styleId="DefaultParagraphFont">
+  <w:style w:type="character" w:default="1" w:styleId="a0">
     <w:name w:val="Default Paragraph Font"/>
     <w:uiPriority w:val="1"/>
     <w:semiHidden/>
     <w:unhideWhenUsed/>
   </w:style>
-  <w:style w:type="table" w:default="1" w:styleId="TableNormal">
+  <w:style w:type="table" w:default="1" w:styleId="a1">
     <w:name w:val="Normal Table"/>
     <w:uiPriority w:val="99"/>
     <w:semiHidden/>
@@ -7879,13 +7664,13 @@
       </w:tblCellMar>
     </w:tblPr>
   </w:style>
-  <w:style w:type="numbering" w:default="1" w:styleId="NoList">
+  <w:style w:type="numbering" w:default="1" w:styleId="a2">
     <w:name w:val="No List"/>
     <w:uiPriority w:val="99"/>
     <w:semiHidden/>
     <w:unhideWhenUsed/>
   </w:style>
-  <w:style w:type="table" w:customStyle="1" w:styleId="TableNormal0">
+  <w:style w:type="table" w:customStyle="1" w:styleId="TableNormal">
     <w:name w:val="TableNormal"/>
     <w:tblPr>
       <w:tblCellMar>
@@ -7896,10 +7681,10 @@
       </w:tblCellMar>
     </w:tblPr>
   </w:style>
-  <w:style w:type="paragraph" w:styleId="Title">
+  <w:style w:type="paragraph" w:styleId="a3">
     <w:name w:val="Title"/>
-    <w:basedOn w:val="Normal"/>
-    <w:next w:val="Normal"/>
+    <w:basedOn w:val="a"/>
+    <w:next w:val="a"/>
     <w:uiPriority w:val="10"/>
     <w:qFormat/>
     <w:pPr>
@@ -7912,10 +7697,10 @@
       <w:szCs w:val="52"/>
     </w:rPr>
   </w:style>
-  <w:style w:type="paragraph" w:styleId="Subtitle">
+  <w:style w:type="paragraph" w:styleId="a4">
     <w:name w:val="Subtitle"/>
-    <w:basedOn w:val="Normal"/>
-    <w:next w:val="Normal"/>
+    <w:basedOn w:val="a"/>
+    <w:next w:val="a"/>
     <w:uiPriority w:val="11"/>
     <w:qFormat/>
     <w:pPr>
@@ -7930,10 +7715,10 @@
       <w:szCs w:val="30"/>
     </w:rPr>
   </w:style>
-  <w:style w:type="paragraph" w:styleId="Header">
+  <w:style w:type="paragraph" w:styleId="a5">
     <w:name w:val="header"/>
-    <w:basedOn w:val="Normal"/>
-    <w:link w:val="HeaderChar"/>
+    <w:basedOn w:val="a"/>
+    <w:link w:val="a6"/>
     <w:uiPriority w:val="99"/>
     <w:unhideWhenUsed/>
     <w:rsid w:val="0098524F"/>
@@ -7945,17 +7730,17 @@
       <w:spacing w:line="240" w:lineRule="auto"/>
     </w:pPr>
   </w:style>
-  <w:style w:type="character" w:customStyle="1" w:styleId="HeaderChar">
-    <w:name w:val="Header Char"/>
-    <w:basedOn w:val="DefaultParagraphFont"/>
-    <w:link w:val="Header"/>
+  <w:style w:type="character" w:customStyle="1" w:styleId="a6">
+    <w:name w:val="Верхний колонтитул Знак"/>
+    <w:basedOn w:val="a0"/>
+    <w:link w:val="a5"/>
     <w:uiPriority w:val="99"/>
     <w:rsid w:val="0098524F"/>
   </w:style>
-  <w:style w:type="paragraph" w:styleId="Footer">
+  <w:style w:type="paragraph" w:styleId="a7">
     <w:name w:val="footer"/>
-    <w:basedOn w:val="Normal"/>
-    <w:link w:val="FooterChar"/>
+    <w:basedOn w:val="a"/>
+    <w:link w:val="a8"/>
     <w:uiPriority w:val="99"/>
     <w:unhideWhenUsed/>
     <w:rsid w:val="0098524F"/>
@@ -7967,16 +7752,16 @@
       <w:spacing w:line="240" w:lineRule="auto"/>
     </w:pPr>
   </w:style>
-  <w:style w:type="character" w:customStyle="1" w:styleId="FooterChar">
-    <w:name w:val="Footer Char"/>
-    <w:basedOn w:val="DefaultParagraphFont"/>
-    <w:link w:val="Footer"/>
+  <w:style w:type="character" w:customStyle="1" w:styleId="a8">
+    <w:name w:val="Нижний колонтитул Знак"/>
+    <w:basedOn w:val="a0"/>
+    <w:link w:val="a7"/>
     <w:uiPriority w:val="99"/>
     <w:rsid w:val="0098524F"/>
   </w:style>
-  <w:style w:type="paragraph" w:styleId="ListParagraph">
+  <w:style w:type="paragraph" w:styleId="a9">
     <w:name w:val="List Paragraph"/>
-    <w:basedOn w:val="Normal"/>
+    <w:basedOn w:val="a"/>
     <w:uiPriority w:val="34"/>
     <w:qFormat/>
     <w:rsid w:val="0098524F"/>
@@ -7985,10 +7770,10 @@
       <w:contextualSpacing/>
     </w:pPr>
   </w:style>
-  <w:style w:type="character" w:customStyle="1" w:styleId="Heading1Char">
-    <w:name w:val="Heading 1 Char"/>
-    <w:basedOn w:val="DefaultParagraphFont"/>
-    <w:link w:val="Heading1"/>
+  <w:style w:type="character" w:customStyle="1" w:styleId="10">
+    <w:name w:val="Заголовок 1 Знак"/>
+    <w:basedOn w:val="a0"/>
+    <w:link w:val="1"/>
     <w:uiPriority w:val="9"/>
     <w:rsid w:val="00DE2693"/>
     <w:rPr>
@@ -7996,10 +7781,10 @@
       <w:szCs w:val="40"/>
     </w:rPr>
   </w:style>
-  <w:style w:type="character" w:customStyle="1" w:styleId="Heading2Char">
-    <w:name w:val="Heading 2 Char"/>
-    <w:basedOn w:val="DefaultParagraphFont"/>
-    <w:link w:val="Heading2"/>
+  <w:style w:type="character" w:customStyle="1" w:styleId="20">
+    <w:name w:val="Заголовок 2 Знак"/>
+    <w:basedOn w:val="a0"/>
+    <w:link w:val="2"/>
     <w:uiPriority w:val="9"/>
     <w:rsid w:val="00411297"/>
     <w:rPr>
@@ -8007,10 +7792,10 @@
       <w:szCs w:val="36"/>
     </w:rPr>
   </w:style>
-  <w:style w:type="character" w:customStyle="1" w:styleId="Heading3Char">
-    <w:name w:val="Heading 3 Char"/>
-    <w:basedOn w:val="DefaultParagraphFont"/>
-    <w:link w:val="Heading3"/>
+  <w:style w:type="character" w:customStyle="1" w:styleId="30">
+    <w:name w:val="Заголовок 3 Знак"/>
+    <w:basedOn w:val="a0"/>
+    <w:link w:val="3"/>
     <w:uiPriority w:val="9"/>
     <w:rsid w:val="00811964"/>
     <w:rPr>
@@ -8018,10 +7803,10 @@
       <w:szCs w:val="32"/>
     </w:rPr>
   </w:style>
-  <w:style w:type="paragraph" w:styleId="TOCHeading">
+  <w:style w:type="paragraph" w:styleId="aa">
     <w:name w:val="TOC Heading"/>
-    <w:basedOn w:val="Heading1"/>
-    <w:next w:val="Normal"/>
+    <w:basedOn w:val="1"/>
+    <w:next w:val="a"/>
     <w:uiPriority w:val="39"/>
     <w:unhideWhenUsed/>
     <w:qFormat/>
@@ -8039,10 +7824,10 @@
       <w:lang w:val="ru-RU"/>
     </w:rPr>
   </w:style>
-  <w:style w:type="paragraph" w:styleId="TOC1">
+  <w:style w:type="paragraph" w:styleId="11">
     <w:name w:val="toc 1"/>
-    <w:basedOn w:val="Normal"/>
-    <w:next w:val="Normal"/>
+    <w:basedOn w:val="a"/>
+    <w:next w:val="a"/>
     <w:autoRedefine/>
     <w:uiPriority w:val="39"/>
     <w:unhideWhenUsed/>
@@ -8051,10 +7836,10 @@
       <w:spacing w:after="100"/>
     </w:pPr>
   </w:style>
-  <w:style w:type="paragraph" w:styleId="TOC2">
+  <w:style w:type="paragraph" w:styleId="21">
     <w:name w:val="toc 2"/>
-    <w:basedOn w:val="Normal"/>
-    <w:next w:val="Normal"/>
+    <w:basedOn w:val="a"/>
+    <w:next w:val="a"/>
     <w:autoRedefine/>
     <w:uiPriority w:val="39"/>
     <w:unhideWhenUsed/>
@@ -8064,10 +7849,10 @@
       <w:ind w:left="280"/>
     </w:pPr>
   </w:style>
-  <w:style w:type="paragraph" w:styleId="TOC3">
+  <w:style w:type="paragraph" w:styleId="31">
     <w:name w:val="toc 3"/>
-    <w:basedOn w:val="Normal"/>
-    <w:next w:val="Normal"/>
+    <w:basedOn w:val="a"/>
+    <w:next w:val="a"/>
     <w:autoRedefine/>
     <w:uiPriority w:val="39"/>
     <w:unhideWhenUsed/>
@@ -8077,9 +7862,9 @@
       <w:ind w:left="560"/>
     </w:pPr>
   </w:style>
-  <w:style w:type="character" w:styleId="Hyperlink">
+  <w:style w:type="character" w:styleId="ab">
     <w:name w:val="Hyperlink"/>
-    <w:basedOn w:val="DefaultParagraphFont"/>
+    <w:basedOn w:val="a0"/>
     <w:uiPriority w:val="99"/>
     <w:unhideWhenUsed/>
     <w:rsid w:val="00C73440"/>

</xml_diff>

<commit_message>
docs: refactor structure in accordance with standard
</commit_message>
<xml_diff>
--- a/documents/Петренко_Тигранян_ТЗ.docx
+++ b/documents/Петренко_Тигранян_ТЗ.docx
@@ -1,6 +1,6 @@
 
 <file path=word/document.xml><?xml version="1.0" encoding="utf-8"?>
-<w:document xmlns:wpc="http://schemas.microsoft.com/office/word/2010/wordprocessingCanvas" xmlns:cx="http://schemas.microsoft.com/office/drawing/2014/chartex" xmlns:cx1="http://schemas.microsoft.com/office/drawing/2015/9/8/chartex" xmlns:cx2="http://schemas.microsoft.com/office/drawing/2015/10/21/chartex" xmlns:cx3="http://schemas.microsoft.com/office/drawing/2016/5/9/chartex" xmlns:cx4="http://schemas.microsoft.com/office/drawing/2016/5/10/chartex" xmlns:cx5="http://schemas.microsoft.com/office/drawing/2016/5/11/chartex" xmlns:cx6="http://schemas.microsoft.com/office/drawing/2016/5/12/chartex" xmlns:cx7="http://schemas.microsoft.com/office/drawing/2016/5/13/chartex" xmlns:cx8="http://schemas.microsoft.com/office/drawing/2016/5/14/chartex" xmlns:mc="http://schemas.openxmlformats.org/markup-compatibility/2006" xmlns:aink="http://schemas.microsoft.com/office/drawing/2016/ink" xmlns:am3d="http://schemas.microsoft.com/office/drawing/2017/model3d" xmlns:o="urn:schemas-microsoft-com:office:office" xmlns:oel="http://schemas.microsoft.com/office/2019/extlst" xmlns:r="http://schemas.openxmlformats.org/officeDocument/2006/relationships" xmlns:m="http://schemas.openxmlformats.org/officeDocument/2006/math" xmlns:v="urn:schemas-microsoft-com:vml" xmlns:wp14="http://schemas.microsoft.com/office/word/2010/wordprocessingDrawing" xmlns:wp="http://schemas.openxmlformats.org/drawingml/2006/wordprocessingDrawing" xmlns:w10="urn:schemas-microsoft-com:office:word" xmlns:w="http://schemas.openxmlformats.org/wordprocessingml/2006/main" xmlns:w14="http://schemas.microsoft.com/office/word/2010/wordml" xmlns:w15="http://schemas.microsoft.com/office/word/2012/wordml" xmlns:w16cex="http://schemas.microsoft.com/office/word/2018/wordml/cex" xmlns:w16cid="http://schemas.microsoft.com/office/word/2016/wordml/cid" xmlns:w16="http://schemas.microsoft.com/office/word/2018/wordml" xmlns:w16sdtdh="http://schemas.microsoft.com/office/word/2020/wordml/sdtdatahash" xmlns:w16se="http://schemas.microsoft.com/office/word/2015/wordml/symex" xmlns:wpg="http://schemas.microsoft.com/office/word/2010/wordprocessingGroup" xmlns:wpi="http://schemas.microsoft.com/office/word/2010/wordprocessingInk" xmlns:wne="http://schemas.microsoft.com/office/word/2006/wordml" xmlns:wps="http://schemas.microsoft.com/office/word/2010/wordprocessingShape" mc:Ignorable="w14 w15 w16se w16cid w16 w16cex w16sdtdh wp14">
+<w:document xmlns:wpc="http://schemas.microsoft.com/office/word/2010/wordprocessingCanvas" xmlns:cx="http://schemas.microsoft.com/office/drawing/2014/chartex" xmlns:cx1="http://schemas.microsoft.com/office/drawing/2015/9/8/chartex" xmlns:cx2="http://schemas.microsoft.com/office/drawing/2015/10/21/chartex" xmlns:cx3="http://schemas.microsoft.com/office/drawing/2016/5/9/chartex" xmlns:cx4="http://schemas.microsoft.com/office/drawing/2016/5/10/chartex" xmlns:cx5="http://schemas.microsoft.com/office/drawing/2016/5/11/chartex" xmlns:cx6="http://schemas.microsoft.com/office/drawing/2016/5/12/chartex" xmlns:cx7="http://schemas.microsoft.com/office/drawing/2016/5/13/chartex" xmlns:cx8="http://schemas.microsoft.com/office/drawing/2016/5/14/chartex" xmlns:mc="http://schemas.openxmlformats.org/markup-compatibility/2006" xmlns:aink="http://schemas.microsoft.com/office/drawing/2016/ink" xmlns:am3d="http://schemas.microsoft.com/office/drawing/2017/model3d" xmlns:o="urn:schemas-microsoft-com:office:office" xmlns:oel="http://schemas.microsoft.com/office/2019/extlst" xmlns:r="http://schemas.openxmlformats.org/officeDocument/2006/relationships" xmlns:m="http://schemas.openxmlformats.org/officeDocument/2006/math" xmlns:v="urn:schemas-microsoft-com:vml" xmlns:wp14="http://schemas.microsoft.com/office/word/2010/wordprocessingDrawing" xmlns:wp="http://schemas.openxmlformats.org/drawingml/2006/wordprocessingDrawing" xmlns:w10="urn:schemas-microsoft-com:office:word" xmlns:w="http://schemas.openxmlformats.org/wordprocessingml/2006/main" xmlns:w14="http://schemas.microsoft.com/office/word/2010/wordml" xmlns:w15="http://schemas.microsoft.com/office/word/2012/wordml" xmlns:w16cex="http://schemas.microsoft.com/office/word/2018/wordml/cex" xmlns:w16cid="http://schemas.microsoft.com/office/word/2016/wordml/cid" xmlns:w16="http://schemas.microsoft.com/office/word/2018/wordml" xmlns:w16du="http://schemas.microsoft.com/office/word/2023/wordml/word16du" xmlns:w16sdtdh="http://schemas.microsoft.com/office/word/2020/wordml/sdtdatahash" xmlns:w16sdtfl="http://schemas.microsoft.com/office/word/2024/wordml/sdtformatlock" xmlns:w16se="http://schemas.microsoft.com/office/word/2015/wordml/symex" xmlns:wpg="http://schemas.microsoft.com/office/word/2010/wordprocessingGroup" xmlns:wpi="http://schemas.microsoft.com/office/word/2010/wordprocessingInk" xmlns:wne="http://schemas.microsoft.com/office/word/2006/wordml" xmlns:wps="http://schemas.microsoft.com/office/word/2010/wordprocessingShape" mc:Ignorable="w14 w15 w16se w16cid w16 w16cex w16sdtdh w16sdtfl w16du wp14">
   <w:body>
     <w:p>
       <w:pPr>
@@ -137,7 +137,7 @@
       <w:sdtContent>
         <w:p>
           <w:pPr>
-            <w:pStyle w:val="TOCHeading"/>
+            <w:pStyle w:val="aa"/>
             <w:rPr>
               <w:rFonts w:ascii="Times New Roman" w:hAnsi="Times New Roman" w:cs="Times New Roman"/>
               <w:color w:val="000000" w:themeColor="text1"/>
@@ -153,17 +153,19 @@
         </w:p>
         <w:p>
           <w:pPr>
-            <w:pStyle w:val="TOC1"/>
+            <w:pStyle w:val="11"/>
             <w:tabs>
-              <w:tab w:val="left" w:pos="1320"/>
+              <w:tab w:val="left" w:pos="1200"/>
               <w:tab w:val="right" w:leader="dot" w:pos="9019"/>
             </w:tabs>
             <w:rPr>
               <w:rFonts w:asciiTheme="minorHAnsi" w:eastAsiaTheme="minorEastAsia" w:hAnsiTheme="minorHAnsi" w:cstheme="minorBidi"/>
               <w:noProof/>
-              <w:sz w:val="22"/>
-              <w:szCs w:val="22"/>
+              <w:kern w:val="2"/>
+              <w:sz w:val="24"/>
+              <w:szCs w:val="24"/>
               <w:lang w:val="ru-RU"/>
+              <w14:ligatures w14:val="standardContextual"/>
             </w:rPr>
           </w:pPr>
           <w:r>
@@ -175,10 +177,10 @@
           <w:r>
             <w:fldChar w:fldCharType="separate"/>
           </w:r>
-          <w:hyperlink w:anchor="_Toc212823943" w:history="1">
-            <w:r>
-              <w:rPr>
-                <w:rStyle w:val="Hyperlink"/>
+          <w:hyperlink w:anchor="_Toc219060699" w:history="1">
+            <w:r>
+              <w:rPr>
+                <w:rStyle w:val="ab"/>
                 <w:noProof/>
               </w:rPr>
               <w:t>1.</w:t>
@@ -187,15 +189,17 @@
               <w:rPr>
                 <w:rFonts w:asciiTheme="minorHAnsi" w:eastAsiaTheme="minorEastAsia" w:hAnsiTheme="minorHAnsi" w:cstheme="minorBidi"/>
                 <w:noProof/>
-                <w:sz w:val="22"/>
-                <w:szCs w:val="22"/>
+                <w:kern w:val="2"/>
+                <w:sz w:val="24"/>
+                <w:szCs w:val="24"/>
                 <w:lang w:val="ru-RU"/>
+                <w14:ligatures w14:val="standardContextual"/>
               </w:rPr>
               <w:tab/>
             </w:r>
             <w:r>
               <w:rPr>
-                <w:rStyle w:val="Hyperlink"/>
+                <w:rStyle w:val="ab"/>
                 <w:noProof/>
                 <w:lang w:val="ru-RU"/>
               </w:rPr>
@@ -220,7 +224,7 @@
                 <w:noProof/>
                 <w:webHidden/>
               </w:rPr>
-              <w:instrText xml:space="preserve"> PAGEREF _Toc212823943 \h </w:instrText>
+              <w:instrText xml:space="preserve"> PAGEREF _Toc219060699 \h </w:instrText>
             </w:r>
             <w:r>
               <w:rPr>
@@ -253,22 +257,24 @@
         </w:p>
         <w:p>
           <w:pPr>
-            <w:pStyle w:val="TOC2"/>
+            <w:pStyle w:val="21"/>
             <w:tabs>
               <w:tab w:val="right" w:leader="dot" w:pos="9019"/>
             </w:tabs>
             <w:rPr>
               <w:rFonts w:asciiTheme="minorHAnsi" w:eastAsiaTheme="minorEastAsia" w:hAnsiTheme="minorHAnsi" w:cstheme="minorBidi"/>
               <w:noProof/>
-              <w:sz w:val="22"/>
-              <w:szCs w:val="22"/>
+              <w:kern w:val="2"/>
+              <w:sz w:val="24"/>
+              <w:szCs w:val="24"/>
               <w:lang w:val="ru-RU"/>
+              <w14:ligatures w14:val="standardContextual"/>
             </w:rPr>
           </w:pPr>
-          <w:hyperlink w:anchor="_Toc212823944" w:history="1">
-            <w:r>
-              <w:rPr>
-                <w:rStyle w:val="Hyperlink"/>
+          <w:hyperlink w:anchor="_Toc219060700" w:history="1">
+            <w:r>
+              <w:rPr>
+                <w:rStyle w:val="ab"/>
                 <w:noProof/>
                 <w:lang w:val="ru-RU"/>
               </w:rPr>
@@ -276,7 +282,7 @@
             </w:r>
             <w:r>
               <w:rPr>
-                <w:rStyle w:val="Hyperlink"/>
+                <w:rStyle w:val="ab"/>
                 <w:noProof/>
               </w:rPr>
               <w:t>адачи проекта</w:t>
@@ -300,7 +306,7 @@
                 <w:noProof/>
                 <w:webHidden/>
               </w:rPr>
-              <w:instrText xml:space="preserve"> PAGEREF _Toc212823944 \h </w:instrText>
+              <w:instrText xml:space="preserve"> PAGEREF _Toc219060700 \h </w:instrText>
             </w:r>
             <w:r>
               <w:rPr>
@@ -333,22 +339,24 @@
         </w:p>
         <w:p>
           <w:pPr>
-            <w:pStyle w:val="TOC2"/>
+            <w:pStyle w:val="21"/>
             <w:tabs>
               <w:tab w:val="right" w:leader="dot" w:pos="9019"/>
             </w:tabs>
             <w:rPr>
               <w:rFonts w:asciiTheme="minorHAnsi" w:eastAsiaTheme="minorEastAsia" w:hAnsiTheme="minorHAnsi" w:cstheme="minorBidi"/>
               <w:noProof/>
-              <w:sz w:val="22"/>
-              <w:szCs w:val="22"/>
+              <w:kern w:val="2"/>
+              <w:sz w:val="24"/>
+              <w:szCs w:val="24"/>
               <w:lang w:val="ru-RU"/>
+              <w14:ligatures w14:val="standardContextual"/>
             </w:rPr>
           </w:pPr>
-          <w:hyperlink w:anchor="_Toc212823945" w:history="1">
-            <w:r>
-              <w:rPr>
-                <w:rStyle w:val="Hyperlink"/>
+          <w:hyperlink w:anchor="_Toc219060701" w:history="1">
+            <w:r>
+              <w:rPr>
+                <w:rStyle w:val="ab"/>
                 <w:noProof/>
                 <w:lang w:val="ru-RU"/>
               </w:rPr>
@@ -356,7 +364,7 @@
             </w:r>
             <w:r>
               <w:rPr>
-                <w:rStyle w:val="Hyperlink"/>
+                <w:rStyle w:val="ab"/>
                 <w:noProof/>
               </w:rPr>
               <w:t>Термины и определения</w:t>
@@ -380,7 +388,7 @@
                 <w:noProof/>
                 <w:webHidden/>
               </w:rPr>
-              <w:instrText xml:space="preserve"> PAGEREF _Toc212823945 \h </w:instrText>
+              <w:instrText xml:space="preserve"> PAGEREF _Toc219060701 \h </w:instrText>
             </w:r>
             <w:r>
               <w:rPr>
@@ -413,23 +421,25 @@
         </w:p>
         <w:p>
           <w:pPr>
-            <w:pStyle w:val="TOC1"/>
+            <w:pStyle w:val="11"/>
             <w:tabs>
-              <w:tab w:val="left" w:pos="1320"/>
+              <w:tab w:val="left" w:pos="1200"/>
               <w:tab w:val="right" w:leader="dot" w:pos="9019"/>
             </w:tabs>
             <w:rPr>
               <w:rFonts w:asciiTheme="minorHAnsi" w:eastAsiaTheme="minorEastAsia" w:hAnsiTheme="minorHAnsi" w:cstheme="minorBidi"/>
               <w:noProof/>
-              <w:sz w:val="22"/>
-              <w:szCs w:val="22"/>
+              <w:kern w:val="2"/>
+              <w:sz w:val="24"/>
+              <w:szCs w:val="24"/>
               <w:lang w:val="ru-RU"/>
+              <w14:ligatures w14:val="standardContextual"/>
             </w:rPr>
           </w:pPr>
-          <w:hyperlink w:anchor="_Toc212823946" w:history="1">
-            <w:r>
-              <w:rPr>
-                <w:rStyle w:val="Hyperlink"/>
+          <w:hyperlink w:anchor="_Toc219060702" w:history="1">
+            <w:r>
+              <w:rPr>
+                <w:rStyle w:val="ab"/>
                 <w:noProof/>
               </w:rPr>
               <w:t>2.</w:t>
@@ -438,15 +448,17 @@
               <w:rPr>
                 <w:rFonts w:asciiTheme="minorHAnsi" w:eastAsiaTheme="minorEastAsia" w:hAnsiTheme="minorHAnsi" w:cstheme="minorBidi"/>
                 <w:noProof/>
-                <w:sz w:val="22"/>
-                <w:szCs w:val="22"/>
+                <w:kern w:val="2"/>
+                <w:sz w:val="24"/>
+                <w:szCs w:val="24"/>
                 <w:lang w:val="ru-RU"/>
+                <w14:ligatures w14:val="standardContextual"/>
               </w:rPr>
               <w:tab/>
             </w:r>
             <w:r>
               <w:rPr>
-                <w:rStyle w:val="Hyperlink"/>
+                <w:rStyle w:val="ab"/>
                 <w:noProof/>
               </w:rPr>
               <w:t>Общие сведения о проектируемой системе</w:t>
@@ -470,7 +482,7 @@
                 <w:noProof/>
                 <w:webHidden/>
               </w:rPr>
-              <w:instrText xml:space="preserve"> PAGEREF _Toc212823946 \h </w:instrText>
+              <w:instrText xml:space="preserve"> PAGEREF _Toc219060702 \h </w:instrText>
             </w:r>
             <w:r>
               <w:rPr>
@@ -503,23 +515,25 @@
         </w:p>
         <w:p>
           <w:pPr>
-            <w:pStyle w:val="TOC2"/>
+            <w:pStyle w:val="21"/>
             <w:tabs>
-              <w:tab w:val="left" w:pos="1760"/>
+              <w:tab w:val="left" w:pos="1680"/>
               <w:tab w:val="right" w:leader="dot" w:pos="9019"/>
             </w:tabs>
             <w:rPr>
               <w:rFonts w:asciiTheme="minorHAnsi" w:eastAsiaTheme="minorEastAsia" w:hAnsiTheme="minorHAnsi" w:cstheme="minorBidi"/>
               <w:noProof/>
-              <w:sz w:val="22"/>
-              <w:szCs w:val="22"/>
+              <w:kern w:val="2"/>
+              <w:sz w:val="24"/>
+              <w:szCs w:val="24"/>
               <w:lang w:val="ru-RU"/>
+              <w14:ligatures w14:val="standardContextual"/>
             </w:rPr>
           </w:pPr>
-          <w:hyperlink w:anchor="_Toc212823947" w:history="1">
-            <w:r>
-              <w:rPr>
-                <w:rStyle w:val="Hyperlink"/>
+          <w:hyperlink w:anchor="_Toc219060703" w:history="1">
+            <w:r>
+              <w:rPr>
+                <w:rStyle w:val="ab"/>
                 <w:noProof/>
               </w:rPr>
               <w:t>2.1.</w:t>
@@ -528,15 +542,17 @@
               <w:rPr>
                 <w:rFonts w:asciiTheme="minorHAnsi" w:eastAsiaTheme="minorEastAsia" w:hAnsiTheme="minorHAnsi" w:cstheme="minorBidi"/>
                 <w:noProof/>
-                <w:sz w:val="22"/>
-                <w:szCs w:val="22"/>
+                <w:kern w:val="2"/>
+                <w:sz w:val="24"/>
+                <w:szCs w:val="24"/>
                 <w:lang w:val="ru-RU"/>
+                <w14:ligatures w14:val="standardContextual"/>
               </w:rPr>
               <w:tab/>
             </w:r>
             <w:r>
               <w:rPr>
-                <w:rStyle w:val="Hyperlink"/>
+                <w:rStyle w:val="ab"/>
                 <w:noProof/>
                 <w:lang w:val="ru-RU"/>
               </w:rPr>
@@ -561,7 +577,7 @@
                 <w:noProof/>
                 <w:webHidden/>
               </w:rPr>
-              <w:instrText xml:space="preserve"> PAGEREF _Toc212823947 \h </w:instrText>
+              <w:instrText xml:space="preserve"> PAGEREF _Toc219060703 \h </w:instrText>
             </w:r>
             <w:r>
               <w:rPr>
@@ -594,23 +610,25 @@
         </w:p>
         <w:p>
           <w:pPr>
-            <w:pStyle w:val="TOC2"/>
+            <w:pStyle w:val="21"/>
             <w:tabs>
-              <w:tab w:val="left" w:pos="1760"/>
+              <w:tab w:val="left" w:pos="1680"/>
               <w:tab w:val="right" w:leader="dot" w:pos="9019"/>
             </w:tabs>
             <w:rPr>
               <w:rFonts w:asciiTheme="minorHAnsi" w:eastAsiaTheme="minorEastAsia" w:hAnsiTheme="minorHAnsi" w:cstheme="minorBidi"/>
               <w:noProof/>
-              <w:sz w:val="22"/>
-              <w:szCs w:val="22"/>
+              <w:kern w:val="2"/>
+              <w:sz w:val="24"/>
+              <w:szCs w:val="24"/>
               <w:lang w:val="ru-RU"/>
+              <w14:ligatures w14:val="standardContextual"/>
             </w:rPr>
           </w:pPr>
-          <w:hyperlink w:anchor="_Toc212823948" w:history="1">
-            <w:r>
-              <w:rPr>
-                <w:rStyle w:val="Hyperlink"/>
+          <w:hyperlink w:anchor="_Toc219060704" w:history="1">
+            <w:r>
+              <w:rPr>
+                <w:rStyle w:val="ab"/>
                 <w:noProof/>
               </w:rPr>
               <w:t>2.2.</w:t>
@@ -619,15 +637,17 @@
               <w:rPr>
                 <w:rFonts w:asciiTheme="minorHAnsi" w:eastAsiaTheme="minorEastAsia" w:hAnsiTheme="minorHAnsi" w:cstheme="minorBidi"/>
                 <w:noProof/>
-                <w:sz w:val="22"/>
-                <w:szCs w:val="22"/>
+                <w:kern w:val="2"/>
+                <w:sz w:val="24"/>
+                <w:szCs w:val="24"/>
                 <w:lang w:val="ru-RU"/>
+                <w14:ligatures w14:val="standardContextual"/>
               </w:rPr>
               <w:tab/>
             </w:r>
             <w:r>
               <w:rPr>
-                <w:rStyle w:val="Hyperlink"/>
+                <w:rStyle w:val="ab"/>
                 <w:noProof/>
               </w:rPr>
               <w:t>Функциональные требования</w:t>
@@ -651,7 +671,7 @@
                 <w:noProof/>
                 <w:webHidden/>
               </w:rPr>
-              <w:instrText xml:space="preserve"> PAGEREF _Toc212823948 \h </w:instrText>
+              <w:instrText xml:space="preserve"> PAGEREF _Toc219060704 \h </w:instrText>
             </w:r>
             <w:r>
               <w:rPr>
@@ -684,24 +704,27 @@
         </w:p>
         <w:p>
           <w:pPr>
-            <w:pStyle w:val="TOC3"/>
+            <w:pStyle w:val="31"/>
             <w:tabs>
-              <w:tab w:val="left" w:pos="2130"/>
+              <w:tab w:val="left" w:pos="2139"/>
               <w:tab w:val="right" w:leader="dot" w:pos="9019"/>
             </w:tabs>
             <w:rPr>
               <w:rFonts w:asciiTheme="minorHAnsi" w:eastAsiaTheme="minorEastAsia" w:hAnsiTheme="minorHAnsi" w:cstheme="minorBidi"/>
               <w:noProof/>
-              <w:sz w:val="22"/>
-              <w:szCs w:val="22"/>
+              <w:kern w:val="2"/>
+              <w:sz w:val="24"/>
+              <w:szCs w:val="24"/>
               <w:lang w:val="ru-RU"/>
+              <w14:ligatures w14:val="standardContextual"/>
             </w:rPr>
           </w:pPr>
-          <w:hyperlink w:anchor="_Toc212823949" w:history="1">
-            <w:r>
-              <w:rPr>
-                <w:rStyle w:val="Hyperlink"/>
-                <w:noProof/>
+          <w:hyperlink w:anchor="_Toc219060705" w:history="1">
+            <w:r>
+              <w:rPr>
+                <w:rStyle w:val="ab"/>
+                <w:noProof/>
+                <w:highlight w:val="yellow"/>
               </w:rPr>
               <w:t>2.2.1.</w:t>
             </w:r>
@@ -709,16 +732,19 @@
               <w:rPr>
                 <w:rFonts w:asciiTheme="minorHAnsi" w:eastAsiaTheme="minorEastAsia" w:hAnsiTheme="minorHAnsi" w:cstheme="minorBidi"/>
                 <w:noProof/>
-                <w:sz w:val="22"/>
-                <w:szCs w:val="22"/>
+                <w:kern w:val="2"/>
+                <w:sz w:val="24"/>
+                <w:szCs w:val="24"/>
                 <w:lang w:val="ru-RU"/>
+                <w14:ligatures w14:val="standardContextual"/>
               </w:rPr>
               <w:tab/>
             </w:r>
             <w:r>
               <w:rPr>
-                <w:rStyle w:val="Hyperlink"/>
-                <w:noProof/>
+                <w:rStyle w:val="ab"/>
+                <w:noProof/>
+                <w:highlight w:val="yellow"/>
               </w:rPr>
               <w:t>Требование к системе</w:t>
             </w:r>
@@ -741,7 +767,7 @@
                 <w:noProof/>
                 <w:webHidden/>
               </w:rPr>
-              <w:instrText xml:space="preserve"> PAGEREF _Toc212823949 \h </w:instrText>
+              <w:instrText xml:space="preserve"> PAGEREF _Toc219060705 \h </w:instrText>
             </w:r>
             <w:r>
               <w:rPr>
@@ -774,24 +800,27 @@
         </w:p>
         <w:p>
           <w:pPr>
-            <w:pStyle w:val="TOC3"/>
+            <w:pStyle w:val="31"/>
             <w:tabs>
-              <w:tab w:val="left" w:pos="2130"/>
+              <w:tab w:val="left" w:pos="2139"/>
               <w:tab w:val="right" w:leader="dot" w:pos="9019"/>
             </w:tabs>
             <w:rPr>
               <w:rFonts w:asciiTheme="minorHAnsi" w:eastAsiaTheme="minorEastAsia" w:hAnsiTheme="minorHAnsi" w:cstheme="minorBidi"/>
               <w:noProof/>
-              <w:sz w:val="22"/>
-              <w:szCs w:val="22"/>
+              <w:kern w:val="2"/>
+              <w:sz w:val="24"/>
+              <w:szCs w:val="24"/>
               <w:lang w:val="ru-RU"/>
+              <w14:ligatures w14:val="standardContextual"/>
             </w:rPr>
           </w:pPr>
-          <w:hyperlink w:anchor="_Toc212823950" w:history="1">
-            <w:r>
-              <w:rPr>
-                <w:rStyle w:val="Hyperlink"/>
-                <w:noProof/>
+          <w:hyperlink w:anchor="_Toc219060706" w:history="1">
+            <w:r>
+              <w:rPr>
+                <w:rStyle w:val="ab"/>
+                <w:noProof/>
+                <w:lang w:val="ru-RU"/>
               </w:rPr>
               <w:t>2.2.2.</w:t>
             </w:r>
@@ -799,15 +828,17 @@
               <w:rPr>
                 <w:rFonts w:asciiTheme="minorHAnsi" w:eastAsiaTheme="minorEastAsia" w:hAnsiTheme="minorHAnsi" w:cstheme="minorBidi"/>
                 <w:noProof/>
-                <w:sz w:val="22"/>
-                <w:szCs w:val="22"/>
+                <w:kern w:val="2"/>
+                <w:sz w:val="24"/>
+                <w:szCs w:val="24"/>
                 <w:lang w:val="ru-RU"/>
+                <w14:ligatures w14:val="standardContextual"/>
               </w:rPr>
               <w:tab/>
             </w:r>
             <w:r>
               <w:rPr>
-                <w:rStyle w:val="Hyperlink"/>
+                <w:rStyle w:val="ab"/>
                 <w:noProof/>
               </w:rPr>
               <w:t>Требования к интерфейсу</w:t>
@@ -831,7 +862,7 @@
                 <w:noProof/>
                 <w:webHidden/>
               </w:rPr>
-              <w:instrText xml:space="preserve"> PAGEREF _Toc212823950 \h </w:instrText>
+              <w:instrText xml:space="preserve"> PAGEREF _Toc219060706 \h </w:instrText>
             </w:r>
             <w:r>
               <w:rPr>
@@ -864,43 +895,48 @@
         </w:p>
         <w:p>
           <w:pPr>
-            <w:pStyle w:val="TOC3"/>
+            <w:pStyle w:val="11"/>
             <w:tabs>
-              <w:tab w:val="left" w:pos="2130"/>
+              <w:tab w:val="left" w:pos="1200"/>
               <w:tab w:val="right" w:leader="dot" w:pos="9019"/>
             </w:tabs>
             <w:rPr>
               <w:rFonts w:asciiTheme="minorHAnsi" w:eastAsiaTheme="minorEastAsia" w:hAnsiTheme="minorHAnsi" w:cstheme="minorBidi"/>
               <w:noProof/>
-              <w:sz w:val="22"/>
-              <w:szCs w:val="22"/>
+              <w:kern w:val="2"/>
+              <w:sz w:val="24"/>
+              <w:szCs w:val="24"/>
               <w:lang w:val="ru-RU"/>
+              <w14:ligatures w14:val="standardContextual"/>
             </w:rPr>
           </w:pPr>
-          <w:hyperlink w:anchor="_Toc212823951" w:history="1">
-            <w:r>
-              <w:rPr>
-                <w:rStyle w:val="Hyperlink"/>
-                <w:noProof/>
-              </w:rPr>
-              <w:t>2.2.3.</w:t>
+          <w:hyperlink w:anchor="_Toc219060707" w:history="1">
+            <w:r>
+              <w:rPr>
+                <w:rStyle w:val="ab"/>
+                <w:noProof/>
+              </w:rPr>
+              <w:t>3.</w:t>
             </w:r>
             <w:r>
               <w:rPr>
                 <w:rFonts w:asciiTheme="minorHAnsi" w:eastAsiaTheme="minorEastAsia" w:hAnsiTheme="minorHAnsi" w:cstheme="minorBidi"/>
                 <w:noProof/>
-                <w:sz w:val="22"/>
-                <w:szCs w:val="22"/>
+                <w:kern w:val="2"/>
+                <w:sz w:val="24"/>
+                <w:szCs w:val="24"/>
                 <w:lang w:val="ru-RU"/>
+                <w14:ligatures w14:val="standardContextual"/>
               </w:rPr>
               <w:tab/>
             </w:r>
             <w:r>
               <w:rPr>
-                <w:rStyle w:val="Hyperlink"/>
-                <w:noProof/>
-              </w:rPr>
-              <w:t>Требования к аутентификации и авторизации</w:t>
+                <w:rStyle w:val="ab"/>
+                <w:noProof/>
+                <w:lang w:val="ru-RU"/>
+              </w:rPr>
+              <w:t>Требования к безопасности</w:t>
             </w:r>
             <w:r>
               <w:rPr>
@@ -921,7 +957,7 @@
                 <w:noProof/>
                 <w:webHidden/>
               </w:rPr>
-              <w:instrText xml:space="preserve"> PAGEREF _Toc212823951 \h </w:instrText>
+              <w:instrText xml:space="preserve"> PAGEREF _Toc219060707 \h </w:instrText>
             </w:r>
             <w:r>
               <w:rPr>
@@ -941,7 +977,7 @@
                 <w:noProof/>
                 <w:webHidden/>
               </w:rPr>
-              <w:t>8</w:t>
+              <w:t>9</w:t>
             </w:r>
             <w:r>
               <w:rPr>
@@ -954,43 +990,48 @@
         </w:p>
         <w:p>
           <w:pPr>
-            <w:pStyle w:val="TOC3"/>
+            <w:pStyle w:val="11"/>
             <w:tabs>
-              <w:tab w:val="left" w:pos="2130"/>
+              <w:tab w:val="left" w:pos="1200"/>
               <w:tab w:val="right" w:leader="dot" w:pos="9019"/>
             </w:tabs>
             <w:rPr>
               <w:rFonts w:asciiTheme="minorHAnsi" w:eastAsiaTheme="minorEastAsia" w:hAnsiTheme="minorHAnsi" w:cstheme="minorBidi"/>
               <w:noProof/>
-              <w:sz w:val="22"/>
-              <w:szCs w:val="22"/>
+              <w:kern w:val="2"/>
+              <w:sz w:val="24"/>
+              <w:szCs w:val="24"/>
               <w:lang w:val="ru-RU"/>
+              <w14:ligatures w14:val="standardContextual"/>
             </w:rPr>
           </w:pPr>
-          <w:hyperlink w:anchor="_Toc212823952" w:history="1">
-            <w:r>
-              <w:rPr>
-                <w:rStyle w:val="Hyperlink"/>
-                <w:noProof/>
-              </w:rPr>
-              <w:t>2.2.4.</w:t>
+          <w:hyperlink w:anchor="_Toc219060708" w:history="1">
+            <w:r>
+              <w:rPr>
+                <w:rStyle w:val="ab"/>
+                <w:noProof/>
+              </w:rPr>
+              <w:t>4.</w:t>
             </w:r>
             <w:r>
               <w:rPr>
                 <w:rFonts w:asciiTheme="minorHAnsi" w:eastAsiaTheme="minorEastAsia" w:hAnsiTheme="minorHAnsi" w:cstheme="minorBidi"/>
                 <w:noProof/>
-                <w:sz w:val="22"/>
-                <w:szCs w:val="22"/>
+                <w:kern w:val="2"/>
+                <w:sz w:val="24"/>
+                <w:szCs w:val="24"/>
                 <w:lang w:val="ru-RU"/>
+                <w14:ligatures w14:val="standardContextual"/>
               </w:rPr>
               <w:tab/>
             </w:r>
             <w:r>
               <w:rPr>
-                <w:rStyle w:val="Hyperlink"/>
-                <w:noProof/>
-              </w:rPr>
-              <w:t>Функциональные требования к ролям</w:t>
+                <w:rStyle w:val="ab"/>
+                <w:noProof/>
+                <w:lang w:val="ru-RU"/>
+              </w:rPr>
+              <w:t>Требования к документации</w:t>
             </w:r>
             <w:r>
               <w:rPr>
@@ -1011,7 +1052,7 @@
                 <w:noProof/>
                 <w:webHidden/>
               </w:rPr>
-              <w:instrText xml:space="preserve"> PAGEREF _Toc212823952 \h </w:instrText>
+              <w:instrText xml:space="preserve"> PAGEREF _Toc219060708 \h </w:instrText>
             </w:r>
             <w:r>
               <w:rPr>
@@ -1031,7 +1072,7 @@
                 <w:noProof/>
                 <w:webHidden/>
               </w:rPr>
-              <w:t>8</w:t>
+              <w:t>11</w:t>
             </w:r>
             <w:r>
               <w:rPr>
@@ -1044,43 +1085,48 @@
         </w:p>
         <w:p>
           <w:pPr>
-            <w:pStyle w:val="TOC3"/>
+            <w:pStyle w:val="11"/>
             <w:tabs>
-              <w:tab w:val="left" w:pos="1760"/>
+              <w:tab w:val="left" w:pos="1200"/>
               <w:tab w:val="right" w:leader="dot" w:pos="9019"/>
             </w:tabs>
             <w:rPr>
               <w:rFonts w:asciiTheme="minorHAnsi" w:eastAsiaTheme="minorEastAsia" w:hAnsiTheme="minorHAnsi" w:cstheme="minorBidi"/>
               <w:noProof/>
-              <w:sz w:val="22"/>
-              <w:szCs w:val="22"/>
+              <w:kern w:val="2"/>
+              <w:sz w:val="24"/>
+              <w:szCs w:val="24"/>
               <w:lang w:val="ru-RU"/>
+              <w14:ligatures w14:val="standardContextual"/>
             </w:rPr>
           </w:pPr>
-          <w:hyperlink w:anchor="_Toc212823953" w:history="1">
-            <w:r>
-              <w:rPr>
-                <w:rStyle w:val="Hyperlink"/>
-                <w:noProof/>
-              </w:rPr>
-              <w:t>a.</w:t>
+          <w:hyperlink w:anchor="_Toc219060709" w:history="1">
+            <w:r>
+              <w:rPr>
+                <w:rStyle w:val="ab"/>
+                <w:noProof/>
+              </w:rPr>
+              <w:t>5.</w:t>
             </w:r>
             <w:r>
               <w:rPr>
                 <w:rFonts w:asciiTheme="minorHAnsi" w:eastAsiaTheme="minorEastAsia" w:hAnsiTheme="minorHAnsi" w:cstheme="minorBidi"/>
                 <w:noProof/>
-                <w:sz w:val="22"/>
-                <w:szCs w:val="22"/>
+                <w:kern w:val="2"/>
+                <w:sz w:val="24"/>
+                <w:szCs w:val="24"/>
                 <w:lang w:val="ru-RU"/>
+                <w14:ligatures w14:val="standardContextual"/>
               </w:rPr>
               <w:tab/>
             </w:r>
             <w:r>
               <w:rPr>
-                <w:rStyle w:val="Hyperlink"/>
-                <w:noProof/>
-              </w:rPr>
-              <w:t>Роль куратора:</w:t>
+                <w:rStyle w:val="ab"/>
+                <w:noProof/>
+                <w:lang w:val="ru-RU"/>
+              </w:rPr>
+              <w:t>Стадии и этапы разработки</w:t>
             </w:r>
             <w:r>
               <w:rPr>
@@ -1101,7 +1147,7 @@
                 <w:noProof/>
                 <w:webHidden/>
               </w:rPr>
-              <w:instrText xml:space="preserve"> PAGEREF _Toc212823953 \h </w:instrText>
+              <w:instrText xml:space="preserve"> PAGEREF _Toc219060709 \h </w:instrText>
             </w:r>
             <w:r>
               <w:rPr>
@@ -1121,7 +1167,7 @@
                 <w:noProof/>
                 <w:webHidden/>
               </w:rPr>
-              <w:t>8</w:t>
+              <w:t>11</w:t>
             </w:r>
             <w:r>
               <w:rPr>
@@ -1134,43 +1180,49 @@
         </w:p>
         <w:p>
           <w:pPr>
-            <w:pStyle w:val="TOC3"/>
+            <w:pStyle w:val="11"/>
             <w:tabs>
-              <w:tab w:val="left" w:pos="1760"/>
+              <w:tab w:val="left" w:pos="1200"/>
               <w:tab w:val="right" w:leader="dot" w:pos="9019"/>
             </w:tabs>
             <w:rPr>
               <w:rFonts w:asciiTheme="minorHAnsi" w:eastAsiaTheme="minorEastAsia" w:hAnsiTheme="minorHAnsi" w:cstheme="minorBidi"/>
               <w:noProof/>
-              <w:sz w:val="22"/>
-              <w:szCs w:val="22"/>
+              <w:kern w:val="2"/>
+              <w:sz w:val="24"/>
+              <w:szCs w:val="24"/>
               <w:lang w:val="ru-RU"/>
+              <w14:ligatures w14:val="standardContextual"/>
             </w:rPr>
           </w:pPr>
-          <w:hyperlink w:anchor="_Toc212823954" w:history="1">
-            <w:r>
-              <w:rPr>
-                <w:rStyle w:val="Hyperlink"/>
-                <w:noProof/>
-              </w:rPr>
-              <w:t>b.</w:t>
+          <w:hyperlink w:anchor="_Toc219060710" w:history="1">
+            <w:r>
+              <w:rPr>
+                <w:rStyle w:val="ab"/>
+                <w:noProof/>
+                <w:lang w:val="ru-RU"/>
+              </w:rPr>
+              <w:t>6.</w:t>
             </w:r>
             <w:r>
               <w:rPr>
                 <w:rFonts w:asciiTheme="minorHAnsi" w:eastAsiaTheme="minorEastAsia" w:hAnsiTheme="minorHAnsi" w:cstheme="minorBidi"/>
                 <w:noProof/>
-                <w:sz w:val="22"/>
-                <w:szCs w:val="22"/>
+                <w:kern w:val="2"/>
+                <w:sz w:val="24"/>
+                <w:szCs w:val="24"/>
                 <w:lang w:val="ru-RU"/>
+                <w14:ligatures w14:val="standardContextual"/>
               </w:rPr>
               <w:tab/>
             </w:r>
             <w:r>
               <w:rPr>
-                <w:rStyle w:val="Hyperlink"/>
-                <w:noProof/>
-              </w:rPr>
-              <w:t>Роль старосты:</w:t>
+                <w:rStyle w:val="ab"/>
+                <w:noProof/>
+                <w:lang w:val="ru-RU"/>
+              </w:rPr>
+              <w:t>Порядок контроля</w:t>
             </w:r>
             <w:r>
               <w:rPr>
@@ -1191,7 +1243,7 @@
                 <w:noProof/>
                 <w:webHidden/>
               </w:rPr>
-              <w:instrText xml:space="preserve"> PAGEREF _Toc212823954 \h </w:instrText>
+              <w:instrText xml:space="preserve"> PAGEREF _Toc219060710 \h </w:instrText>
             </w:r>
             <w:r>
               <w:rPr>
@@ -1211,7 +1263,7 @@
                 <w:noProof/>
                 <w:webHidden/>
               </w:rPr>
-              <w:t>8</w:t>
+              <w:t>12</w:t>
             </w:r>
             <w:r>
               <w:rPr>
@@ -1224,43 +1276,64 @@
         </w:p>
         <w:p>
           <w:pPr>
-            <w:pStyle w:val="TOC3"/>
+            <w:pStyle w:val="21"/>
             <w:tabs>
-              <w:tab w:val="left" w:pos="1760"/>
+              <w:tab w:val="left" w:pos="1680"/>
               <w:tab w:val="right" w:leader="dot" w:pos="9019"/>
             </w:tabs>
             <w:rPr>
               <w:rFonts w:asciiTheme="minorHAnsi" w:eastAsiaTheme="minorEastAsia" w:hAnsiTheme="minorHAnsi" w:cstheme="minorBidi"/>
               <w:noProof/>
-              <w:sz w:val="22"/>
-              <w:szCs w:val="22"/>
+              <w:kern w:val="2"/>
+              <w:sz w:val="24"/>
+              <w:szCs w:val="24"/>
               <w:lang w:val="ru-RU"/>
+              <w14:ligatures w14:val="standardContextual"/>
             </w:rPr>
           </w:pPr>
-          <w:hyperlink w:anchor="_Toc212823955" w:history="1">
-            <w:r>
-              <w:rPr>
-                <w:rStyle w:val="Hyperlink"/>
-                <w:noProof/>
-              </w:rPr>
-              <w:t>c.</w:t>
+          <w:hyperlink w:anchor="_Toc219060715" w:history="1">
+            <w:r>
+              <w:rPr>
+                <w:rStyle w:val="ab"/>
+                <w:noProof/>
+              </w:rPr>
+              <w:t>6.1.</w:t>
             </w:r>
             <w:r>
               <w:rPr>
                 <w:rFonts w:asciiTheme="minorHAnsi" w:eastAsiaTheme="minorEastAsia" w:hAnsiTheme="minorHAnsi" w:cstheme="minorBidi"/>
                 <w:noProof/>
-                <w:sz w:val="22"/>
-                <w:szCs w:val="22"/>
+                <w:kern w:val="2"/>
+                <w:sz w:val="24"/>
+                <w:szCs w:val="24"/>
                 <w:lang w:val="ru-RU"/>
+                <w14:ligatures w14:val="standardContextual"/>
               </w:rPr>
               <w:tab/>
             </w:r>
             <w:r>
               <w:rPr>
-                <w:rStyle w:val="Hyperlink"/>
-                <w:noProof/>
-              </w:rPr>
-              <w:t>Роль студента:</w:t>
+                <w:rStyle w:val="ab"/>
+                <w:noProof/>
+                <w:lang w:val="ru-RU"/>
+              </w:rPr>
+              <w:t>Ви</w:t>
+            </w:r>
+            <w:r>
+              <w:rPr>
+                <w:rStyle w:val="ab"/>
+                <w:noProof/>
+                <w:lang w:val="ru-RU"/>
+              </w:rPr>
+              <w:t>д</w:t>
+            </w:r>
+            <w:r>
+              <w:rPr>
+                <w:rStyle w:val="ab"/>
+                <w:noProof/>
+                <w:lang w:val="ru-RU"/>
+              </w:rPr>
+              <w:t>ы испытаний</w:t>
             </w:r>
             <w:r>
               <w:rPr>
@@ -1281,7 +1354,7 @@
                 <w:noProof/>
                 <w:webHidden/>
               </w:rPr>
-              <w:instrText xml:space="preserve"> PAGEREF _Toc212823955 \h </w:instrText>
+              <w:instrText xml:space="preserve"> PAGEREF _Toc219060715 \h </w:instrText>
             </w:r>
             <w:r>
               <w:rPr>
@@ -1301,7 +1374,7 @@
                 <w:noProof/>
                 <w:webHidden/>
               </w:rPr>
-              <w:t>9</w:t>
+              <w:t>12</w:t>
             </w:r>
             <w:r>
               <w:rPr>
@@ -1314,478 +1387,24 @@
         </w:p>
         <w:p>
           <w:pPr>
-            <w:pStyle w:val="TOC1"/>
-            <w:tabs>
-              <w:tab w:val="left" w:pos="1320"/>
-              <w:tab w:val="right" w:leader="dot" w:pos="9019"/>
-            </w:tabs>
-            <w:rPr>
-              <w:rFonts w:asciiTheme="minorHAnsi" w:eastAsiaTheme="minorEastAsia" w:hAnsiTheme="minorHAnsi" w:cstheme="minorBidi"/>
-              <w:noProof/>
-              <w:sz w:val="22"/>
-              <w:szCs w:val="22"/>
-              <w:lang w:val="ru-RU"/>
-            </w:rPr>
-          </w:pPr>
-          <w:hyperlink w:anchor="_Toc212823956" w:history="1">
-            <w:r>
-              <w:rPr>
-                <w:rStyle w:val="Hyperlink"/>
-                <w:noProof/>
-              </w:rPr>
-              <w:t>3.</w:t>
-            </w:r>
-            <w:r>
-              <w:rPr>
-                <w:rFonts w:asciiTheme="minorHAnsi" w:eastAsiaTheme="minorEastAsia" w:hAnsiTheme="minorHAnsi" w:cstheme="minorBidi"/>
-                <w:noProof/>
-                <w:sz w:val="22"/>
-                <w:szCs w:val="22"/>
-                <w:lang w:val="ru-RU"/>
-              </w:rPr>
-              <w:tab/>
-            </w:r>
-            <w:r>
-              <w:rPr>
-                <w:rStyle w:val="Hyperlink"/>
-                <w:noProof/>
-                <w:lang w:val="ru-RU"/>
-              </w:rPr>
-              <w:t>Требования к безопасности</w:t>
-            </w:r>
-            <w:r>
-              <w:rPr>
-                <w:noProof/>
-                <w:webHidden/>
-              </w:rPr>
-              <w:tab/>
-            </w:r>
-            <w:r>
-              <w:rPr>
-                <w:noProof/>
-                <w:webHidden/>
-              </w:rPr>
-              <w:fldChar w:fldCharType="begin"/>
-            </w:r>
-            <w:r>
-              <w:rPr>
-                <w:noProof/>
-                <w:webHidden/>
-              </w:rPr>
-              <w:instrText xml:space="preserve"> PAGEREF _Toc212823956 \h </w:instrText>
-            </w:r>
-            <w:r>
-              <w:rPr>
-                <w:noProof/>
-                <w:webHidden/>
-              </w:rPr>
-            </w:r>
-            <w:r>
-              <w:rPr>
-                <w:noProof/>
-                <w:webHidden/>
-              </w:rPr>
-              <w:fldChar w:fldCharType="separate"/>
-            </w:r>
-            <w:r>
-              <w:rPr>
-                <w:noProof/>
-                <w:webHidden/>
-              </w:rPr>
-              <w:t>9</w:t>
-            </w:r>
-            <w:r>
-              <w:rPr>
-                <w:noProof/>
-                <w:webHidden/>
-              </w:rPr>
-              <w:fldChar w:fldCharType="end"/>
-            </w:r>
-          </w:hyperlink>
-        </w:p>
-        <w:p>
-          <w:pPr>
-            <w:pStyle w:val="TOC1"/>
-            <w:tabs>
-              <w:tab w:val="left" w:pos="1320"/>
-              <w:tab w:val="right" w:leader="dot" w:pos="9019"/>
-            </w:tabs>
-            <w:rPr>
-              <w:rFonts w:asciiTheme="minorHAnsi" w:eastAsiaTheme="minorEastAsia" w:hAnsiTheme="minorHAnsi" w:cstheme="minorBidi"/>
-              <w:noProof/>
-              <w:sz w:val="22"/>
-              <w:szCs w:val="22"/>
-              <w:lang w:val="ru-RU"/>
-            </w:rPr>
-          </w:pPr>
-          <w:hyperlink w:anchor="_Toc212823957" w:history="1">
-            <w:r>
-              <w:rPr>
-                <w:rStyle w:val="Hyperlink"/>
-                <w:noProof/>
-              </w:rPr>
-              <w:t>4.</w:t>
-            </w:r>
-            <w:r>
-              <w:rPr>
-                <w:rFonts w:asciiTheme="minorHAnsi" w:eastAsiaTheme="minorEastAsia" w:hAnsiTheme="minorHAnsi" w:cstheme="minorBidi"/>
-                <w:noProof/>
-                <w:sz w:val="22"/>
-                <w:szCs w:val="22"/>
-                <w:lang w:val="ru-RU"/>
-              </w:rPr>
-              <w:tab/>
-            </w:r>
-            <w:r>
-              <w:rPr>
-                <w:rStyle w:val="Hyperlink"/>
-                <w:noProof/>
-                <w:lang w:val="ru-RU"/>
-              </w:rPr>
-              <w:t>Требования к документации</w:t>
-            </w:r>
-            <w:r>
-              <w:rPr>
-                <w:noProof/>
-                <w:webHidden/>
-              </w:rPr>
-              <w:tab/>
-            </w:r>
-            <w:r>
-              <w:rPr>
-                <w:noProof/>
-                <w:webHidden/>
-              </w:rPr>
-              <w:fldChar w:fldCharType="begin"/>
-            </w:r>
-            <w:r>
-              <w:rPr>
-                <w:noProof/>
-                <w:webHidden/>
-              </w:rPr>
-              <w:instrText xml:space="preserve"> PAGEREF _Toc212823957 \h </w:instrText>
-            </w:r>
-            <w:r>
-              <w:rPr>
-                <w:noProof/>
-                <w:webHidden/>
-              </w:rPr>
-            </w:r>
-            <w:r>
-              <w:rPr>
-                <w:noProof/>
-                <w:webHidden/>
-              </w:rPr>
-              <w:fldChar w:fldCharType="separate"/>
-            </w:r>
-            <w:r>
-              <w:rPr>
-                <w:noProof/>
-                <w:webHidden/>
-              </w:rPr>
-              <w:t>10</w:t>
-            </w:r>
-            <w:r>
-              <w:rPr>
-                <w:noProof/>
-                <w:webHidden/>
-              </w:rPr>
-              <w:fldChar w:fldCharType="end"/>
-            </w:r>
-          </w:hyperlink>
-        </w:p>
-        <w:p>
-          <w:pPr>
-            <w:pStyle w:val="TOC1"/>
-            <w:tabs>
-              <w:tab w:val="left" w:pos="1320"/>
-              <w:tab w:val="right" w:leader="dot" w:pos="9019"/>
-            </w:tabs>
-            <w:rPr>
-              <w:rFonts w:asciiTheme="minorHAnsi" w:eastAsiaTheme="minorEastAsia" w:hAnsiTheme="minorHAnsi" w:cstheme="minorBidi"/>
-              <w:noProof/>
-              <w:sz w:val="22"/>
-              <w:szCs w:val="22"/>
-              <w:lang w:val="ru-RU"/>
-            </w:rPr>
-          </w:pPr>
-          <w:hyperlink w:anchor="_Toc212823958" w:history="1">
-            <w:r>
-              <w:rPr>
-                <w:rStyle w:val="Hyperlink"/>
-                <w:noProof/>
-              </w:rPr>
-              <w:t>5.</w:t>
-            </w:r>
-            <w:r>
-              <w:rPr>
-                <w:rFonts w:asciiTheme="minorHAnsi" w:eastAsiaTheme="minorEastAsia" w:hAnsiTheme="minorHAnsi" w:cstheme="minorBidi"/>
-                <w:noProof/>
-                <w:sz w:val="22"/>
-                <w:szCs w:val="22"/>
-                <w:lang w:val="ru-RU"/>
-              </w:rPr>
-              <w:tab/>
-            </w:r>
-            <w:r>
-              <w:rPr>
-                <w:rStyle w:val="Hyperlink"/>
-                <w:noProof/>
-                <w:lang w:val="ru-RU"/>
-              </w:rPr>
-              <w:t>Стадии и этапы разработки</w:t>
-            </w:r>
-            <w:r>
-              <w:rPr>
-                <w:noProof/>
-                <w:webHidden/>
-              </w:rPr>
-              <w:tab/>
-            </w:r>
-            <w:r>
-              <w:rPr>
-                <w:noProof/>
-                <w:webHidden/>
-              </w:rPr>
-              <w:fldChar w:fldCharType="begin"/>
-            </w:r>
-            <w:r>
-              <w:rPr>
-                <w:noProof/>
-                <w:webHidden/>
-              </w:rPr>
-              <w:instrText xml:space="preserve"> PAGEREF _Toc212823958 \h </w:instrText>
-            </w:r>
-            <w:r>
-              <w:rPr>
-                <w:noProof/>
-                <w:webHidden/>
-              </w:rPr>
-            </w:r>
-            <w:r>
-              <w:rPr>
-                <w:noProof/>
-                <w:webHidden/>
-              </w:rPr>
-              <w:fldChar w:fldCharType="separate"/>
-            </w:r>
-            <w:r>
-              <w:rPr>
-                <w:noProof/>
-                <w:webHidden/>
-              </w:rPr>
-              <w:t>10</w:t>
-            </w:r>
-            <w:r>
-              <w:rPr>
-                <w:noProof/>
-                <w:webHidden/>
-              </w:rPr>
-              <w:fldChar w:fldCharType="end"/>
-            </w:r>
-          </w:hyperlink>
-        </w:p>
-        <w:p>
-          <w:pPr>
-            <w:pStyle w:val="TOC1"/>
-            <w:tabs>
-              <w:tab w:val="left" w:pos="1320"/>
-              <w:tab w:val="right" w:leader="dot" w:pos="9019"/>
-            </w:tabs>
-            <w:rPr>
-              <w:rFonts w:asciiTheme="minorHAnsi" w:eastAsiaTheme="minorEastAsia" w:hAnsiTheme="minorHAnsi" w:cstheme="minorBidi"/>
-              <w:noProof/>
-              <w:sz w:val="22"/>
-              <w:szCs w:val="22"/>
-              <w:lang w:val="ru-RU"/>
-            </w:rPr>
-          </w:pPr>
-          <w:hyperlink w:anchor="_Toc212823959" w:history="1">
-            <w:r>
-              <w:rPr>
-                <w:rStyle w:val="Hyperlink"/>
-                <w:noProof/>
-                <w:lang w:val="ru-RU"/>
-              </w:rPr>
-              <w:t>6.</w:t>
-            </w:r>
-            <w:r>
-              <w:rPr>
-                <w:rFonts w:asciiTheme="minorHAnsi" w:eastAsiaTheme="minorEastAsia" w:hAnsiTheme="minorHAnsi" w:cstheme="minorBidi"/>
-                <w:noProof/>
-                <w:sz w:val="22"/>
-                <w:szCs w:val="22"/>
-                <w:lang w:val="ru-RU"/>
-              </w:rPr>
-              <w:tab/>
-            </w:r>
-            <w:r>
-              <w:rPr>
-                <w:rStyle w:val="Hyperlink"/>
-                <w:noProof/>
-                <w:lang w:val="ru-RU"/>
-              </w:rPr>
-              <w:t>Порядок контроля</w:t>
-            </w:r>
-            <w:r>
-              <w:rPr>
-                <w:noProof/>
-                <w:webHidden/>
-              </w:rPr>
-              <w:tab/>
-            </w:r>
-            <w:r>
-              <w:rPr>
-                <w:noProof/>
-                <w:webHidden/>
-              </w:rPr>
-              <w:fldChar w:fldCharType="begin"/>
-            </w:r>
-            <w:r>
-              <w:rPr>
-                <w:noProof/>
-                <w:webHidden/>
-              </w:rPr>
-              <w:instrText xml:space="preserve"> PAGEREF _Toc212823959 \h </w:instrText>
-            </w:r>
-            <w:r>
-              <w:rPr>
-                <w:noProof/>
-                <w:webHidden/>
-              </w:rPr>
-            </w:r>
-            <w:r>
-              <w:rPr>
-                <w:noProof/>
-                <w:webHidden/>
-              </w:rPr>
-              <w:fldChar w:fldCharType="separate"/>
-            </w:r>
-            <w:r>
-              <w:rPr>
-                <w:noProof/>
-                <w:webHidden/>
-              </w:rPr>
-              <w:t>11</w:t>
-            </w:r>
-            <w:r>
-              <w:rPr>
-                <w:noProof/>
-                <w:webHidden/>
-              </w:rPr>
-              <w:fldChar w:fldCharType="end"/>
-            </w:r>
-          </w:hyperlink>
-        </w:p>
-        <w:p>
-          <w:pPr>
-            <w:pStyle w:val="TOC2"/>
-            <w:tabs>
-              <w:tab w:val="left" w:pos="1760"/>
-              <w:tab w:val="right" w:leader="dot" w:pos="9019"/>
-            </w:tabs>
-            <w:rPr>
-              <w:rFonts w:asciiTheme="minorHAnsi" w:eastAsiaTheme="minorEastAsia" w:hAnsiTheme="minorHAnsi" w:cstheme="minorBidi"/>
-              <w:noProof/>
-              <w:sz w:val="22"/>
-              <w:szCs w:val="22"/>
-              <w:lang w:val="ru-RU"/>
-            </w:rPr>
-          </w:pPr>
-          <w:hyperlink w:anchor="_Toc212823964" w:history="1">
-            <w:r>
-              <w:rPr>
-                <w:rStyle w:val="Hyperlink"/>
-                <w:noProof/>
-              </w:rPr>
-              <w:t>6.1.</w:t>
-            </w:r>
-            <w:r>
-              <w:rPr>
-                <w:rFonts w:asciiTheme="minorHAnsi" w:eastAsiaTheme="minorEastAsia" w:hAnsiTheme="minorHAnsi" w:cstheme="minorBidi"/>
-                <w:noProof/>
-                <w:sz w:val="22"/>
-                <w:szCs w:val="22"/>
-                <w:lang w:val="ru-RU"/>
-              </w:rPr>
-              <w:tab/>
-            </w:r>
-            <w:r>
-              <w:rPr>
-                <w:rStyle w:val="Hyperlink"/>
-                <w:noProof/>
-                <w:lang w:val="ru-RU"/>
-              </w:rPr>
-              <w:t>Виды испытаний</w:t>
-            </w:r>
-            <w:r>
-              <w:rPr>
-                <w:noProof/>
-                <w:webHidden/>
-              </w:rPr>
-              <w:tab/>
-            </w:r>
-            <w:r>
-              <w:rPr>
-                <w:noProof/>
-                <w:webHidden/>
-              </w:rPr>
-              <w:fldChar w:fldCharType="begin"/>
-            </w:r>
-            <w:r>
-              <w:rPr>
-                <w:noProof/>
-                <w:webHidden/>
-              </w:rPr>
-              <w:instrText xml:space="preserve"> PAGEREF _Toc212823964 \h </w:instrText>
-            </w:r>
-            <w:r>
-              <w:rPr>
-                <w:noProof/>
-                <w:webHidden/>
-              </w:rPr>
-            </w:r>
-            <w:r>
-              <w:rPr>
-                <w:noProof/>
-                <w:webHidden/>
-              </w:rPr>
-              <w:fldChar w:fldCharType="separate"/>
-            </w:r>
-            <w:r>
-              <w:rPr>
-                <w:noProof/>
-                <w:webHidden/>
-              </w:rPr>
-              <w:t>11</w:t>
-            </w:r>
-            <w:r>
-              <w:rPr>
-                <w:noProof/>
-                <w:webHidden/>
-              </w:rPr>
-              <w:fldChar w:fldCharType="end"/>
-            </w:r>
-          </w:hyperlink>
-        </w:p>
-        <w:p>
-          <w:pPr>
-            <w:pStyle w:val="TOC1"/>
+            <w:pStyle w:val="11"/>
             <w:tabs>
               <w:tab w:val="right" w:leader="dot" w:pos="9019"/>
             </w:tabs>
             <w:rPr>
               <w:rFonts w:asciiTheme="minorHAnsi" w:eastAsiaTheme="minorEastAsia" w:hAnsiTheme="minorHAnsi" w:cstheme="minorBidi"/>
               <w:noProof/>
-              <w:sz w:val="22"/>
-              <w:szCs w:val="22"/>
+              <w:kern w:val="2"/>
+              <w:sz w:val="24"/>
+              <w:szCs w:val="24"/>
               <w:lang w:val="ru-RU"/>
+              <w14:ligatures w14:val="standardContextual"/>
             </w:rPr>
           </w:pPr>
-          <w:hyperlink w:anchor="_Toc212823965" w:history="1">
-            <w:r>
-              <w:rPr>
-                <w:rStyle w:val="Hyperlink"/>
+          <w:hyperlink w:anchor="_Toc219060716" w:history="1">
+            <w:r>
+              <w:rPr>
+                <w:rStyle w:val="ab"/>
                 <w:noProof/>
                 <w:lang w:val="ru-RU"/>
               </w:rPr>
@@ -1793,7 +1412,7 @@
             </w:r>
             <w:r>
               <w:rPr>
-                <w:rStyle w:val="Hyperlink"/>
+                <w:rStyle w:val="ab"/>
                 <w:noProof/>
               </w:rPr>
               <w:t xml:space="preserve"> ПРИЛОЖЕНИЕ 1</w:t>
@@ -1817,7 +1436,7 @@
                 <w:noProof/>
                 <w:webHidden/>
               </w:rPr>
-              <w:instrText xml:space="preserve"> PAGEREF _Toc212823965 \h </w:instrText>
+              <w:instrText xml:space="preserve"> PAGEREF _Toc219060716 \h </w:instrText>
             </w:r>
             <w:r>
               <w:rPr>
@@ -1837,7 +1456,7 @@
                 <w:noProof/>
                 <w:webHidden/>
               </w:rPr>
-              <w:t>13</w:t>
+              <w:t>14</w:t>
             </w:r>
             <w:r>
               <w:rPr>
@@ -1888,14 +1507,14 @@
     </w:p>
     <w:p>
       <w:pPr>
-        <w:pStyle w:val="Heading1"/>
+        <w:pStyle w:val="1"/>
         <w:numPr>
           <w:ilvl w:val="0"/>
           <w:numId w:val="20"/>
         </w:numPr>
         <w:ind w:left="426"/>
       </w:pPr>
-      <w:bookmarkStart w:id="0" w:name="_Toc212823943"/>
+      <w:bookmarkStart w:id="0" w:name="_Toc219060699"/>
       <w:r>
         <w:rPr>
           <w:lang w:val="ru-RU"/>
@@ -1940,7 +1559,16 @@
         <w:t xml:space="preserve"> для </w:t>
       </w:r>
       <w:r>
-        <w:t>управление учётными записи пользователей беспроводной инфраструктуры</w:t>
+        <w:t xml:space="preserve">управление учётными </w:t>
+      </w:r>
+      <w:r>
+        <w:rPr>
+          <w:lang w:val="ru-RU"/>
+        </w:rPr>
+        <w:t>данными</w:t>
+      </w:r>
+      <w:r>
+        <w:t xml:space="preserve"> пользователей беспроводной инфраструктуры</w:t>
       </w:r>
       <w:r>
         <w:rPr>
@@ -1953,225 +1581,184 @@
       </w:r>
     </w:p>
     <w:p>
-      <w:r>
-        <w:t xml:space="preserve">Целью проекта является разработка веб, который предоставляет администраторам сети факультета единую точку для мониторинга, настройки и контроля </w:t>
+      <w:pPr>
+        <w:rPr>
+          <w:lang w:val="ru-RU"/>
+        </w:rPr>
+      </w:pPr>
+      <w:r>
+        <w:t>Целью проекта является разработка веб</w:t>
+      </w:r>
+      <w:r>
+        <w:rPr>
+          <w:lang w:val="ru-RU"/>
+        </w:rPr>
+        <w:t xml:space="preserve"> интерфейса для </w:t>
+      </w:r>
+      <w:r>
+        <w:t>настройки и контроля основн</w:t>
+      </w:r>
+      <w:r>
+        <w:rPr>
+          <w:lang w:val="ru-RU"/>
+        </w:rPr>
+        <w:t xml:space="preserve">ых процессов связанных с администрированием учётных </w:t>
+      </w:r>
+      <w:r>
+        <w:rPr>
+          <w:lang w:val="ru-RU"/>
+        </w:rPr>
+        <w:t>данных</w:t>
+      </w:r>
+      <w:r>
+        <w:rPr>
+          <w:lang w:val="ru-RU"/>
+        </w:rPr>
+        <w:t xml:space="preserve"> пользователей</w:t>
+      </w:r>
+      <w:r>
+        <w:t xml:space="preserve">. </w:t>
+      </w:r>
+    </w:p>
+    <w:p>
+      <w:pPr>
+        <w:rPr>
+          <w:lang w:val="ru-RU"/>
+        </w:rPr>
+      </w:pPr>
+      <w:r>
+        <w:rPr>
+          <w:lang w:val="ru-RU"/>
+        </w:rPr>
+        <w:t>Данный проект решает проблему управления учетными записями беспроводной инфраструктуры помогая в работе неквалифицированным пользователям.</w:t>
+      </w:r>
+    </w:p>
+    <w:p>
+      <w:pPr>
+        <w:rPr>
+          <w:lang w:val="ru-RU"/>
+        </w:rPr>
+      </w:pPr>
+      <w:r>
+        <w:t>Веб-интерфейс системы должен обеспечивать аутентификацию пользователей по адресу электронной почты и паролю, а также авторизацию пользователей на выполнение регламентированных действий с учетными записями пользователей в соответствии с установленными правами доступа.</w:t>
+      </w:r>
+    </w:p>
+    <w:p>
+      <w:pPr>
+        <w:pStyle w:val="2"/>
+      </w:pPr>
+      <w:bookmarkStart w:id="1" w:name="_Toc219060700"/>
+      <w:r>
+        <w:rPr>
+          <w:lang w:val="ru-RU"/>
+        </w:rPr>
+        <w:t>1.1 З</w:t>
+      </w:r>
+      <w:r>
+        <w:t>адачи</w:t>
+      </w:r>
+      <w:r>
+        <w:t xml:space="preserve"> проекта</w:t>
+      </w:r>
+      <w:bookmarkEnd w:id="1"/>
+      <w:r>
+        <w:rPr>
+          <w:lang w:val="ru-RU"/>
+        </w:rPr>
+        <w:t xml:space="preserve"> </w:t>
+      </w:r>
+    </w:p>
+    <w:p>
+      <w:r>
+        <w:t xml:space="preserve">Первой задачей проекта является разработка единого кроссплатформенного веб-интерфейса для централизованного управления и мониторинга </w:t>
+      </w:r>
+      <w:r>
+        <w:rPr>
+          <w:lang w:val="ru-RU"/>
+        </w:rPr>
+        <w:t xml:space="preserve">учетных записей </w:t>
+      </w:r>
+      <w:r>
+        <w:rPr>
+          <w:lang w:val="ru-RU"/>
+        </w:rPr>
+        <w:t>пользователей,</w:t>
+      </w:r>
+      <w:r>
+        <w:rPr>
+          <w:lang w:val="ru-RU"/>
+        </w:rPr>
+        <w:t xml:space="preserve"> подключенных к беспроводной инфраструктуре факультета</w:t>
+      </w:r>
+      <w:r>
+        <w:t xml:space="preserve">. </w:t>
+      </w:r>
+    </w:p>
+    <w:p>
+      <w:r>
+        <w:t>Второй задачей является интеграция с Active Directory для обеспечения безопасной аутентификации пользователей и управления доступом на основе LDAP-протокола.</w:t>
+      </w:r>
+    </w:p>
+    <w:p>
+      <w:pPr>
+        <w:pStyle w:val="2"/>
+      </w:pPr>
+      <w:bookmarkStart w:id="2" w:name="_Toc219060701"/>
+      <w:r>
+        <w:rPr>
+          <w:lang w:val="ru-RU"/>
+        </w:rPr>
+        <w:t xml:space="preserve">1.2 </w:t>
+      </w:r>
+      <w:r>
+        <w:t>Термины и определения</w:t>
+      </w:r>
+      <w:bookmarkEnd w:id="2"/>
+      <w:r>
+        <w:t xml:space="preserve"> </w:t>
+      </w:r>
+    </w:p>
+    <w:p>
+      <w:r>
+        <w:t>Веб-интерфейс — это способ управления системой или устройством через веб-браузер, работающий по клиент-серверной модели, где браузер запрашивает данные, а сервер их предоставляет.</w:t>
+      </w:r>
+    </w:p>
+    <w:p>
+      <w:r>
+        <w:lastRenderedPageBreak/>
+        <w:t>Клиент-серверная архитектура — это модель взаимодействия, в которой клиент (например, веб-браузер) инициирует запросы (по протоколам HTTP/HTTPS), а сервер их обрабатывает и возвращает результат в виде веб-страниц или другой информации.</w:t>
+      </w:r>
+    </w:p>
+    <w:p>
+      <w:r>
+        <w:t>Active Directory — это реализованная Microsoft служба каталогов, предназначенная для хранения и синхронизации данных об учетных записях в рамках централизованной и защищенной базы данных.</w:t>
+      </w:r>
+    </w:p>
+    <w:p>
+      <w:r>
+        <w:t>LDAP (</w:t>
       </w:r>
       <w:proofErr w:type="spellStart"/>
       <w:r>
-        <w:t>основн</w:t>
-      </w:r>
-      <w:r>
-        <w:rPr>
-          <w:lang w:val="ru-RU"/>
-        </w:rPr>
-        <w:t>ых</w:t>
+        <w:t>Lightweight</w:t>
       </w:r>
       <w:proofErr w:type="spellEnd"/>
       <w:r>
-        <w:rPr>
-          <w:lang w:val="ru-RU"/>
-        </w:rPr>
-        <w:t xml:space="preserve"> процессов связанных с администрированием учётных запис</w:t>
-      </w:r>
-      <w:r>
-        <w:rPr>
-          <w:lang w:val="ru-RU"/>
-        </w:rPr>
-        <w:t>ей пользователей</w:t>
-      </w:r>
-      <w:r>
-        <w:t>. Интерфейс должен обеспечивать наглядное отображение состояния сети, упрощать выполнение рутинных операций.</w:t>
-      </w:r>
-    </w:p>
-    <w:p>
-      <w:r>
-        <w:t>Веб-интерфейс должен обеспечивать аутентификацию пользователей на выполнение конкретных действий с</w:t>
-      </w:r>
-      <w:r>
-        <w:rPr>
-          <w:lang w:val="ru-RU"/>
-        </w:rPr>
-        <w:t xml:space="preserve"> учетными записями пользователей</w:t>
-      </w:r>
-      <w:r>
-        <w:t>, которые будут описаны ниже.</w:t>
-      </w:r>
-    </w:p>
-    <w:p>
-      <w:pPr>
-        <w:pStyle w:val="Heading2"/>
-      </w:pPr>
-      <w:bookmarkStart w:id="1" w:name="_Toc212823944"/>
-      <w:r>
-        <w:rPr>
-          <w:lang w:val="ru-RU"/>
-        </w:rPr>
-        <w:t>1.1 З</w:t>
-      </w:r>
+        <w:t xml:space="preserve"> Directory Access Protocol) — это стандартный сетевой протокол для доступа к службам каталогов, которые представляют собой базы данных с иерархической структурой, напоминающие телефонную книгу или адресную книгу.</w:t>
+      </w:r>
+    </w:p>
+    <w:p>
       <w:proofErr w:type="spellStart"/>
       <w:r>
-        <w:t>адачи</w:t>
+        <w:t>SQLi</w:t>
       </w:r>
       <w:proofErr w:type="spellEnd"/>
       <w:r>
-        <w:t xml:space="preserve"> проекта</w:t>
-      </w:r>
-      <w:bookmarkEnd w:id="1"/>
-      <w:r>
-        <w:rPr>
-          <w:lang w:val="ru-RU"/>
-        </w:rPr>
-        <w:t xml:space="preserve"> </w:t>
-      </w:r>
-    </w:p>
-    <w:p>
-      <w:r>
-        <w:t xml:space="preserve">Первой задачей проекта является разработка единого кроссплатформенного веб-интерфейса для централизованного управления и мониторинга </w:t>
-      </w:r>
-      <w:r>
-        <w:rPr>
-          <w:lang w:val="ru-RU"/>
-        </w:rPr>
-        <w:t xml:space="preserve">учетных записей </w:t>
-      </w:r>
-      <w:proofErr w:type="gramStart"/>
-      <w:r>
-        <w:rPr>
-          <w:lang w:val="ru-RU"/>
-        </w:rPr>
-        <w:t>пользователей</w:t>
-      </w:r>
-      <w:proofErr w:type="gramEnd"/>
-      <w:r>
-        <w:rPr>
-          <w:lang w:val="ru-RU"/>
-        </w:rPr>
-        <w:t xml:space="preserve"> подключенных к беспроводной инфраструктуре факультета</w:t>
-      </w:r>
-      <w:r>
-        <w:t xml:space="preserve">. </w:t>
-      </w:r>
-    </w:p>
-    <w:p>
-      <w:r>
-        <w:t>Второй задачей является интеграция с Active Directory для обеспечения безопасной аутентификации пользователей и управления доступом на основе LDAP-протокола.</w:t>
-      </w:r>
-    </w:p>
-    <w:p>
-      <w:pPr>
-        <w:pStyle w:val="Heading2"/>
-      </w:pPr>
-      <w:bookmarkStart w:id="2" w:name="_Toc212823945"/>
-      <w:r>
-        <w:rPr>
-          <w:lang w:val="ru-RU"/>
-        </w:rPr>
-        <w:t xml:space="preserve">1.2 </w:t>
-      </w:r>
-      <w:r>
-        <w:t>Термины и определения</w:t>
-      </w:r>
-      <w:bookmarkEnd w:id="2"/>
-      <w:r>
-        <w:t xml:space="preserve"> </w:t>
-      </w:r>
-    </w:p>
-    <w:p>
-      <w:r>
-        <w:t>Веб-интерфейс — это способ управления системой или устройством через веб-браузер, работающий по клиент-серверной модели, где браузер запрашивает данные, а сервер их предоставляет.</w:t>
-      </w:r>
-    </w:p>
-    <w:p>
-      <w:r>
-        <w:t xml:space="preserve">Клиент-серверная архитектура — это модель взаимодействия, в которой клиент (например, веб-браузер) инициирует запросы (по </w:t>
-      </w:r>
-      <w:r>
-        <w:lastRenderedPageBreak/>
-        <w:t>протоколам HTTP/HTTPS), а сервер их обрабатывает и возвращает результат в виде веб-страниц или другой информации.</w:t>
-      </w:r>
-    </w:p>
-    <w:p>
-      <w:r>
-        <w:t>Active Directory — это реализованная Microsoft служба каталогов, предназначенная для хранения и синхронизации данных об учетных записях в рамках централизованной и защищенной базы данных.</w:t>
-      </w:r>
-    </w:p>
-    <w:p>
-      <w:r>
-        <w:t>LDAP (</w:t>
-      </w:r>
-      <w:proofErr w:type="spellStart"/>
-      <w:r>
-        <w:t>Lightweight</w:t>
-      </w:r>
-      <w:proofErr w:type="spellEnd"/>
-      <w:r>
-        <w:t xml:space="preserve"> Directory Access Protocol) — это стандартный сетевой протокол для доступа к службам каталогов, которые представляют собой базы данных с иерархической структурой, напоминающие телефонную книгу или адресную книгу.</w:t>
-      </w:r>
-    </w:p>
-    <w:p>
-      <w:r>
-        <w:t>OWASP Top 10 — это регулярно обновляемый список самых критических рисков безопасности веб-приложений.</w:t>
-      </w:r>
-    </w:p>
-    <w:p>
-      <w:proofErr w:type="spellStart"/>
-      <w:r>
-        <w:t>SQLi</w:t>
-      </w:r>
-      <w:proofErr w:type="spellEnd"/>
-      <w:r>
         <w:t xml:space="preserve"> — это внедрение вредоносного SQL-кода в запросы, который может привести к утечке данных или их изменению. </w:t>
       </w:r>
     </w:p>
     <w:p>
       <w:r>
-        <w:t>Cross-</w:t>
-      </w:r>
-      <w:proofErr w:type="spellStart"/>
-      <w:r>
-        <w:t>Site</w:t>
-      </w:r>
-      <w:proofErr w:type="spellEnd"/>
-      <w:r>
-        <w:t xml:space="preserve"> </w:t>
-      </w:r>
-      <w:proofErr w:type="spellStart"/>
-      <w:r>
-        <w:t>Scripting</w:t>
-      </w:r>
-      <w:proofErr w:type="spellEnd"/>
-      <w:r>
-        <w:t xml:space="preserve"> (XSS) — XSS-атаки позволяют злоумышленнику внедрить вредоносный скрипт в браузер пользователя.</w:t>
-      </w:r>
-    </w:p>
-    <w:p>
-      <w:proofErr w:type="spellStart"/>
-      <w:r>
-        <w:t>Сross-Site</w:t>
-      </w:r>
-      <w:proofErr w:type="spellEnd"/>
-      <w:r>
-        <w:t xml:space="preserve"> </w:t>
-      </w:r>
-      <w:proofErr w:type="spellStart"/>
-      <w:r>
-        <w:t>Request</w:t>
-      </w:r>
-      <w:proofErr w:type="spellEnd"/>
-      <w:r>
-        <w:t xml:space="preserve"> </w:t>
-      </w:r>
-      <w:proofErr w:type="spellStart"/>
-      <w:r>
-        <w:t>Forgery</w:t>
-      </w:r>
-      <w:proofErr w:type="spellEnd"/>
-      <w:r>
-        <w:t xml:space="preserve"> (CSRF) — CSRF заставляет браузер пользователя выполнить нежелательные действия от его имени, используя его аутентификацию.</w:t>
-      </w:r>
-    </w:p>
-    <w:p>
-      <w:r>
         <w:t>Аутентификация — это процедура проверки подлинности представленных пользователем или системой учетных данных с целью установления доверия и предоставления доступа к защищенным ресурсам.</w:t>
       </w:r>
     </w:p>
@@ -2187,7 +1774,6 @@
     </w:p>
     <w:p>
       <w:r>
-        <w:lastRenderedPageBreak/>
         <w:t>Бесшовный роуминг — это технология, позволяющая сохранять стабильное сетевое подключение и текущую сессию при перемещении пользователя между зонами покрытия разных точек доступа, не требуя повторного прохождения аутентификации.</w:t>
       </w:r>
     </w:p>
@@ -2202,7 +1788,7 @@
     </w:p>
     <w:p>
       <w:pPr>
-        <w:pStyle w:val="Heading2"/>
+        <w:pStyle w:val="2"/>
         <w:rPr>
           <w:lang w:val="en-US"/>
         </w:rPr>
@@ -2210,19 +1796,20 @@
       <w:bookmarkStart w:id="3" w:name="_am4h4jiah9d8" w:colFirst="0" w:colLast="0"/>
       <w:bookmarkEnd w:id="3"/>
       <w:r>
+        <w:lastRenderedPageBreak/>
         <w:br w:type="page"/>
       </w:r>
     </w:p>
     <w:p>
       <w:pPr>
-        <w:pStyle w:val="Heading1"/>
+        <w:pStyle w:val="1"/>
         <w:numPr>
           <w:ilvl w:val="0"/>
           <w:numId w:val="2"/>
         </w:numPr>
         <w:ind w:left="426"/>
       </w:pPr>
-      <w:bookmarkStart w:id="4" w:name="_Toc212823946"/>
+      <w:bookmarkStart w:id="4" w:name="_Toc219060702"/>
       <w:r>
         <w:lastRenderedPageBreak/>
         <w:t>Общие сведения о проектируемой системе</w:t>
@@ -2234,14 +1821,14 @@
     </w:p>
     <w:p>
       <w:pPr>
-        <w:pStyle w:val="Heading2"/>
+        <w:pStyle w:val="2"/>
         <w:numPr>
           <w:ilvl w:val="1"/>
           <w:numId w:val="2"/>
         </w:numPr>
         <w:ind w:left="709" w:hanging="360"/>
       </w:pPr>
-      <w:bookmarkStart w:id="5" w:name="_Toc212823947"/>
+      <w:bookmarkStart w:id="5" w:name="_Toc219060703"/>
       <w:r>
         <w:rPr>
           <w:lang w:val="ru-RU"/>
@@ -2289,13 +1876,13 @@
     </w:p>
     <w:p>
       <w:pPr>
-        <w:pStyle w:val="Heading2"/>
+        <w:pStyle w:val="2"/>
         <w:numPr>
           <w:ilvl w:val="1"/>
           <w:numId w:val="2"/>
         </w:numPr>
       </w:pPr>
-      <w:bookmarkStart w:id="6" w:name="_Toc212823948"/>
+      <w:bookmarkStart w:id="6" w:name="_Toc219060704"/>
       <w:r>
         <w:t>Функциональные требования</w:t>
       </w:r>
@@ -2303,21 +1890,27 @@
     </w:p>
     <w:p>
       <w:pPr>
-        <w:pStyle w:val="Heading3"/>
+        <w:pStyle w:val="3"/>
         <w:numPr>
           <w:ilvl w:val="2"/>
           <w:numId w:val="2"/>
         </w:numPr>
-      </w:pPr>
-      <w:bookmarkStart w:id="7" w:name="_Toc212823949"/>
-      <w:r>
-        <w:t>Требование</w:t>
-      </w:r>
-      <w:r>
-        <w:t xml:space="preserve"> к системе</w:t>
+        <w:rPr>
+          <w:highlight w:val="yellow"/>
+        </w:rPr>
+      </w:pPr>
+      <w:bookmarkStart w:id="7" w:name="_Toc219060705"/>
+      <w:r>
+        <w:rPr>
+          <w:highlight w:val="yellow"/>
+        </w:rPr>
+        <w:t>Требование к системе</w:t>
       </w:r>
       <w:bookmarkEnd w:id="7"/>
       <w:r>
+        <w:rPr>
+          <w:highlight w:val="yellow"/>
+        </w:rPr>
         <w:t xml:space="preserve"> </w:t>
       </w:r>
     </w:p>
@@ -2328,8 +1921,14 @@
           <w:numId w:val="3"/>
         </w:numPr>
         <w:ind w:left="1843"/>
-      </w:pPr>
-      <w:r>
+        <w:rPr>
+          <w:highlight w:val="yellow"/>
+        </w:rPr>
+      </w:pPr>
+      <w:r>
+        <w:rPr>
+          <w:highlight w:val="yellow"/>
+        </w:rPr>
         <w:t>Ролевая модель доступа, разграничивающая права между участниками учебного процесса.</w:t>
       </w:r>
     </w:p>
@@ -2340,14 +1939,20 @@
           <w:numId w:val="3"/>
         </w:numPr>
         <w:ind w:left="1843"/>
-      </w:pPr>
-      <w:r>
+        <w:rPr>
+          <w:highlight w:val="yellow"/>
+        </w:rPr>
+      </w:pPr>
+      <w:r>
+        <w:rPr>
+          <w:highlight w:val="yellow"/>
+        </w:rPr>
         <w:t>Надежное и безопасное взаимодействие с Active Directory по протоколу LDAP.</w:t>
       </w:r>
     </w:p>
     <w:p>
       <w:pPr>
-        <w:pStyle w:val="Heading3"/>
+        <w:pStyle w:val="3"/>
         <w:numPr>
           <w:ilvl w:val="2"/>
           <w:numId w:val="2"/>
@@ -2356,7 +1961,7 @@
           <w:lang w:val="ru-RU"/>
         </w:rPr>
       </w:pPr>
-      <w:bookmarkStart w:id="8" w:name="_Toc212823950"/>
+      <w:bookmarkStart w:id="8" w:name="_Toc219060706"/>
       <w:r>
         <w:t>Требования</w:t>
       </w:r>
@@ -2367,18 +1972,10 @@
       <w:r>
         <w:t xml:space="preserve"> </w:t>
       </w:r>
-      <w:bookmarkStart w:id="9" w:name="_Toc212823956"/>
-    </w:p>
-    <w:p>
-      <w:pPr>
-        <w:rPr>
-          <w:lang w:val="ru-RU"/>
-        </w:rPr>
-      </w:pPr>
-    </w:p>
-    <w:p>
-      <w:pPr>
-        <w:pStyle w:val="ListParagraph"/>
+    </w:p>
+    <w:p>
+      <w:pPr>
+        <w:pStyle w:val="a9"/>
         <w:numPr>
           <w:ilvl w:val="0"/>
           <w:numId w:val="44"/>
@@ -2390,7 +1987,6 @@
     </w:p>
     <w:p>
       <w:pPr>
-        <w:ind w:firstLine="0"/>
         <w:rPr>
           <w:lang w:val="ru-RU"/>
         </w:rPr>
@@ -2404,7 +2000,6 @@
     </w:p>
     <w:p>
       <w:pPr>
-        <w:ind w:firstLine="0"/>
         <w:rPr>
           <w:lang w:val="ru-RU"/>
         </w:rPr>
@@ -2418,7 +2013,7 @@
     </w:p>
     <w:p>
       <w:pPr>
-        <w:pStyle w:val="ListParagraph"/>
+        <w:pStyle w:val="a9"/>
         <w:numPr>
           <w:ilvl w:val="0"/>
           <w:numId w:val="44"/>
@@ -2454,47 +2049,11 @@
           <w:lang w:val="en-US"/>
         </w:rPr>
       </w:pPr>
-      <w:proofErr w:type="spellStart"/>
       <w:r>
         <w:rPr>
           <w:lang w:val="en-US"/>
         </w:rPr>
-        <w:t>Навигация</w:t>
-      </w:r>
-      <w:proofErr w:type="spellEnd"/>
-      <w:r>
-        <w:rPr>
-          <w:lang w:val="en-US"/>
-        </w:rPr>
-        <w:t xml:space="preserve"> </w:t>
-      </w:r>
-      <w:proofErr w:type="spellStart"/>
-      <w:r>
-        <w:rPr>
-          <w:lang w:val="en-US"/>
-        </w:rPr>
-        <w:t>должна</w:t>
-      </w:r>
-      <w:proofErr w:type="spellEnd"/>
-      <w:r>
-        <w:rPr>
-          <w:lang w:val="en-US"/>
-        </w:rPr>
-        <w:t xml:space="preserve"> </w:t>
-      </w:r>
-      <w:proofErr w:type="spellStart"/>
-      <w:r>
-        <w:rPr>
-          <w:lang w:val="en-US"/>
-        </w:rPr>
-        <w:t>обеспечивать</w:t>
-      </w:r>
-      <w:proofErr w:type="spellEnd"/>
-      <w:r>
-        <w:rPr>
-          <w:lang w:val="en-US"/>
-        </w:rPr>
-        <w:t>:</w:t>
+        <w:t>Навигация должна обеспечивать:</w:t>
       </w:r>
     </w:p>
     <w:p>
@@ -2524,62 +2083,11 @@
           <w:lang w:val="en-US"/>
         </w:rPr>
       </w:pPr>
-      <w:proofErr w:type="spellStart"/>
       <w:r>
         <w:rPr>
           <w:lang w:val="en-US"/>
         </w:rPr>
-        <w:lastRenderedPageBreak/>
-        <w:t>возврат</w:t>
-      </w:r>
-      <w:proofErr w:type="spellEnd"/>
-      <w:r>
-        <w:rPr>
-          <w:lang w:val="en-US"/>
-        </w:rPr>
-        <w:t xml:space="preserve"> </w:t>
-      </w:r>
-      <w:proofErr w:type="spellStart"/>
-      <w:r>
-        <w:rPr>
-          <w:lang w:val="en-US"/>
-        </w:rPr>
-        <w:t>на</w:t>
-      </w:r>
-      <w:proofErr w:type="spellEnd"/>
-      <w:r>
-        <w:rPr>
-          <w:lang w:val="en-US"/>
-        </w:rPr>
-        <w:t xml:space="preserve"> </w:t>
-      </w:r>
-      <w:proofErr w:type="spellStart"/>
-      <w:r>
-        <w:rPr>
-          <w:lang w:val="en-US"/>
-        </w:rPr>
-        <w:t>предыдущие</w:t>
-      </w:r>
-      <w:proofErr w:type="spellEnd"/>
-      <w:r>
-        <w:rPr>
-          <w:lang w:val="en-US"/>
-        </w:rPr>
-        <w:t xml:space="preserve"> </w:t>
-      </w:r>
-      <w:proofErr w:type="spellStart"/>
-      <w:r>
-        <w:rPr>
-          <w:lang w:val="en-US"/>
-        </w:rPr>
-        <w:t>экраны</w:t>
-      </w:r>
-      <w:proofErr w:type="spellEnd"/>
-      <w:r>
-        <w:rPr>
-          <w:lang w:val="en-US"/>
-        </w:rPr>
-        <w:t>;</w:t>
+        <w:t>возврат на предыдущие экраны;</w:t>
       </w:r>
     </w:p>
     <w:p>
@@ -2596,12 +2104,12 @@
         <w:rPr>
           <w:lang w:val="ru-RU"/>
         </w:rPr>
+        <w:lastRenderedPageBreak/>
         <w:t>доступ к функциональным разделам, разрешённым текущей ролью пользователя.</w:t>
       </w:r>
     </w:p>
     <w:p>
       <w:pPr>
-        <w:ind w:firstLine="0"/>
         <w:rPr>
           <w:lang w:val="ru-RU"/>
         </w:rPr>
@@ -2615,14 +2123,7 @@
     </w:p>
     <w:p>
       <w:pPr>
-        <w:rPr>
-          <w:lang w:val="ru-RU"/>
-        </w:rPr>
-      </w:pPr>
-    </w:p>
-    <w:p>
-      <w:pPr>
-        <w:pStyle w:val="ListParagraph"/>
+        <w:pStyle w:val="a9"/>
         <w:numPr>
           <w:ilvl w:val="0"/>
           <w:numId w:val="44"/>
@@ -2631,46 +2132,15 @@
           <w:lang w:val="en-US"/>
         </w:rPr>
       </w:pPr>
-      <w:proofErr w:type="spellStart"/>
       <w:r>
         <w:rPr>
           <w:lang w:val="en-US"/>
         </w:rPr>
-        <w:t>Требования</w:t>
-      </w:r>
-      <w:proofErr w:type="spellEnd"/>
-      <w:r>
-        <w:rPr>
-          <w:lang w:val="en-US"/>
-        </w:rPr>
-        <w:t xml:space="preserve"> к </w:t>
-      </w:r>
-      <w:proofErr w:type="spellStart"/>
-      <w:r>
-        <w:rPr>
-          <w:lang w:val="en-US"/>
-        </w:rPr>
-        <w:t>экранным</w:t>
-      </w:r>
-      <w:proofErr w:type="spellEnd"/>
-      <w:r>
-        <w:rPr>
-          <w:lang w:val="en-US"/>
-        </w:rPr>
-        <w:t xml:space="preserve"> </w:t>
-      </w:r>
-      <w:proofErr w:type="spellStart"/>
-      <w:r>
-        <w:rPr>
-          <w:lang w:val="en-US"/>
-        </w:rPr>
-        <w:t>формам</w:t>
-      </w:r>
-      <w:proofErr w:type="spellEnd"/>
-    </w:p>
-    <w:p>
-      <w:pPr>
-        <w:ind w:firstLine="0"/>
+        <w:t>Требования к экранным формам</w:t>
+      </w:r>
+    </w:p>
+    <w:p>
+      <w:pPr>
         <w:rPr>
           <w:lang w:val="ru-RU"/>
         </w:rPr>
@@ -2684,7 +2154,7 @@
     </w:p>
     <w:p>
       <w:pPr>
-        <w:pStyle w:val="ListParagraph"/>
+        <w:pStyle w:val="a9"/>
         <w:numPr>
           <w:ilvl w:val="0"/>
           <w:numId w:val="38"/>
@@ -2702,7 +2172,7 @@
     </w:p>
     <w:p>
       <w:pPr>
-        <w:pStyle w:val="ListParagraph"/>
+        <w:pStyle w:val="a9"/>
         <w:numPr>
           <w:ilvl w:val="0"/>
           <w:numId w:val="38"/>
@@ -2720,7 +2190,7 @@
     </w:p>
     <w:p>
       <w:pPr>
-        <w:pStyle w:val="ListParagraph"/>
+        <w:pStyle w:val="a9"/>
         <w:numPr>
           <w:ilvl w:val="0"/>
           <w:numId w:val="38"/>
@@ -2738,7 +2208,7 @@
     </w:p>
     <w:p>
       <w:pPr>
-        <w:pStyle w:val="ListParagraph"/>
+        <w:pStyle w:val="a9"/>
         <w:numPr>
           <w:ilvl w:val="0"/>
           <w:numId w:val="38"/>
@@ -2756,7 +2226,7 @@
     </w:p>
     <w:p>
       <w:pPr>
-        <w:pStyle w:val="ListParagraph"/>
+        <w:pStyle w:val="a9"/>
         <w:numPr>
           <w:ilvl w:val="0"/>
           <w:numId w:val="38"/>
@@ -2774,7 +2244,7 @@
     </w:p>
     <w:p>
       <w:pPr>
-        <w:pStyle w:val="ListParagraph"/>
+        <w:pStyle w:val="a9"/>
         <w:numPr>
           <w:ilvl w:val="0"/>
           <w:numId w:val="38"/>
@@ -2806,7 +2276,7 @@
     </w:p>
     <w:p>
       <w:pPr>
-        <w:pStyle w:val="ListParagraph"/>
+        <w:pStyle w:val="a9"/>
         <w:numPr>
           <w:ilvl w:val="0"/>
           <w:numId w:val="39"/>
@@ -2824,7 +2294,7 @@
     </w:p>
     <w:p>
       <w:pPr>
-        <w:pStyle w:val="ListParagraph"/>
+        <w:pStyle w:val="a9"/>
         <w:numPr>
           <w:ilvl w:val="0"/>
           <w:numId w:val="39"/>
@@ -2842,7 +2312,7 @@
     </w:p>
     <w:p>
       <w:pPr>
-        <w:pStyle w:val="ListParagraph"/>
+        <w:pStyle w:val="a9"/>
         <w:numPr>
           <w:ilvl w:val="0"/>
           <w:numId w:val="39"/>
@@ -2860,15 +2330,7 @@
     </w:p>
     <w:p>
       <w:pPr>
-        <w:ind w:left="360" w:firstLine="0"/>
-        <w:rPr>
-          <w:lang w:val="ru-RU"/>
-        </w:rPr>
-      </w:pPr>
-    </w:p>
-    <w:p>
-      <w:pPr>
-        <w:pStyle w:val="ListParagraph"/>
+        <w:pStyle w:val="a9"/>
         <w:numPr>
           <w:ilvl w:val="0"/>
           <w:numId w:val="44"/>
@@ -2922,7 +2384,6 @@
     </w:p>
     <w:p>
       <w:pPr>
-        <w:ind w:firstLine="0"/>
         <w:rPr>
           <w:lang w:val="ru-RU"/>
         </w:rPr>
@@ -2936,7 +2397,7 @@
     </w:p>
     <w:p>
       <w:pPr>
-        <w:pStyle w:val="ListParagraph"/>
+        <w:pStyle w:val="a9"/>
         <w:numPr>
           <w:ilvl w:val="0"/>
           <w:numId w:val="41"/>
@@ -2962,7 +2423,7 @@
     </w:p>
     <w:p>
       <w:pPr>
-        <w:pStyle w:val="ListParagraph"/>
+        <w:pStyle w:val="a9"/>
         <w:numPr>
           <w:ilvl w:val="0"/>
           <w:numId w:val="41"/>
@@ -3002,7 +2463,7 @@
     </w:p>
     <w:p>
       <w:pPr>
-        <w:pStyle w:val="ListParagraph"/>
+        <w:pStyle w:val="a9"/>
         <w:numPr>
           <w:ilvl w:val="0"/>
           <w:numId w:val="41"/>
@@ -3042,7 +2503,7 @@
     </w:p>
     <w:p>
       <w:pPr>
-        <w:pStyle w:val="ListParagraph"/>
+        <w:pStyle w:val="a9"/>
         <w:numPr>
           <w:ilvl w:val="0"/>
           <w:numId w:val="41"/>
@@ -3082,7 +2543,7 @@
     </w:p>
     <w:p>
       <w:pPr>
-        <w:pStyle w:val="ListParagraph"/>
+        <w:pStyle w:val="a9"/>
         <w:numPr>
           <w:ilvl w:val="0"/>
           <w:numId w:val="41"/>
@@ -3096,84 +2557,74 @@
         <w:rPr>
           <w:lang w:val="en-US"/>
         </w:rPr>
+        <w:t>диалоговые</w:t>
+      </w:r>
+      <w:proofErr w:type="spellEnd"/>
+      <w:r>
+        <w:rPr>
+          <w:lang w:val="en-US"/>
+        </w:rPr>
+        <w:t xml:space="preserve"> </w:t>
+      </w:r>
+      <w:proofErr w:type="spellStart"/>
+      <w:r>
+        <w:rPr>
+          <w:lang w:val="en-US"/>
+        </w:rPr>
+        <w:t>окна</w:t>
+      </w:r>
+      <w:proofErr w:type="spellEnd"/>
+      <w:r>
+        <w:rPr>
+          <w:lang w:val="en-US"/>
+        </w:rPr>
+        <w:t xml:space="preserve"> </w:t>
+      </w:r>
+      <w:proofErr w:type="spellStart"/>
+      <w:r>
+        <w:rPr>
+          <w:lang w:val="en-US"/>
+        </w:rPr>
+        <w:t>подтверждения</w:t>
+      </w:r>
+      <w:proofErr w:type="spellEnd"/>
+      <w:r>
+        <w:rPr>
+          <w:lang w:val="en-US"/>
+        </w:rPr>
+        <w:t>.</w:t>
+      </w:r>
+    </w:p>
+    <w:p>
+      <w:pPr>
+        <w:rPr>
+          <w:lang w:val="ru-RU"/>
+        </w:rPr>
+      </w:pPr>
+      <w:r>
+        <w:rPr>
+          <w:lang w:val="ru-RU"/>
+        </w:rPr>
+        <w:t>Назначение элементов управления должно быть однозначным и соответствовать выполняемым операциям.</w:t>
+      </w:r>
+    </w:p>
+    <w:p>
+      <w:pPr>
+        <w:rPr>
+          <w:lang w:val="ru-RU"/>
+        </w:rPr>
+      </w:pPr>
+      <w:r>
+        <w:rPr>
+          <w:lang w:val="ru-RU"/>
+        </w:rPr>
         <w:lastRenderedPageBreak/>
-        <w:t>диалоговые</w:t>
-      </w:r>
-      <w:proofErr w:type="spellEnd"/>
-      <w:r>
-        <w:rPr>
-          <w:lang w:val="en-US"/>
-        </w:rPr>
-        <w:t xml:space="preserve"> </w:t>
-      </w:r>
-      <w:proofErr w:type="spellStart"/>
-      <w:r>
-        <w:rPr>
-          <w:lang w:val="en-US"/>
-        </w:rPr>
-        <w:t>окна</w:t>
-      </w:r>
-      <w:proofErr w:type="spellEnd"/>
-      <w:r>
-        <w:rPr>
-          <w:lang w:val="en-US"/>
-        </w:rPr>
-        <w:t xml:space="preserve"> </w:t>
-      </w:r>
-      <w:proofErr w:type="spellStart"/>
-      <w:r>
-        <w:rPr>
-          <w:lang w:val="en-US"/>
-        </w:rPr>
-        <w:t>подтверждения</w:t>
-      </w:r>
-      <w:proofErr w:type="spellEnd"/>
-      <w:r>
-        <w:rPr>
-          <w:lang w:val="en-US"/>
-        </w:rPr>
-        <w:t>.</w:t>
-      </w:r>
-    </w:p>
-    <w:p>
-      <w:pPr>
-        <w:ind w:firstLine="0"/>
-        <w:rPr>
-          <w:lang w:val="ru-RU"/>
-        </w:rPr>
-      </w:pPr>
-      <w:r>
-        <w:rPr>
-          <w:lang w:val="ru-RU"/>
-        </w:rPr>
-        <w:t>Назначение элементов управления должно быть однозначным и соответствовать выполняемым операциям.</w:t>
-      </w:r>
-    </w:p>
-    <w:p>
-      <w:pPr>
-        <w:ind w:firstLine="0"/>
-        <w:rPr>
-          <w:lang w:val="ru-RU"/>
-        </w:rPr>
-      </w:pPr>
-      <w:r>
-        <w:rPr>
-          <w:lang w:val="ru-RU"/>
-        </w:rPr>
         <w:t>Элементы управления, недоступные пользователю в соответствии с его ролью, не должны отображаться в интерфейсе либо должны быть недоступны для взаимодействия.</w:t>
       </w:r>
     </w:p>
     <w:p>
       <w:pPr>
-        <w:ind w:firstLine="0"/>
-        <w:rPr>
-          <w:lang w:val="ru-RU"/>
-        </w:rPr>
-      </w:pPr>
-    </w:p>
-    <w:p>
-      <w:pPr>
-        <w:pStyle w:val="ListParagraph"/>
+        <w:pStyle w:val="a9"/>
         <w:numPr>
           <w:ilvl w:val="0"/>
           <w:numId w:val="44"/>
@@ -3216,7 +2667,7 @@
     </w:p>
     <w:p>
       <w:pPr>
-        <w:pStyle w:val="ListParagraph"/>
+        <w:pStyle w:val="a9"/>
         <w:numPr>
           <w:ilvl w:val="0"/>
           <w:numId w:val="43"/>
@@ -3234,7 +2685,7 @@
     </w:p>
     <w:p>
       <w:pPr>
-        <w:pStyle w:val="ListParagraph"/>
+        <w:pStyle w:val="a9"/>
         <w:numPr>
           <w:ilvl w:val="0"/>
           <w:numId w:val="43"/>
@@ -3252,7 +2703,7 @@
     </w:p>
     <w:p>
       <w:pPr>
-        <w:pStyle w:val="ListParagraph"/>
+        <w:pStyle w:val="a9"/>
         <w:numPr>
           <w:ilvl w:val="0"/>
           <w:numId w:val="43"/>
@@ -3284,15 +2735,7 @@
     </w:p>
     <w:p>
       <w:pPr>
-        <w:ind w:firstLine="0"/>
-        <w:rPr>
-          <w:lang w:val="ru-RU"/>
-        </w:rPr>
-      </w:pPr>
-    </w:p>
-    <w:p>
-      <w:pPr>
-        <w:pStyle w:val="ListParagraph"/>
+        <w:pStyle w:val="a9"/>
         <w:numPr>
           <w:ilvl w:val="0"/>
           <w:numId w:val="44"/>
@@ -3346,15 +2789,7 @@
     </w:p>
     <w:p>
       <w:pPr>
-        <w:ind w:firstLine="0"/>
-        <w:rPr>
-          <w:lang w:val="ru-RU"/>
-        </w:rPr>
-      </w:pPr>
-    </w:p>
-    <w:p>
-      <w:pPr>
-        <w:pStyle w:val="ListParagraph"/>
+        <w:pStyle w:val="a9"/>
         <w:numPr>
           <w:ilvl w:val="0"/>
           <w:numId w:val="44"/>
@@ -3369,11 +2804,9 @@
         </w:rPr>
         <w:t>Т</w:t>
       </w:r>
-      <w:proofErr w:type="spellStart"/>
       <w:r>
         <w:t>ребования</w:t>
       </w:r>
-      <w:proofErr w:type="spellEnd"/>
       <w:r>
         <w:t xml:space="preserve"> к удобству выполнения операций</w:t>
       </w:r>
@@ -3389,14 +2822,7 @@
         <w:rPr>
           <w:lang w:val="ru-RU"/>
         </w:rPr>
-        <w:t xml:space="preserve">Количество действий, необходимых для выполнения основных операций (создание учетной записи, удаление учетной записи, смена пароля, перенос </w:t>
-      </w:r>
-      <w:r>
-        <w:rPr>
-          <w:lang w:val="ru-RU"/>
-        </w:rPr>
-        <w:lastRenderedPageBreak/>
-        <w:t xml:space="preserve">пользователя между группами), </w:t>
+        <w:t xml:space="preserve">Количество действий, необходимых для выполнения основных операций (создание учетной записи, удаление учетной записи, смена пароля, перенос пользователя между группами), </w:t>
       </w:r>
       <w:r>
         <w:rPr>
@@ -3408,29 +2834,28 @@
     </w:p>
     <w:p>
       <w:pPr>
+        <w:rPr>
+          <w:lang w:val="ru-RU"/>
+        </w:rPr>
+      </w:pPr>
+      <w:r>
+        <w:rPr>
+          <w:lang w:val="ru-RU"/>
+        </w:rPr>
+        <w:t>Каждое действие пользователя, приводящее к изменению данных системы, должно требовать явного подтверждения либо сопровождаться уведомлением о результате выполнения.</w:t>
+      </w:r>
+    </w:p>
+    <w:p>
+      <w:pPr>
         <w:ind w:firstLine="0"/>
         <w:rPr>
           <w:lang w:val="ru-RU"/>
         </w:rPr>
       </w:pPr>
-      <w:r>
-        <w:rPr>
-          <w:lang w:val="ru-RU"/>
-        </w:rPr>
-        <w:t>Каждое действие пользователя, приводящее к изменению данных системы, должно требовать явного подтверждения либо сопровождаться уведомлением о результате выполнения.</w:t>
-      </w:r>
-    </w:p>
-    <w:p>
-      <w:pPr>
-        <w:ind w:firstLine="0"/>
-        <w:rPr>
-          <w:lang w:val="ru-RU"/>
-        </w:rPr>
-      </w:pPr>
-    </w:p>
-    <w:p>
-      <w:pPr>
-        <w:pStyle w:val="ListParagraph"/>
+    </w:p>
+    <w:p>
+      <w:pPr>
+        <w:pStyle w:val="a9"/>
         <w:numPr>
           <w:ilvl w:val="0"/>
           <w:numId w:val="44"/>
@@ -3440,12 +2865,12 @@
         </w:rPr>
       </w:pPr>
       <w:r>
+        <w:lastRenderedPageBreak/>
         <w:t>Требования к адаптации интерфейса по ролям</w:t>
       </w:r>
     </w:p>
     <w:p>
       <w:pPr>
-        <w:ind w:firstLine="0"/>
         <w:rPr>
           <w:lang w:val="ru-RU"/>
         </w:rPr>
@@ -3459,7 +2884,6 @@
     </w:p>
     <w:p>
       <w:pPr>
-        <w:ind w:firstLine="0"/>
         <w:rPr>
           <w:lang w:val="ru-RU"/>
         </w:rPr>
@@ -3473,15 +2897,7 @@
     </w:p>
     <w:p>
       <w:pPr>
-        <w:ind w:firstLine="0"/>
-        <w:rPr>
-          <w:lang w:val="ru-RU"/>
-        </w:rPr>
-      </w:pPr>
-    </w:p>
-    <w:p>
-      <w:pPr>
-        <w:pStyle w:val="ListParagraph"/>
+        <w:pStyle w:val="a9"/>
         <w:numPr>
           <w:ilvl w:val="0"/>
           <w:numId w:val="44"/>
@@ -3510,7 +2926,7 @@
     </w:p>
     <w:p>
       <w:pPr>
-        <w:pStyle w:val="ListParagraph"/>
+        <w:pStyle w:val="a9"/>
         <w:numPr>
           <w:ilvl w:val="0"/>
           <w:numId w:val="46"/>
@@ -3519,66 +2935,16 @@
           <w:lang w:val="en-US"/>
         </w:rPr>
       </w:pPr>
-      <w:proofErr w:type="spellStart"/>
       <w:r>
         <w:rPr>
           <w:lang w:val="en-US"/>
         </w:rPr>
-        <w:t>отображать</w:t>
-      </w:r>
-      <w:proofErr w:type="spellEnd"/>
-      <w:r>
-        <w:rPr>
-          <w:lang w:val="en-US"/>
-        </w:rPr>
-        <w:t xml:space="preserve"> </w:t>
-      </w:r>
-      <w:proofErr w:type="spellStart"/>
-      <w:r>
-        <w:rPr>
-          <w:lang w:val="en-US"/>
-        </w:rPr>
-        <w:t>сообщение</w:t>
-      </w:r>
-      <w:proofErr w:type="spellEnd"/>
-      <w:r>
-        <w:rPr>
-          <w:lang w:val="en-US"/>
-        </w:rPr>
-        <w:t xml:space="preserve"> </w:t>
-      </w:r>
-      <w:proofErr w:type="spellStart"/>
-      <w:r>
-        <w:rPr>
-          <w:lang w:val="en-US"/>
-        </w:rPr>
-        <w:t>об</w:t>
-      </w:r>
-      <w:proofErr w:type="spellEnd"/>
-      <w:r>
-        <w:rPr>
-          <w:lang w:val="en-US"/>
-        </w:rPr>
-        <w:t xml:space="preserve"> </w:t>
-      </w:r>
-      <w:proofErr w:type="spellStart"/>
-      <w:r>
-        <w:rPr>
-          <w:lang w:val="en-US"/>
-        </w:rPr>
-        <w:t>ошибке</w:t>
-      </w:r>
-      <w:proofErr w:type="spellEnd"/>
-      <w:r>
-        <w:rPr>
-          <w:lang w:val="en-US"/>
-        </w:rPr>
-        <w:t>;</w:t>
-      </w:r>
-    </w:p>
-    <w:p>
-      <w:pPr>
-        <w:pStyle w:val="ListParagraph"/>
+        <w:t>отображать сообщение об ошибке;</w:t>
+      </w:r>
+    </w:p>
+    <w:p>
+      <w:pPr>
+        <w:pStyle w:val="a9"/>
         <w:numPr>
           <w:ilvl w:val="0"/>
           <w:numId w:val="46"/>
@@ -3596,7 +2962,7 @@
     </w:p>
     <w:p>
       <w:pPr>
-        <w:pStyle w:val="ListParagraph"/>
+        <w:pStyle w:val="a9"/>
         <w:numPr>
           <w:ilvl w:val="0"/>
           <w:numId w:val="46"/>
@@ -3605,61 +2971,11 @@
           <w:lang w:val="en-US"/>
         </w:rPr>
       </w:pPr>
-      <w:proofErr w:type="spellStart"/>
       <w:r>
         <w:rPr>
           <w:lang w:val="en-US"/>
         </w:rPr>
-        <w:t>сохранять</w:t>
-      </w:r>
-      <w:proofErr w:type="spellEnd"/>
-      <w:r>
-        <w:rPr>
-          <w:lang w:val="en-US"/>
-        </w:rPr>
-        <w:t xml:space="preserve"> </w:t>
-      </w:r>
-      <w:proofErr w:type="spellStart"/>
-      <w:r>
-        <w:rPr>
-          <w:lang w:val="en-US"/>
-        </w:rPr>
-        <w:t>целостность</w:t>
-      </w:r>
-      <w:proofErr w:type="spellEnd"/>
-      <w:r>
-        <w:rPr>
-          <w:lang w:val="en-US"/>
-        </w:rPr>
-        <w:t xml:space="preserve"> </w:t>
-      </w:r>
-      <w:proofErr w:type="spellStart"/>
-      <w:r>
-        <w:rPr>
-          <w:lang w:val="en-US"/>
-        </w:rPr>
-        <w:t>пользовательской</w:t>
-      </w:r>
-      <w:proofErr w:type="spellEnd"/>
-      <w:r>
-        <w:rPr>
-          <w:lang w:val="en-US"/>
-        </w:rPr>
-        <w:t xml:space="preserve"> </w:t>
-      </w:r>
-      <w:proofErr w:type="spellStart"/>
-      <w:r>
-        <w:rPr>
-          <w:lang w:val="en-US"/>
-        </w:rPr>
-        <w:t>сессии</w:t>
-      </w:r>
-      <w:proofErr w:type="spellEnd"/>
-      <w:r>
-        <w:rPr>
-          <w:lang w:val="en-US"/>
-        </w:rPr>
-        <w:t>.</w:t>
+        <w:t>сохранять целостность пользовательской сессии.</w:t>
       </w:r>
     </w:p>
     <w:p>
@@ -3678,15 +2994,7 @@
     </w:p>
     <w:p>
       <w:pPr>
-        <w:ind w:firstLine="0"/>
-        <w:rPr>
-          <w:lang w:val="ru-RU"/>
-        </w:rPr>
-      </w:pPr>
-    </w:p>
-    <w:p>
-      <w:pPr>
-        <w:pStyle w:val="ListParagraph"/>
+        <w:pStyle w:val="a9"/>
         <w:numPr>
           <w:ilvl w:val="0"/>
           <w:numId w:val="44"/>
@@ -3701,7 +3009,6 @@
     </w:p>
     <w:p>
       <w:pPr>
-        <w:ind w:firstLine="0"/>
         <w:rPr>
           <w:lang w:val="ru-RU"/>
         </w:rPr>
@@ -3771,47 +3078,25 @@
     </w:p>
     <w:p>
       <w:pPr>
-        <w:ind w:firstLine="0"/>
-        <w:rPr>
-          <w:lang w:val="ru-RU"/>
-        </w:rPr>
-      </w:pPr>
-      <w:r>
-        <w:rPr>
-          <w:lang w:val="ru-RU"/>
-        </w:rPr>
-        <w:t>Интерфейс должен корректно отображаться при стандартном разрешении экрана не менее 1366×768.</w:t>
-      </w:r>
-    </w:p>
-    <w:p>
-      <w:pPr>
-        <w:ind w:firstLine="0"/>
-        <w:rPr>
-          <w:lang w:val="ru-RU"/>
-        </w:rPr>
-      </w:pPr>
-    </w:p>
-    <w:p>
-      <w:pPr>
-        <w:pStyle w:val="Heading1"/>
+        <w:pStyle w:val="1"/>
         <w:numPr>
           <w:ilvl w:val="0"/>
           <w:numId w:val="22"/>
         </w:numPr>
         <w:ind w:left="426"/>
       </w:pPr>
-      <w:r>
-        <w:rPr>
-          <w:lang w:val="ru-RU"/>
-        </w:rPr>
-        <w:lastRenderedPageBreak/>
+      <w:bookmarkStart w:id="9" w:name="_Toc219060707"/>
+      <w:r>
+        <w:rPr>
+          <w:lang w:val="ru-RU"/>
+        </w:rPr>
         <w:t>Требования к безопасности</w:t>
       </w:r>
       <w:bookmarkEnd w:id="9"/>
     </w:p>
     <w:p>
       <w:pPr>
-        <w:pStyle w:val="ListParagraph"/>
+        <w:pStyle w:val="a9"/>
         <w:numPr>
           <w:ilvl w:val="0"/>
           <w:numId w:val="19"/>
@@ -3843,24 +3128,18 @@
         <w:ind w:left="1843"/>
       </w:pPr>
       <w:r>
-        <w:t>Шифрование критической конфигурации</w:t>
-      </w:r>
-    </w:p>
-    <w:p>
-      <w:pPr>
-        <w:numPr>
-          <w:ilvl w:val="0"/>
-          <w:numId w:val="9"/>
-        </w:numPr>
-        <w:ind w:left="1843"/>
-      </w:pPr>
-      <w:r>
-        <w:t>Запрет на раскрытие системной информации в ошибках</w:t>
-      </w:r>
-    </w:p>
-    <w:p>
-      <w:pPr>
-        <w:pStyle w:val="ListParagraph"/>
+        <w:t xml:space="preserve">Шифрование критической </w:t>
+      </w:r>
+      <w:r>
+        <w:rPr>
+          <w:lang w:val="ru-RU"/>
+        </w:rPr>
+        <w:t>информации</w:t>
+      </w:r>
+    </w:p>
+    <w:p>
+      <w:pPr>
+        <w:pStyle w:val="a9"/>
         <w:numPr>
           <w:ilvl w:val="0"/>
           <w:numId w:val="19"/>
@@ -3880,15 +3159,7 @@
         <w:ind w:left="1843"/>
       </w:pPr>
       <w:r>
-        <w:t>Защита от OWASP Top 10 (</w:t>
-      </w:r>
-      <w:proofErr w:type="spellStart"/>
-      <w:r>
-        <w:t>SQLi</w:t>
-      </w:r>
-      <w:proofErr w:type="spellEnd"/>
-      <w:r>
-        <w:t>, XSS, CSRF)</w:t>
+        <w:t>Валидация и очистка всех входных данных</w:t>
       </w:r>
     </w:p>
     <w:p>
@@ -3900,36 +3171,18 @@
         <w:ind w:left="1843"/>
       </w:pPr>
       <w:r>
-        <w:t>Валидация и очистка всех входных данных</w:t>
-      </w:r>
-    </w:p>
-    <w:p>
-      <w:pPr>
-        <w:numPr>
-          <w:ilvl w:val="0"/>
-          <w:numId w:val="1"/>
-        </w:numPr>
-        <w:ind w:left="1843"/>
-      </w:pPr>
-      <w:r>
-        <w:t>Безопасные методы работы с API</w:t>
-      </w:r>
-    </w:p>
-    <w:p>
-      <w:pPr>
-        <w:numPr>
-          <w:ilvl w:val="0"/>
-          <w:numId w:val="1"/>
-        </w:numPr>
-        <w:ind w:left="1843"/>
-      </w:pPr>
-      <w:r>
         <w:t>Подобие двухфакторной аутентификации через почту</w:t>
       </w:r>
-    </w:p>
-    <w:p>
-      <w:pPr>
-        <w:pStyle w:val="ListParagraph"/>
+      <w:r>
+        <w:rPr>
+          <w:lang w:val="ru-RU"/>
+        </w:rPr>
+        <w:t>. В процессе аутентификации пользователю необходимо указать код, который приходит на почту, связанную с данным аккаунтом, тем самым подтвердив свою личность.</w:t>
+      </w:r>
+    </w:p>
+    <w:p>
+      <w:pPr>
+        <w:pStyle w:val="a9"/>
         <w:numPr>
           <w:ilvl w:val="0"/>
           <w:numId w:val="19"/>
@@ -3961,6 +3214,7 @@
         <w:ind w:left="1843"/>
       </w:pPr>
       <w:r>
+        <w:lastRenderedPageBreak/>
         <w:t xml:space="preserve">Минимальные привилегии для рядового пользователя </w:t>
       </w:r>
     </w:p>
@@ -3981,14 +3235,14 @@
     </w:p>
     <w:p>
       <w:pPr>
-        <w:pStyle w:val="Heading1"/>
+        <w:pStyle w:val="1"/>
         <w:numPr>
           <w:ilvl w:val="0"/>
           <w:numId w:val="22"/>
         </w:numPr>
         <w:ind w:left="426"/>
       </w:pPr>
-      <w:bookmarkStart w:id="10" w:name="_Toc212823957"/>
+      <w:bookmarkStart w:id="10" w:name="_Toc219060708"/>
       <w:r>
         <w:rPr>
           <w:lang w:val="ru-RU"/>
@@ -4000,7 +3254,7 @@
     </w:p>
     <w:p>
       <w:pPr>
-        <w:pStyle w:val="ListParagraph"/>
+        <w:pStyle w:val="a9"/>
         <w:numPr>
           <w:ilvl w:val="1"/>
           <w:numId w:val="19"/>
@@ -4018,7 +3272,7 @@
     </w:p>
     <w:p>
       <w:pPr>
-        <w:pStyle w:val="ListParagraph"/>
+        <w:pStyle w:val="a9"/>
         <w:numPr>
           <w:ilvl w:val="1"/>
           <w:numId w:val="31"/>
@@ -4030,7 +3284,7 @@
     </w:p>
     <w:p>
       <w:pPr>
-        <w:pStyle w:val="ListParagraph"/>
+        <w:pStyle w:val="a9"/>
         <w:numPr>
           <w:ilvl w:val="1"/>
           <w:numId w:val="31"/>
@@ -4052,14 +3306,14 @@
     </w:p>
     <w:p>
       <w:pPr>
-        <w:pStyle w:val="Heading1"/>
+        <w:pStyle w:val="1"/>
         <w:numPr>
           <w:ilvl w:val="0"/>
           <w:numId w:val="24"/>
         </w:numPr>
         <w:ind w:left="426"/>
       </w:pPr>
-      <w:bookmarkStart w:id="11" w:name="_Toc212823958"/>
+      <w:bookmarkStart w:id="11" w:name="_Toc219060709"/>
       <w:r>
         <w:rPr>
           <w:lang w:val="ru-RU"/>
@@ -4069,16 +3323,26 @@
       <w:bookmarkEnd w:id="11"/>
     </w:p>
     <w:p>
-      <w:r>
-        <w:t>Разработка должна быть выполнена в несколько стадий:</w:t>
-      </w:r>
-    </w:p>
-    <w:p>
-      <w:pPr>
-        <w:numPr>
-          <w:ilvl w:val="1"/>
-          <w:numId w:val="25"/>
-        </w:numPr>
+      <w:pPr>
+        <w:rPr>
+          <w:lang w:val="ru-RU"/>
+        </w:rPr>
+      </w:pPr>
+      <w:r>
+        <w:t>Разработка должна быть выполнена в несколько стадий</w:t>
+      </w:r>
+      <w:r>
+        <w:rPr>
+          <w:lang w:val="ru-RU"/>
+        </w:rPr>
+        <w:t>.</w:t>
+      </w:r>
+    </w:p>
+    <w:p>
+      <w:pPr>
+        <w:rPr>
+          <w:lang w:val="ru-RU"/>
+        </w:rPr>
       </w:pPr>
       <w:r>
         <w:t>Стадия 1 - Проектирование: Сбор и анализ требований, проектирование пользовательского интерфейса</w:t>
@@ -4096,158 +3360,115 @@
         <w:rPr>
           <w:lang w:val="ru-RU"/>
         </w:rPr>
-        <w:t xml:space="preserve"> (создание </w:t>
+        <w:t xml:space="preserve"> (создание мокапов и юзерфлоу для каждого типа пользователей)</w:t>
+      </w:r>
+      <w:r>
+        <w:t xml:space="preserve"> и технической архитектуры системы.</w:t>
+      </w:r>
+      <w:r>
+        <w:rPr>
+          <w:lang w:val="ru-RU"/>
+        </w:rPr>
+        <w:t xml:space="preserve"> </w:t>
+      </w:r>
+      <w:r>
+        <w:rPr>
+          <w:lang w:val="ru-RU"/>
+        </w:rPr>
+        <w:t>Также необходимо создать проект, в котором требуется определить базовый принцип определения роли пользователя для дальнейшей работы</w:t>
+      </w:r>
+      <w:r>
+        <w:rPr>
+          <w:lang w:val="ru-RU"/>
+        </w:rPr>
+        <w:t>.</w:t>
+      </w:r>
+    </w:p>
+    <w:p>
+      <w:pPr>
+        <w:rPr>
+          <w:lang w:val="ru-RU"/>
+        </w:rPr>
+      </w:pPr>
+      <w:r>
+        <w:t xml:space="preserve">Стадия 2 - Разработка: Непосредственное создание фронтенда и бэкенда компонентов, а также их интеграция между собой и с сетевым </w:t>
+      </w:r>
+      <w:r>
+        <w:lastRenderedPageBreak/>
+        <w:t>оборудованием.</w:t>
+      </w:r>
+      <w:r>
+        <w:rPr>
+          <w:lang w:val="ru-RU"/>
+        </w:rPr>
+        <w:t xml:space="preserve"> Первым этапом на данной стадии станет написание </w:t>
+      </w:r>
+      <w:r>
+        <w:rPr>
+          <w:lang w:val="en-US"/>
+        </w:rPr>
+        <w:t>frontend</w:t>
+      </w:r>
+      <w:r>
+        <w:rPr>
+          <w:lang w:val="ru-RU"/>
+        </w:rPr>
+        <w:t xml:space="preserve"> части приложения в соответствии с </w:t>
       </w:r>
       <w:proofErr w:type="spellStart"/>
       <w:r>
         <w:rPr>
           <w:lang w:val="ru-RU"/>
         </w:rPr>
-        <w:t>мокапов</w:t>
+        <w:t>мокапами</w:t>
       </w:r>
       <w:proofErr w:type="spellEnd"/>
       <w:r>
         <w:rPr>
           <w:lang w:val="ru-RU"/>
         </w:rPr>
-        <w:t xml:space="preserve"> и </w:t>
+        <w:t xml:space="preserve"> и юзерфлоу, которые были созданы во время стадии проектирования. Итогом работы на данной стадии станет полностью готовый макет приложения со всем </w:t>
+      </w:r>
+      <w:r>
+        <w:rPr>
+          <w:lang w:val="ru-RU"/>
+        </w:rPr>
+        <w:t>оконными (страничными) переходами.</w:t>
+      </w:r>
+      <w:r>
+        <w:rPr>
+          <w:lang w:val="ru-RU"/>
+        </w:rPr>
+        <w:t xml:space="preserve"> Вторым шагом станет добавление функциональности к уже приготовленным пустышкам</w:t>
+      </w:r>
+    </w:p>
+    <w:p>
+      <w:pPr>
+        <w:rPr>
+          <w:lang w:val="ru-RU"/>
+        </w:rPr>
+      </w:pPr>
+      <w:r>
+        <w:t>Стадия 3 - Тестирование: Всесторонняя проверка системы, включая функциональное тестирование, оценку удобства использования (</w:t>
       </w:r>
       <w:proofErr w:type="spellStart"/>
       <w:r>
-        <w:rPr>
-          <w:lang w:val="ru-RU"/>
-        </w:rPr>
-        <w:t>юзерфлоу</w:t>
+        <w:t>usability</w:t>
       </w:r>
       <w:proofErr w:type="spellEnd"/>
       <w:r>
-        <w:rPr>
-          <w:lang w:val="ru-RU"/>
-        </w:rPr>
-        <w:t xml:space="preserve"> для каждого типа пользователей)</w:t>
-      </w:r>
-      <w:r>
-        <w:t xml:space="preserve"> и технической архитектуры системы.</w:t>
-      </w:r>
-      <w:r>
-        <w:rPr>
-          <w:lang w:val="ru-RU"/>
-        </w:rPr>
-        <w:t xml:space="preserve"> </w:t>
-      </w:r>
-      <w:r>
-        <w:rPr>
-          <w:lang w:val="ru-RU"/>
-        </w:rPr>
-        <w:t xml:space="preserve">Также необходимо создать проект, в котором требуется определить базовый принцип определения роли пользователя для дальнейшей работы </w:t>
-      </w:r>
-    </w:p>
-    <w:p>
-      <w:pPr>
-        <w:numPr>
-          <w:ilvl w:val="1"/>
-          <w:numId w:val="25"/>
-        </w:numPr>
-      </w:pPr>
-      <w:r>
-        <w:lastRenderedPageBreak/>
-        <w:t xml:space="preserve">Стадия 2 - Разработка: Непосредственное создание </w:t>
-      </w:r>
-      <w:proofErr w:type="spellStart"/>
-      <w:r>
-        <w:t>фронтенда</w:t>
-      </w:r>
-      <w:proofErr w:type="spellEnd"/>
-      <w:r>
-        <w:t xml:space="preserve"> и бэкенда компонентов, а также их интеграция между собой и с сетевым оборудованием.</w:t>
-      </w:r>
-      <w:r>
-        <w:rPr>
-          <w:lang w:val="ru-RU"/>
-        </w:rPr>
-        <w:t xml:space="preserve"> Первым этапом на данной стадии станет написание </w:t>
+        <w:t>) и тестирование безопасности.</w:t>
+      </w:r>
+      <w:r>
+        <w:rPr>
+          <w:lang w:val="ru-RU"/>
+        </w:rPr>
+        <w:t xml:space="preserve"> Написание тестовых сценариев с помощью библиотеки </w:t>
       </w:r>
       <w:r>
         <w:rPr>
           <w:lang w:val="en-US"/>
         </w:rPr>
-        <w:t>frontend</w:t>
-      </w:r>
-      <w:r>
-        <w:rPr>
-          <w:lang w:val="ru-RU"/>
-        </w:rPr>
-        <w:t xml:space="preserve"> части приложения в соответствии с </w:t>
-      </w:r>
-      <w:proofErr w:type="spellStart"/>
-      <w:r>
-        <w:rPr>
-          <w:lang w:val="ru-RU"/>
-        </w:rPr>
-        <w:t>мокапами</w:t>
-      </w:r>
-      <w:proofErr w:type="spellEnd"/>
-      <w:r>
-        <w:rPr>
-          <w:lang w:val="ru-RU"/>
-        </w:rPr>
-        <w:t xml:space="preserve"> и </w:t>
-      </w:r>
-      <w:proofErr w:type="spellStart"/>
-      <w:r>
-        <w:rPr>
-          <w:lang w:val="ru-RU"/>
-        </w:rPr>
-        <w:t>юзерфлоу</w:t>
-      </w:r>
-      <w:proofErr w:type="spellEnd"/>
-      <w:r>
-        <w:rPr>
-          <w:lang w:val="ru-RU"/>
-        </w:rPr>
-        <w:t xml:space="preserve">, которые были созданы во время стадии проектирования. Итогом работы на данной стадии станет полностью готовый макет приложения со всем </w:t>
-      </w:r>
-      <w:r>
-        <w:rPr>
-          <w:lang w:val="ru-RU"/>
-        </w:rPr>
-        <w:t>оконными (страничными) переходами.</w:t>
-      </w:r>
-      <w:r>
-        <w:rPr>
-          <w:lang w:val="ru-RU"/>
-        </w:rPr>
-        <w:t xml:space="preserve"> Вторым шагом станет добавление функциональности к уже приготовленным пустышкам</w:t>
-      </w:r>
-    </w:p>
-    <w:p>
-      <w:pPr>
-        <w:numPr>
-          <w:ilvl w:val="1"/>
-          <w:numId w:val="25"/>
-        </w:numPr>
-      </w:pPr>
-      <w:r>
-        <w:t>Стадия 3 - Тестирование: Всесторонняя проверка системы, включая функциональное тестирование, оценку удобства использования (</w:t>
-      </w:r>
-      <w:proofErr w:type="spellStart"/>
-      <w:r>
-        <w:t>usability</w:t>
-      </w:r>
-      <w:proofErr w:type="spellEnd"/>
-      <w:r>
-        <w:t>) и тестирование безопасности.</w:t>
-      </w:r>
-      <w:r>
-        <w:rPr>
-          <w:lang w:val="ru-RU"/>
-        </w:rPr>
-        <w:t xml:space="preserve"> Написание тестовых сценариев с помощью библиотеки </w:t>
-      </w:r>
-      <w:r>
-        <w:rPr>
-          <w:lang w:val="en-US"/>
-        </w:rPr>
         <w:t>Selenium</w:t>
       </w:r>
       <w:r>
@@ -4258,12 +3479,6 @@
       </w:r>
     </w:p>
     <w:p>
-      <w:pPr>
-        <w:numPr>
-          <w:ilvl w:val="1"/>
-          <w:numId w:val="25"/>
-        </w:numPr>
-      </w:pPr>
       <w:r>
         <w:t>Стадия 4 - Внедрение и сдача: Развертывание системы на рабочей инфраструктуре, окончательная подготовка документации</w:t>
       </w:r>
@@ -4276,7 +3491,7 @@
     </w:p>
     <w:p>
       <w:pPr>
-        <w:pStyle w:val="Heading1"/>
+        <w:pStyle w:val="1"/>
         <w:numPr>
           <w:ilvl w:val="0"/>
           <w:numId w:val="24"/>
@@ -4286,7 +3501,7 @@
           <w:lang w:val="ru-RU"/>
         </w:rPr>
       </w:pPr>
-      <w:bookmarkStart w:id="12" w:name="_Toc212823959"/>
+      <w:bookmarkStart w:id="12" w:name="_Toc219060710"/>
       <w:r>
         <w:rPr>
           <w:lang w:val="ru-RU"/>
@@ -4297,7 +3512,7 @@
     </w:p>
     <w:p>
       <w:pPr>
-        <w:pStyle w:val="ListParagraph"/>
+        <w:pStyle w:val="a9"/>
         <w:keepNext/>
         <w:keepLines/>
         <w:numPr>
@@ -4318,15 +3533,23 @@
       <w:bookmarkStart w:id="15" w:name="_Toc212454340"/>
       <w:bookmarkStart w:id="16" w:name="_Toc212660939"/>
       <w:bookmarkStart w:id="17" w:name="_Toc212823960"/>
+      <w:bookmarkStart w:id="18" w:name="_Toc219058160"/>
+      <w:bookmarkStart w:id="19" w:name="_Toc219058178"/>
+      <w:bookmarkStart w:id="20" w:name="_Toc219058348"/>
+      <w:bookmarkStart w:id="21" w:name="_Toc219060711"/>
       <w:bookmarkEnd w:id="13"/>
       <w:bookmarkEnd w:id="14"/>
       <w:bookmarkEnd w:id="15"/>
       <w:bookmarkEnd w:id="16"/>
       <w:bookmarkEnd w:id="17"/>
-    </w:p>
-    <w:p>
-      <w:pPr>
-        <w:pStyle w:val="ListParagraph"/>
+      <w:bookmarkEnd w:id="18"/>
+      <w:bookmarkEnd w:id="19"/>
+      <w:bookmarkEnd w:id="20"/>
+      <w:bookmarkEnd w:id="21"/>
+    </w:p>
+    <w:p>
+      <w:pPr>
+        <w:pStyle w:val="a9"/>
         <w:keepNext/>
         <w:keepLines/>
         <w:numPr>
@@ -4342,20 +3565,28 @@
           <w:lang w:val="ru-RU"/>
         </w:rPr>
       </w:pPr>
-      <w:bookmarkStart w:id="18" w:name="_Toc212454223"/>
-      <w:bookmarkStart w:id="19" w:name="_Toc212454247"/>
-      <w:bookmarkStart w:id="20" w:name="_Toc212454341"/>
-      <w:bookmarkStart w:id="21" w:name="_Toc212660940"/>
-      <w:bookmarkStart w:id="22" w:name="_Toc212823961"/>
-      <w:bookmarkEnd w:id="18"/>
-      <w:bookmarkEnd w:id="19"/>
-      <w:bookmarkEnd w:id="20"/>
-      <w:bookmarkEnd w:id="21"/>
+      <w:bookmarkStart w:id="22" w:name="_Toc212454223"/>
+      <w:bookmarkStart w:id="23" w:name="_Toc212454247"/>
+      <w:bookmarkStart w:id="24" w:name="_Toc212454341"/>
+      <w:bookmarkStart w:id="25" w:name="_Toc212660940"/>
+      <w:bookmarkStart w:id="26" w:name="_Toc212823961"/>
+      <w:bookmarkStart w:id="27" w:name="_Toc219058161"/>
+      <w:bookmarkStart w:id="28" w:name="_Toc219058179"/>
+      <w:bookmarkStart w:id="29" w:name="_Toc219058349"/>
+      <w:bookmarkStart w:id="30" w:name="_Toc219060712"/>
       <w:bookmarkEnd w:id="22"/>
-    </w:p>
-    <w:p>
-      <w:pPr>
-        <w:pStyle w:val="ListParagraph"/>
+      <w:bookmarkEnd w:id="23"/>
+      <w:bookmarkEnd w:id="24"/>
+      <w:bookmarkEnd w:id="25"/>
+      <w:bookmarkEnd w:id="26"/>
+      <w:bookmarkEnd w:id="27"/>
+      <w:bookmarkEnd w:id="28"/>
+      <w:bookmarkEnd w:id="29"/>
+      <w:bookmarkEnd w:id="30"/>
+    </w:p>
+    <w:p>
+      <w:pPr>
+        <w:pStyle w:val="a9"/>
         <w:keepNext/>
         <w:keepLines/>
         <w:numPr>
@@ -4371,20 +3602,28 @@
           <w:lang w:val="ru-RU"/>
         </w:rPr>
       </w:pPr>
-      <w:bookmarkStart w:id="23" w:name="_Toc212454224"/>
-      <w:bookmarkStart w:id="24" w:name="_Toc212454248"/>
-      <w:bookmarkStart w:id="25" w:name="_Toc212454342"/>
-      <w:bookmarkStart w:id="26" w:name="_Toc212660941"/>
-      <w:bookmarkStart w:id="27" w:name="_Toc212823962"/>
-      <w:bookmarkEnd w:id="23"/>
-      <w:bookmarkEnd w:id="24"/>
-      <w:bookmarkEnd w:id="25"/>
-      <w:bookmarkEnd w:id="26"/>
-      <w:bookmarkEnd w:id="27"/>
-    </w:p>
-    <w:p>
-      <w:pPr>
-        <w:pStyle w:val="ListParagraph"/>
+      <w:bookmarkStart w:id="31" w:name="_Toc212454224"/>
+      <w:bookmarkStart w:id="32" w:name="_Toc212454248"/>
+      <w:bookmarkStart w:id="33" w:name="_Toc212454342"/>
+      <w:bookmarkStart w:id="34" w:name="_Toc212660941"/>
+      <w:bookmarkStart w:id="35" w:name="_Toc212823962"/>
+      <w:bookmarkStart w:id="36" w:name="_Toc219058162"/>
+      <w:bookmarkStart w:id="37" w:name="_Toc219058180"/>
+      <w:bookmarkStart w:id="38" w:name="_Toc219058350"/>
+      <w:bookmarkStart w:id="39" w:name="_Toc219060713"/>
+      <w:bookmarkEnd w:id="31"/>
+      <w:bookmarkEnd w:id="32"/>
+      <w:bookmarkEnd w:id="33"/>
+      <w:bookmarkEnd w:id="34"/>
+      <w:bookmarkEnd w:id="35"/>
+      <w:bookmarkEnd w:id="36"/>
+      <w:bookmarkEnd w:id="37"/>
+      <w:bookmarkEnd w:id="38"/>
+      <w:bookmarkEnd w:id="39"/>
+    </w:p>
+    <w:p>
+      <w:pPr>
+        <w:pStyle w:val="a9"/>
         <w:keepNext/>
         <w:keepLines/>
         <w:numPr>
@@ -4400,37 +3639,45 @@
           <w:lang w:val="ru-RU"/>
         </w:rPr>
       </w:pPr>
-      <w:bookmarkStart w:id="28" w:name="_Toc212454225"/>
-      <w:bookmarkStart w:id="29" w:name="_Toc212454249"/>
-      <w:bookmarkStart w:id="30" w:name="_Toc212454343"/>
-      <w:bookmarkStart w:id="31" w:name="_Toc212660942"/>
-      <w:bookmarkStart w:id="32" w:name="_Toc212823963"/>
-      <w:bookmarkEnd w:id="28"/>
-      <w:bookmarkEnd w:id="29"/>
-      <w:bookmarkEnd w:id="30"/>
-      <w:bookmarkEnd w:id="31"/>
-      <w:bookmarkEnd w:id="32"/>
-    </w:p>
-    <w:p>
-      <w:pPr>
-        <w:pStyle w:val="Heading2"/>
+      <w:bookmarkStart w:id="40" w:name="_Toc212454225"/>
+      <w:bookmarkStart w:id="41" w:name="_Toc212454249"/>
+      <w:bookmarkStart w:id="42" w:name="_Toc212454343"/>
+      <w:bookmarkStart w:id="43" w:name="_Toc212660942"/>
+      <w:bookmarkStart w:id="44" w:name="_Toc212823963"/>
+      <w:bookmarkStart w:id="45" w:name="_Toc219058163"/>
+      <w:bookmarkStart w:id="46" w:name="_Toc219058181"/>
+      <w:bookmarkStart w:id="47" w:name="_Toc219058351"/>
+      <w:bookmarkStart w:id="48" w:name="_Toc219060714"/>
+      <w:bookmarkEnd w:id="40"/>
+      <w:bookmarkEnd w:id="41"/>
+      <w:bookmarkEnd w:id="42"/>
+      <w:bookmarkEnd w:id="43"/>
+      <w:bookmarkEnd w:id="44"/>
+      <w:bookmarkEnd w:id="45"/>
+      <w:bookmarkEnd w:id="46"/>
+      <w:bookmarkEnd w:id="47"/>
+      <w:bookmarkEnd w:id="48"/>
+    </w:p>
+    <w:p>
+      <w:pPr>
+        <w:pStyle w:val="2"/>
         <w:numPr>
           <w:ilvl w:val="1"/>
           <w:numId w:val="2"/>
         </w:numPr>
       </w:pPr>
-      <w:bookmarkStart w:id="33" w:name="_Toc212823964"/>
+      <w:bookmarkStart w:id="49" w:name="_Toc219060715"/>
       <w:r>
         <w:rPr>
           <w:lang w:val="ru-RU"/>
         </w:rPr>
         <w:t>Виды испытаний</w:t>
       </w:r>
-      <w:bookmarkEnd w:id="33"/>
-    </w:p>
-    <w:p>
-      <w:pPr>
-        <w:pStyle w:val="ListParagraph"/>
+      <w:bookmarkEnd w:id="49"/>
+    </w:p>
+    <w:p>
+      <w:pPr>
+        <w:pStyle w:val="a9"/>
         <w:numPr>
           <w:ilvl w:val="1"/>
           <w:numId w:val="28"/>
@@ -4442,7 +3689,7 @@
     </w:p>
     <w:p>
       <w:pPr>
-        <w:pStyle w:val="ListParagraph"/>
+        <w:pStyle w:val="a9"/>
         <w:ind w:left="1440" w:firstLine="0"/>
       </w:pPr>
       <w:r>
@@ -4472,7 +3719,7 @@
     </w:p>
     <w:p>
       <w:pPr>
-        <w:pStyle w:val="ListParagraph"/>
+        <w:pStyle w:val="a9"/>
         <w:numPr>
           <w:ilvl w:val="1"/>
           <w:numId w:val="28"/>
@@ -4484,7 +3731,7 @@
     </w:p>
     <w:p>
       <w:pPr>
-        <w:pStyle w:val="ListParagraph"/>
+        <w:pStyle w:val="a9"/>
         <w:ind w:left="1440" w:firstLine="0"/>
       </w:pPr>
       <w:r>
@@ -4514,7 +3761,7 @@
     </w:p>
     <w:p>
       <w:pPr>
-        <w:pStyle w:val="ListParagraph"/>
+        <w:pStyle w:val="a9"/>
         <w:numPr>
           <w:ilvl w:val="1"/>
           <w:numId w:val="28"/>
@@ -4529,7 +3776,7 @@
     </w:p>
     <w:p>
       <w:pPr>
-        <w:pStyle w:val="ListParagraph"/>
+        <w:pStyle w:val="a9"/>
         <w:ind w:left="1440" w:firstLine="0"/>
         <w:rPr>
           <w:lang w:val="ru-RU"/>
@@ -4539,7 +3786,6 @@
         <w:rPr>
           <w:lang w:val="ru-RU"/>
         </w:rPr>
-        <w:lastRenderedPageBreak/>
         <w:tab/>
       </w:r>
       <w:r>
@@ -4548,19 +3794,25 @@
     </w:p>
     <w:p>
       <w:pPr>
-        <w:pStyle w:val="ListParagraph"/>
+        <w:pStyle w:val="a9"/>
         <w:numPr>
           <w:ilvl w:val="1"/>
           <w:numId w:val="28"/>
         </w:numPr>
       </w:pPr>
       <w:r>
-        <w:t>Тестирование основного функционала веб-интерфейса управления;</w:t>
-      </w:r>
-    </w:p>
-    <w:p>
-      <w:pPr>
-        <w:pStyle w:val="ListParagraph"/>
+        <w:t>Тестирование основного функционала веб-интерфейса</w:t>
+      </w:r>
+      <w:r>
+        <w:rPr>
+          <w:lang w:val="ru-RU"/>
+        </w:rPr>
+        <w:t>:</w:t>
+      </w:r>
+    </w:p>
+    <w:p>
+      <w:pPr>
+        <w:pStyle w:val="a9"/>
         <w:numPr>
           <w:ilvl w:val="0"/>
           <w:numId w:val="29"/>
@@ -4572,7 +3824,7 @@
     </w:p>
     <w:p>
       <w:pPr>
-        <w:pStyle w:val="ListParagraph"/>
+        <w:pStyle w:val="a9"/>
         <w:numPr>
           <w:ilvl w:val="0"/>
           <w:numId w:val="29"/>
@@ -4584,7 +3836,7 @@
     </w:p>
     <w:p>
       <w:pPr>
-        <w:pStyle w:val="ListParagraph"/>
+        <w:pStyle w:val="a9"/>
         <w:numPr>
           <w:ilvl w:val="0"/>
           <w:numId w:val="29"/>
@@ -4596,19 +3848,26 @@
     </w:p>
     <w:p>
       <w:pPr>
-        <w:pStyle w:val="ListParagraph"/>
+        <w:pStyle w:val="a9"/>
         <w:numPr>
           <w:ilvl w:val="1"/>
           <w:numId w:val="28"/>
         </w:numPr>
       </w:pPr>
       <w:r>
-        <w:t>Тестирование дополнительного функционала веб-интерфейса управления;</w:t>
-      </w:r>
-    </w:p>
-    <w:p>
-      <w:pPr>
-        <w:pStyle w:val="ListParagraph"/>
+        <w:lastRenderedPageBreak/>
+        <w:t>Тестирование дополнительного функционала веб-интерфейса</w:t>
+      </w:r>
+      <w:r>
+        <w:rPr>
+          <w:lang w:val="ru-RU"/>
+        </w:rPr>
+        <w:t>:</w:t>
+      </w:r>
+    </w:p>
+    <w:p>
+      <w:pPr>
+        <w:pStyle w:val="a9"/>
         <w:numPr>
           <w:ilvl w:val="0"/>
           <w:numId w:val="30"/>
@@ -4642,7 +3901,7 @@
     </w:p>
     <w:p>
       <w:pPr>
-        <w:pStyle w:val="ListParagraph"/>
+        <w:pStyle w:val="a9"/>
         <w:numPr>
           <w:ilvl w:val="0"/>
           <w:numId w:val="30"/>
@@ -4661,24 +3920,24 @@
       <w:r>
         <w:t>другую.</w:t>
       </w:r>
-      <w:bookmarkStart w:id="34" w:name="_4k8p14r4rhg4" w:colFirst="0" w:colLast="0"/>
-      <w:bookmarkStart w:id="35" w:name="_u2r0xmnzw78s" w:colFirst="0" w:colLast="0"/>
-      <w:bookmarkEnd w:id="34"/>
-      <w:bookmarkEnd w:id="35"/>
+      <w:bookmarkStart w:id="50" w:name="_4k8p14r4rhg4" w:colFirst="0" w:colLast="0"/>
+      <w:bookmarkStart w:id="51" w:name="_u2r0xmnzw78s" w:colFirst="0" w:colLast="0"/>
+      <w:bookmarkEnd w:id="50"/>
+      <w:bookmarkEnd w:id="51"/>
       <w:r>
         <w:br w:type="page"/>
       </w:r>
     </w:p>
     <w:p>
       <w:pPr>
-        <w:pStyle w:val="Heading1"/>
+        <w:pStyle w:val="1"/>
         <w:jc w:val="center"/>
         <w:rPr>
           <w:sz w:val="36"/>
           <w:szCs w:val="36"/>
         </w:rPr>
       </w:pPr>
-      <w:bookmarkStart w:id="36" w:name="_Toc212823965"/>
+      <w:bookmarkStart w:id="52" w:name="_Toc219060716"/>
       <w:r>
         <w:rPr>
           <w:sz w:val="36"/>
@@ -4695,7 +3954,7 @@
         </w:rPr>
         <w:t xml:space="preserve"> ПРИЛОЖЕНИЕ 1</w:t>
       </w:r>
-      <w:bookmarkEnd w:id="36"/>
+      <w:bookmarkEnd w:id="52"/>
       <w:r>
         <w:rPr>
           <w:sz w:val="36"/>
@@ -4990,7 +4249,7 @@
 </file>
 
 <file path=word/endnotes.xml><?xml version="1.0" encoding="utf-8"?>
-<w:endnotes xmlns:wpc="http://schemas.microsoft.com/office/word/2010/wordprocessingCanvas" xmlns:cx="http://schemas.microsoft.com/office/drawing/2014/chartex" xmlns:cx1="http://schemas.microsoft.com/office/drawing/2015/9/8/chartex" xmlns:cx2="http://schemas.microsoft.com/office/drawing/2015/10/21/chartex" xmlns:cx3="http://schemas.microsoft.com/office/drawing/2016/5/9/chartex" xmlns:cx4="http://schemas.microsoft.com/office/drawing/2016/5/10/chartex" xmlns:cx5="http://schemas.microsoft.com/office/drawing/2016/5/11/chartex" xmlns:cx6="http://schemas.microsoft.com/office/drawing/2016/5/12/chartex" xmlns:cx7="http://schemas.microsoft.com/office/drawing/2016/5/13/chartex" xmlns:cx8="http://schemas.microsoft.com/office/drawing/2016/5/14/chartex" xmlns:mc="http://schemas.openxmlformats.org/markup-compatibility/2006" xmlns:aink="http://schemas.microsoft.com/office/drawing/2016/ink" xmlns:am3d="http://schemas.microsoft.com/office/drawing/2017/model3d" xmlns:o="urn:schemas-microsoft-com:office:office" xmlns:oel="http://schemas.microsoft.com/office/2019/extlst" xmlns:r="http://schemas.openxmlformats.org/officeDocument/2006/relationships" xmlns:m="http://schemas.openxmlformats.org/officeDocument/2006/math" xmlns:v="urn:schemas-microsoft-com:vml" xmlns:wp14="http://schemas.microsoft.com/office/word/2010/wordprocessingDrawing" xmlns:wp="http://schemas.openxmlformats.org/drawingml/2006/wordprocessingDrawing" xmlns:w10="urn:schemas-microsoft-com:office:word" xmlns:w="http://schemas.openxmlformats.org/wordprocessingml/2006/main" xmlns:w14="http://schemas.microsoft.com/office/word/2010/wordml" xmlns:w15="http://schemas.microsoft.com/office/word/2012/wordml" xmlns:w16cex="http://schemas.microsoft.com/office/word/2018/wordml/cex" xmlns:w16cid="http://schemas.microsoft.com/office/word/2016/wordml/cid" xmlns:w16="http://schemas.microsoft.com/office/word/2018/wordml" xmlns:w16sdtdh="http://schemas.microsoft.com/office/word/2020/wordml/sdtdatahash" xmlns:w16se="http://schemas.microsoft.com/office/word/2015/wordml/symex" xmlns:wpg="http://schemas.microsoft.com/office/word/2010/wordprocessingGroup" xmlns:wpi="http://schemas.microsoft.com/office/word/2010/wordprocessingInk" xmlns:wne="http://schemas.microsoft.com/office/word/2006/wordml" xmlns:wps="http://schemas.microsoft.com/office/word/2010/wordprocessingShape" mc:Ignorable="w14 w15 w16se w16cid w16 w16cex w16sdtdh wp14">
+<w:endnotes xmlns:wpc="http://schemas.microsoft.com/office/word/2010/wordprocessingCanvas" xmlns:cx="http://schemas.microsoft.com/office/drawing/2014/chartex" xmlns:cx1="http://schemas.microsoft.com/office/drawing/2015/9/8/chartex" xmlns:cx2="http://schemas.microsoft.com/office/drawing/2015/10/21/chartex" xmlns:cx3="http://schemas.microsoft.com/office/drawing/2016/5/9/chartex" xmlns:cx4="http://schemas.microsoft.com/office/drawing/2016/5/10/chartex" xmlns:cx5="http://schemas.microsoft.com/office/drawing/2016/5/11/chartex" xmlns:cx6="http://schemas.microsoft.com/office/drawing/2016/5/12/chartex" xmlns:cx7="http://schemas.microsoft.com/office/drawing/2016/5/13/chartex" xmlns:cx8="http://schemas.microsoft.com/office/drawing/2016/5/14/chartex" xmlns:mc="http://schemas.openxmlformats.org/markup-compatibility/2006" xmlns:aink="http://schemas.microsoft.com/office/drawing/2016/ink" xmlns:am3d="http://schemas.microsoft.com/office/drawing/2017/model3d" xmlns:o="urn:schemas-microsoft-com:office:office" xmlns:oel="http://schemas.microsoft.com/office/2019/extlst" xmlns:r="http://schemas.openxmlformats.org/officeDocument/2006/relationships" xmlns:m="http://schemas.openxmlformats.org/officeDocument/2006/math" xmlns:v="urn:schemas-microsoft-com:vml" xmlns:wp14="http://schemas.microsoft.com/office/word/2010/wordprocessingDrawing" xmlns:wp="http://schemas.openxmlformats.org/drawingml/2006/wordprocessingDrawing" xmlns:w10="urn:schemas-microsoft-com:office:word" xmlns:w="http://schemas.openxmlformats.org/wordprocessingml/2006/main" xmlns:w14="http://schemas.microsoft.com/office/word/2010/wordml" xmlns:w15="http://schemas.microsoft.com/office/word/2012/wordml" xmlns:w16cex="http://schemas.microsoft.com/office/word/2018/wordml/cex" xmlns:w16cid="http://schemas.microsoft.com/office/word/2016/wordml/cid" xmlns:w16="http://schemas.microsoft.com/office/word/2018/wordml" xmlns:w16du="http://schemas.microsoft.com/office/word/2023/wordml/word16du" xmlns:w16sdtdh="http://schemas.microsoft.com/office/word/2020/wordml/sdtdatahash" xmlns:w16sdtfl="http://schemas.microsoft.com/office/word/2024/wordml/sdtformatlock" xmlns:w16se="http://schemas.microsoft.com/office/word/2015/wordml/symex" xmlns:wpg="http://schemas.microsoft.com/office/word/2010/wordprocessingGroup" xmlns:wpi="http://schemas.microsoft.com/office/word/2010/wordprocessingInk" xmlns:wne="http://schemas.microsoft.com/office/word/2006/wordml" xmlns:wps="http://schemas.microsoft.com/office/word/2010/wordprocessingShape" mc:Ignorable="w14 w15 w16se w16cid w16 w16cex w16sdtdh w16sdtfl w16du wp14">
   <w:endnote w:type="separator" w:id="-1">
     <w:p>
       <w:pPr>
@@ -5015,7 +4274,7 @@
 </file>
 
 <file path=word/footnotes.xml><?xml version="1.0" encoding="utf-8"?>
-<w:footnotes xmlns:wpc="http://schemas.microsoft.com/office/word/2010/wordprocessingCanvas" xmlns:cx="http://schemas.microsoft.com/office/drawing/2014/chartex" xmlns:cx1="http://schemas.microsoft.com/office/drawing/2015/9/8/chartex" xmlns:cx2="http://schemas.microsoft.com/office/drawing/2015/10/21/chartex" xmlns:cx3="http://schemas.microsoft.com/office/drawing/2016/5/9/chartex" xmlns:cx4="http://schemas.microsoft.com/office/drawing/2016/5/10/chartex" xmlns:cx5="http://schemas.microsoft.com/office/drawing/2016/5/11/chartex" xmlns:cx6="http://schemas.microsoft.com/office/drawing/2016/5/12/chartex" xmlns:cx7="http://schemas.microsoft.com/office/drawing/2016/5/13/chartex" xmlns:cx8="http://schemas.microsoft.com/office/drawing/2016/5/14/chartex" xmlns:mc="http://schemas.openxmlformats.org/markup-compatibility/2006" xmlns:aink="http://schemas.microsoft.com/office/drawing/2016/ink" xmlns:am3d="http://schemas.microsoft.com/office/drawing/2017/model3d" xmlns:o="urn:schemas-microsoft-com:office:office" xmlns:oel="http://schemas.microsoft.com/office/2019/extlst" xmlns:r="http://schemas.openxmlformats.org/officeDocument/2006/relationships" xmlns:m="http://schemas.openxmlformats.org/officeDocument/2006/math" xmlns:v="urn:schemas-microsoft-com:vml" xmlns:wp14="http://schemas.microsoft.com/office/word/2010/wordprocessingDrawing" xmlns:wp="http://schemas.openxmlformats.org/drawingml/2006/wordprocessingDrawing" xmlns:w10="urn:schemas-microsoft-com:office:word" xmlns:w="http://schemas.openxmlformats.org/wordprocessingml/2006/main" xmlns:w14="http://schemas.microsoft.com/office/word/2010/wordml" xmlns:w15="http://schemas.microsoft.com/office/word/2012/wordml" xmlns:w16cex="http://schemas.microsoft.com/office/word/2018/wordml/cex" xmlns:w16cid="http://schemas.microsoft.com/office/word/2016/wordml/cid" xmlns:w16="http://schemas.microsoft.com/office/word/2018/wordml" xmlns:w16sdtdh="http://schemas.microsoft.com/office/word/2020/wordml/sdtdatahash" xmlns:w16se="http://schemas.microsoft.com/office/word/2015/wordml/symex" xmlns:wpg="http://schemas.microsoft.com/office/word/2010/wordprocessingGroup" xmlns:wpi="http://schemas.microsoft.com/office/word/2010/wordprocessingInk" xmlns:wne="http://schemas.microsoft.com/office/word/2006/wordml" xmlns:wps="http://schemas.microsoft.com/office/word/2010/wordprocessingShape" mc:Ignorable="w14 w15 w16se w16cid w16 w16cex w16sdtdh wp14">
+<w:footnotes xmlns:wpc="http://schemas.microsoft.com/office/word/2010/wordprocessingCanvas" xmlns:cx="http://schemas.microsoft.com/office/drawing/2014/chartex" xmlns:cx1="http://schemas.microsoft.com/office/drawing/2015/9/8/chartex" xmlns:cx2="http://schemas.microsoft.com/office/drawing/2015/10/21/chartex" xmlns:cx3="http://schemas.microsoft.com/office/drawing/2016/5/9/chartex" xmlns:cx4="http://schemas.microsoft.com/office/drawing/2016/5/10/chartex" xmlns:cx5="http://schemas.microsoft.com/office/drawing/2016/5/11/chartex" xmlns:cx6="http://schemas.microsoft.com/office/drawing/2016/5/12/chartex" xmlns:cx7="http://schemas.microsoft.com/office/drawing/2016/5/13/chartex" xmlns:cx8="http://schemas.microsoft.com/office/drawing/2016/5/14/chartex" xmlns:mc="http://schemas.openxmlformats.org/markup-compatibility/2006" xmlns:aink="http://schemas.microsoft.com/office/drawing/2016/ink" xmlns:am3d="http://schemas.microsoft.com/office/drawing/2017/model3d" xmlns:o="urn:schemas-microsoft-com:office:office" xmlns:oel="http://schemas.microsoft.com/office/2019/extlst" xmlns:r="http://schemas.openxmlformats.org/officeDocument/2006/relationships" xmlns:m="http://schemas.openxmlformats.org/officeDocument/2006/math" xmlns:v="urn:schemas-microsoft-com:vml" xmlns:wp14="http://schemas.microsoft.com/office/word/2010/wordprocessingDrawing" xmlns:wp="http://schemas.openxmlformats.org/drawingml/2006/wordprocessingDrawing" xmlns:w10="urn:schemas-microsoft-com:office:word" xmlns:w="http://schemas.openxmlformats.org/wordprocessingml/2006/main" xmlns:w14="http://schemas.microsoft.com/office/word/2010/wordml" xmlns:w15="http://schemas.microsoft.com/office/word/2012/wordml" xmlns:w16cex="http://schemas.microsoft.com/office/word/2018/wordml/cex" xmlns:w16cid="http://schemas.microsoft.com/office/word/2016/wordml/cid" xmlns:w16="http://schemas.microsoft.com/office/word/2018/wordml" xmlns:w16du="http://schemas.microsoft.com/office/word/2023/wordml/word16du" xmlns:w16sdtdh="http://schemas.microsoft.com/office/word/2020/wordml/sdtdatahash" xmlns:w16sdtfl="http://schemas.microsoft.com/office/word/2024/wordml/sdtformatlock" xmlns:w16se="http://schemas.microsoft.com/office/word/2015/wordml/symex" xmlns:wpg="http://schemas.microsoft.com/office/word/2010/wordprocessingGroup" xmlns:wpi="http://schemas.microsoft.com/office/word/2010/wordprocessingInk" xmlns:wne="http://schemas.microsoft.com/office/word/2006/wordml" xmlns:wps="http://schemas.microsoft.com/office/word/2010/wordprocessingShape" mc:Ignorable="w14 w15 w16se w16cid w16 w16cex w16sdtdh w16sdtfl w16du wp14">
   <w:footnote w:type="separator" w:id="-1">
     <w:p>
       <w:pPr>
@@ -5040,11 +4299,11 @@
 </file>
 
 <file path=word/numbering.xml><?xml version="1.0" encoding="utf-8"?>
-<w:numbering xmlns:wpc="http://schemas.microsoft.com/office/word/2010/wordprocessingCanvas" xmlns:cx="http://schemas.microsoft.com/office/drawing/2014/chartex" xmlns:cx1="http://schemas.microsoft.com/office/drawing/2015/9/8/chartex" xmlns:cx2="http://schemas.microsoft.com/office/drawing/2015/10/21/chartex" xmlns:cx3="http://schemas.microsoft.com/office/drawing/2016/5/9/chartex" xmlns:cx4="http://schemas.microsoft.com/office/drawing/2016/5/10/chartex" xmlns:cx5="http://schemas.microsoft.com/office/drawing/2016/5/11/chartex" xmlns:cx6="http://schemas.microsoft.com/office/drawing/2016/5/12/chartex" xmlns:cx7="http://schemas.microsoft.com/office/drawing/2016/5/13/chartex" xmlns:cx8="http://schemas.microsoft.com/office/drawing/2016/5/14/chartex" xmlns:mc="http://schemas.openxmlformats.org/markup-compatibility/2006" xmlns:aink="http://schemas.microsoft.com/office/drawing/2016/ink" xmlns:am3d="http://schemas.microsoft.com/office/drawing/2017/model3d" xmlns:o="urn:schemas-microsoft-com:office:office" xmlns:oel="http://schemas.microsoft.com/office/2019/extlst" xmlns:r="http://schemas.openxmlformats.org/officeDocument/2006/relationships" xmlns:m="http://schemas.openxmlformats.org/officeDocument/2006/math" xmlns:v="urn:schemas-microsoft-com:vml" xmlns:wp14="http://schemas.microsoft.com/office/word/2010/wordprocessingDrawing" xmlns:wp="http://schemas.openxmlformats.org/drawingml/2006/wordprocessingDrawing" xmlns:w10="urn:schemas-microsoft-com:office:word" xmlns:w="http://schemas.openxmlformats.org/wordprocessingml/2006/main" xmlns:w14="http://schemas.microsoft.com/office/word/2010/wordml" xmlns:w15="http://schemas.microsoft.com/office/word/2012/wordml" xmlns:w16cex="http://schemas.microsoft.com/office/word/2018/wordml/cex" xmlns:w16cid="http://schemas.microsoft.com/office/word/2016/wordml/cid" xmlns:w16="http://schemas.microsoft.com/office/word/2018/wordml" xmlns:w16sdtdh="http://schemas.microsoft.com/office/word/2020/wordml/sdtdatahash" xmlns:w16se="http://schemas.microsoft.com/office/word/2015/wordml/symex" xmlns:wpg="http://schemas.microsoft.com/office/word/2010/wordprocessingGroup" xmlns:wpi="http://schemas.microsoft.com/office/word/2010/wordprocessingInk" xmlns:wne="http://schemas.microsoft.com/office/word/2006/wordml" xmlns:wps="http://schemas.microsoft.com/office/word/2010/wordprocessingShape" mc:Ignorable="w14 w15 w16se w16cid w16 w16cex w16sdtdh wp14">
+<w:numbering xmlns:wpc="http://schemas.microsoft.com/office/word/2010/wordprocessingCanvas" xmlns:cx="http://schemas.microsoft.com/office/drawing/2014/chartex" xmlns:cx1="http://schemas.microsoft.com/office/drawing/2015/9/8/chartex" xmlns:cx2="http://schemas.microsoft.com/office/drawing/2015/10/21/chartex" xmlns:cx3="http://schemas.microsoft.com/office/drawing/2016/5/9/chartex" xmlns:cx4="http://schemas.microsoft.com/office/drawing/2016/5/10/chartex" xmlns:cx5="http://schemas.microsoft.com/office/drawing/2016/5/11/chartex" xmlns:cx6="http://schemas.microsoft.com/office/drawing/2016/5/12/chartex" xmlns:cx7="http://schemas.microsoft.com/office/drawing/2016/5/13/chartex" xmlns:cx8="http://schemas.microsoft.com/office/drawing/2016/5/14/chartex" xmlns:mc="http://schemas.openxmlformats.org/markup-compatibility/2006" xmlns:aink="http://schemas.microsoft.com/office/drawing/2016/ink" xmlns:am3d="http://schemas.microsoft.com/office/drawing/2017/model3d" xmlns:o="urn:schemas-microsoft-com:office:office" xmlns:oel="http://schemas.microsoft.com/office/2019/extlst" xmlns:r="http://schemas.openxmlformats.org/officeDocument/2006/relationships" xmlns:m="http://schemas.openxmlformats.org/officeDocument/2006/math" xmlns:v="urn:schemas-microsoft-com:vml" xmlns:wp14="http://schemas.microsoft.com/office/word/2010/wordprocessingDrawing" xmlns:wp="http://schemas.openxmlformats.org/drawingml/2006/wordprocessingDrawing" xmlns:w10="urn:schemas-microsoft-com:office:word" xmlns:w="http://schemas.openxmlformats.org/wordprocessingml/2006/main" xmlns:w14="http://schemas.microsoft.com/office/word/2010/wordml" xmlns:w15="http://schemas.microsoft.com/office/word/2012/wordml" xmlns:w16cex="http://schemas.microsoft.com/office/word/2018/wordml/cex" xmlns:w16cid="http://schemas.microsoft.com/office/word/2016/wordml/cid" xmlns:w16="http://schemas.microsoft.com/office/word/2018/wordml" xmlns:w16du="http://schemas.microsoft.com/office/word/2023/wordml/word16du" xmlns:w16sdtdh="http://schemas.microsoft.com/office/word/2020/wordml/sdtdatahash" xmlns:w16sdtfl="http://schemas.microsoft.com/office/word/2024/wordml/sdtformatlock" xmlns:w16se="http://schemas.microsoft.com/office/word/2015/wordml/symex" xmlns:wpg="http://schemas.microsoft.com/office/word/2010/wordprocessingGroup" xmlns:wpi="http://schemas.microsoft.com/office/word/2010/wordprocessingInk" xmlns:wne="http://schemas.microsoft.com/office/word/2006/wordml" xmlns:wps="http://schemas.microsoft.com/office/word/2010/wordprocessingShape" mc:Ignorable="w14 w15 w16se w16cid w16 w16cex w16sdtdh w16sdtfl w16du wp14">
   <w:abstractNum w:abstractNumId="0" w15:restartNumberingAfterBreak="0">
     <w:nsid w:val="01B118DF"/>
     <w:multiLevelType w:val="multilevel"/>
-    <w:tmpl w:val="AD52906C"/>
+    <w:tmpl w:val="23DAD57A"/>
     <w:lvl w:ilvl="0">
       <w:start w:val="1"/>
       <w:numFmt w:val="lowerLetter"/>
@@ -5060,14 +4319,13 @@
     <w:lvl w:ilvl="1">
       <w:start w:val="1"/>
       <w:numFmt w:val="bullet"/>
-      <w:lvlText w:val=""/>
+      <w:lvlText w:val=""/>
       <w:lvlJc w:val="left"/>
       <w:pPr>
         <w:ind w:left="1440" w:hanging="360"/>
       </w:pPr>
       <w:rPr>
         <w:rFonts w:ascii="Symbol" w:hAnsi="Symbol" w:hint="default"/>
-        <w:u w:val="none"/>
       </w:rPr>
     </w:lvl>
     <w:lvl w:ilvl="2">
@@ -5357,7 +4615,7 @@
   <w:abstractNum w:abstractNumId="3" w15:restartNumberingAfterBreak="0">
     <w:nsid w:val="08A312AD"/>
     <w:multiLevelType w:val="multilevel"/>
-    <w:tmpl w:val="87B4AE9C"/>
+    <w:tmpl w:val="85626A50"/>
     <w:lvl w:ilvl="0">
       <w:start w:val="1"/>
       <w:numFmt w:val="decimal"/>
@@ -5385,14 +4643,13 @@
     <w:lvl w:ilvl="2">
       <w:start w:val="1"/>
       <w:numFmt w:val="bullet"/>
-      <w:lvlText w:val=""/>
+      <w:lvlText w:val=""/>
       <w:lvlJc w:val="left"/>
       <w:pPr>
         <w:ind w:left="2160" w:hanging="360"/>
       </w:pPr>
       <w:rPr>
         <w:rFonts w:ascii="Symbol" w:hAnsi="Symbol" w:hint="default"/>
-        <w:u w:val="none"/>
       </w:rPr>
     </w:lvl>
     <w:lvl w:ilvl="3">
@@ -5828,11 +5085,11 @@
   <w:abstractNum w:abstractNumId="7" w15:restartNumberingAfterBreak="0">
     <w:nsid w:val="1CB87575"/>
     <w:multiLevelType w:val="multilevel"/>
-    <w:tmpl w:val="D5303676"/>
+    <w:tmpl w:val="5D365BD4"/>
     <w:lvl w:ilvl="0">
       <w:start w:val="1"/>
       <w:numFmt w:val="bullet"/>
-      <w:lvlText w:val=""/>
+      <w:lvlText w:val=""/>
       <w:lvlJc w:val="left"/>
       <w:pPr>
         <w:ind w:left="1440" w:hanging="360"/>
@@ -6227,11 +5484,11 @@
   <w:abstractNum w:abstractNumId="11" w15:restartNumberingAfterBreak="0">
     <w:nsid w:val="2B325392"/>
     <w:multiLevelType w:val="multilevel"/>
-    <w:tmpl w:val="D5303676"/>
+    <w:tmpl w:val="375E97FC"/>
     <w:lvl w:ilvl="0">
       <w:start w:val="1"/>
       <w:numFmt w:val="bullet"/>
-      <w:lvlText w:val=""/>
+      <w:lvlText w:val=""/>
       <w:lvlJc w:val="left"/>
       <w:pPr>
         <w:ind w:left="1440" w:hanging="360"/>
@@ -6924,11 +6181,11 @@
   <w:abstractNum w:abstractNumId="17" w15:restartNumberingAfterBreak="0">
     <w:nsid w:val="381F2D84"/>
     <w:multiLevelType w:val="multilevel"/>
-    <w:tmpl w:val="D5303676"/>
+    <w:tmpl w:val="D138F652"/>
     <w:lvl w:ilvl="0">
       <w:start w:val="1"/>
       <w:numFmt w:val="bullet"/>
-      <w:lvlText w:val=""/>
+      <w:lvlText w:val=""/>
       <w:lvlJc w:val="left"/>
       <w:pPr>
         <w:ind w:left="1440" w:hanging="360"/>
@@ -8285,11 +7542,11 @@
   <w:abstractNum w:abstractNumId="30" w15:restartNumberingAfterBreak="0">
     <w:nsid w:val="5E6F2189"/>
     <w:multiLevelType w:val="hybridMultilevel"/>
-    <w:tmpl w:val="EA30DE0E"/>
-    <w:lvl w:ilvl="0" w:tplc="04190001">
-      <w:start w:val="1"/>
-      <w:numFmt w:val="bullet"/>
-      <w:lvlText w:val=""/>
+    <w:tmpl w:val="D284BD7C"/>
+    <w:lvl w:ilvl="0" w:tplc="C6568E82">
+      <w:start w:val="1"/>
+      <w:numFmt w:val="bullet"/>
+      <w:lvlText w:val=""/>
       <w:lvlJc w:val="left"/>
       <w:pPr>
         <w:ind w:left="1440" w:hanging="360"/>
@@ -10116,11 +9373,11 @@
   <w:abstractNum w:abstractNumId="45" w15:restartNumberingAfterBreak="0">
     <w:nsid w:val="7C1D4002"/>
     <w:multiLevelType w:val="hybridMultilevel"/>
-    <w:tmpl w:val="25EC15F8"/>
-    <w:lvl w:ilvl="0" w:tplc="04190001">
-      <w:start w:val="1"/>
-      <w:numFmt w:val="bullet"/>
-      <w:lvlText w:val=""/>
+    <w:tmpl w:val="D8B2AFFE"/>
+    <w:lvl w:ilvl="0" w:tplc="C6568E82">
+      <w:start w:val="1"/>
+      <w:numFmt w:val="bullet"/>
+      <w:lvlText w:val=""/>
       <w:lvlJc w:val="left"/>
       <w:pPr>
         <w:ind w:left="2227" w:hanging="360"/>
@@ -10484,7 +9741,7 @@
 </file>
 
 <file path=word/styles.xml><?xml version="1.0" encoding="utf-8"?>
-<w:styles xmlns:mc="http://schemas.openxmlformats.org/markup-compatibility/2006" xmlns:r="http://schemas.openxmlformats.org/officeDocument/2006/relationships" xmlns:w="http://schemas.openxmlformats.org/wordprocessingml/2006/main" xmlns:w14="http://schemas.microsoft.com/office/word/2010/wordml" xmlns:w15="http://schemas.microsoft.com/office/word/2012/wordml" xmlns:w16cex="http://schemas.microsoft.com/office/word/2018/wordml/cex" xmlns:w16cid="http://schemas.microsoft.com/office/word/2016/wordml/cid" xmlns:w16="http://schemas.microsoft.com/office/word/2018/wordml" xmlns:w16sdtdh="http://schemas.microsoft.com/office/word/2020/wordml/sdtdatahash" xmlns:w16se="http://schemas.microsoft.com/office/word/2015/wordml/symex" mc:Ignorable="w14 w15 w16se w16cid w16 w16cex w16sdtdh">
+<w:styles xmlns:mc="http://schemas.openxmlformats.org/markup-compatibility/2006" xmlns:r="http://schemas.openxmlformats.org/officeDocument/2006/relationships" xmlns:w="http://schemas.openxmlformats.org/wordprocessingml/2006/main" xmlns:w14="http://schemas.microsoft.com/office/word/2010/wordml" xmlns:w15="http://schemas.microsoft.com/office/word/2012/wordml" xmlns:w16cex="http://schemas.microsoft.com/office/word/2018/wordml/cex" xmlns:w16cid="http://schemas.microsoft.com/office/word/2016/wordml/cid" xmlns:w16="http://schemas.microsoft.com/office/word/2018/wordml" xmlns:w16du="http://schemas.microsoft.com/office/word/2023/wordml/word16du" xmlns:w16sdtdh="http://schemas.microsoft.com/office/word/2020/wordml/sdtdatahash" xmlns:w16sdtfl="http://schemas.microsoft.com/office/word/2024/wordml/sdtformatlock" xmlns:w16se="http://schemas.microsoft.com/office/word/2015/wordml/symex" mc:Ignorable="w14 w15 w16se w16cid w16 w16cex w16sdtdh w16sdtfl w16du">
   <w:docDefaults>
     <w:rPrDefault>
       <w:rPr>
@@ -10878,21 +10135,21 @@
     <w:lsdException w:name="Unresolved Mention" w:semiHidden="1" w:unhideWhenUsed="1"/>
     <w:lsdException w:name="Smart Link" w:semiHidden="1" w:unhideWhenUsed="1"/>
   </w:latentStyles>
-  <w:style w:type="paragraph" w:default="1" w:styleId="Normal">
+  <w:style w:type="paragraph" w:default="1" w:styleId="a">
     <w:name w:val="Normal"/>
     <w:qFormat/>
-    <w:rsid w:val="00933E80"/>
+    <w:rsid w:val="0040708C"/>
     <w:pPr>
       <w:spacing w:before="0" w:after="0" w:line="360" w:lineRule="auto"/>
-      <w:ind w:firstLine="720"/>
+      <w:ind w:firstLine="709"/>
       <w:jc w:val="both"/>
     </w:pPr>
   </w:style>
-  <w:style w:type="paragraph" w:styleId="Heading1">
+  <w:style w:type="paragraph" w:styleId="1">
     <w:name w:val="heading 1"/>
-    <w:basedOn w:val="Normal"/>
-    <w:next w:val="Normal"/>
-    <w:link w:val="Heading1Char"/>
+    <w:basedOn w:val="a"/>
+    <w:next w:val="a"/>
+    <w:link w:val="10"/>
     <w:uiPriority w:val="9"/>
     <w:qFormat/>
     <w:rsid w:val="0098524F"/>
@@ -10906,11 +10163,11 @@
       <w:szCs w:val="40"/>
     </w:rPr>
   </w:style>
-  <w:style w:type="paragraph" w:styleId="Heading2">
+  <w:style w:type="paragraph" w:styleId="2">
     <w:name w:val="heading 2"/>
-    <w:basedOn w:val="Normal"/>
-    <w:next w:val="Normal"/>
-    <w:link w:val="Heading2Char"/>
+    <w:basedOn w:val="a"/>
+    <w:next w:val="a"/>
+    <w:link w:val="20"/>
     <w:uiPriority w:val="9"/>
     <w:unhideWhenUsed/>
     <w:qFormat/>
@@ -10918,7 +10175,6 @@
     <w:pPr>
       <w:keepNext/>
       <w:keepLines/>
-      <w:ind w:firstLine="709"/>
       <w:outlineLvl w:val="1"/>
     </w:pPr>
     <w:rPr>
@@ -10926,11 +10182,11 @@
       <w:szCs w:val="36"/>
     </w:rPr>
   </w:style>
-  <w:style w:type="paragraph" w:styleId="Heading3">
+  <w:style w:type="paragraph" w:styleId="3">
     <w:name w:val="heading 3"/>
-    <w:basedOn w:val="Normal"/>
-    <w:next w:val="Normal"/>
-    <w:link w:val="Heading3Char"/>
+    <w:basedOn w:val="a"/>
+    <w:next w:val="a"/>
+    <w:link w:val="30"/>
     <w:uiPriority w:val="9"/>
     <w:unhideWhenUsed/>
     <w:qFormat/>
@@ -10938,7 +10194,6 @@
     <w:pPr>
       <w:keepNext/>
       <w:keepLines/>
-      <w:ind w:firstLine="709"/>
       <w:outlineLvl w:val="2"/>
     </w:pPr>
     <w:rPr>
@@ -10946,10 +10201,10 @@
       <w:szCs w:val="32"/>
     </w:rPr>
   </w:style>
-  <w:style w:type="paragraph" w:styleId="Heading4">
+  <w:style w:type="paragraph" w:styleId="4">
     <w:name w:val="heading 4"/>
-    <w:basedOn w:val="Normal"/>
-    <w:next w:val="Normal"/>
+    <w:basedOn w:val="a"/>
+    <w:next w:val="a"/>
     <w:uiPriority w:val="9"/>
     <w:unhideWhenUsed/>
     <w:qFormat/>
@@ -10965,10 +10220,10 @@
       <w:szCs w:val="24"/>
     </w:rPr>
   </w:style>
-  <w:style w:type="paragraph" w:styleId="Heading5">
+  <w:style w:type="paragraph" w:styleId="5">
     <w:name w:val="heading 5"/>
-    <w:basedOn w:val="Normal"/>
-    <w:next w:val="Normal"/>
+    <w:basedOn w:val="a"/>
+    <w:next w:val="a"/>
     <w:uiPriority w:val="9"/>
     <w:semiHidden/>
     <w:unhideWhenUsed/>
@@ -10985,10 +10240,10 @@
       <w:szCs w:val="22"/>
     </w:rPr>
   </w:style>
-  <w:style w:type="paragraph" w:styleId="Heading6">
+  <w:style w:type="paragraph" w:styleId="6">
     <w:name w:val="heading 6"/>
-    <w:basedOn w:val="Normal"/>
-    <w:next w:val="Normal"/>
+    <w:basedOn w:val="a"/>
+    <w:next w:val="a"/>
     <w:uiPriority w:val="9"/>
     <w:semiHidden/>
     <w:unhideWhenUsed/>
@@ -11006,12 +10261,13 @@
       <w:szCs w:val="22"/>
     </w:rPr>
   </w:style>
-  <w:style w:type="character" w:default="1" w:styleId="DefaultParagraphFont">
+  <w:style w:type="character" w:default="1" w:styleId="a0">
     <w:name w:val="Default Paragraph Font"/>
     <w:uiPriority w:val="1"/>
+    <w:semiHidden/>
     <w:unhideWhenUsed/>
   </w:style>
-  <w:style w:type="table" w:default="1" w:styleId="TableNormal">
+  <w:style w:type="table" w:default="1" w:styleId="a1">
     <w:name w:val="Normal Table"/>
     <w:uiPriority w:val="99"/>
     <w:semiHidden/>
@@ -11026,13 +10282,13 @@
       </w:tblCellMar>
     </w:tblPr>
   </w:style>
-  <w:style w:type="numbering" w:default="1" w:styleId="NoList">
+  <w:style w:type="numbering" w:default="1" w:styleId="a2">
     <w:name w:val="No List"/>
     <w:uiPriority w:val="99"/>
     <w:semiHidden/>
     <w:unhideWhenUsed/>
   </w:style>
-  <w:style w:type="table" w:customStyle="1" w:styleId="TableNormal0">
+  <w:style w:type="table" w:customStyle="1" w:styleId="TableNormal">
     <w:name w:val="TableNormal"/>
     <w:tblPr>
       <w:tblCellMar>
@@ -11043,10 +10299,10 @@
       </w:tblCellMar>
     </w:tblPr>
   </w:style>
-  <w:style w:type="paragraph" w:styleId="Title">
+  <w:style w:type="paragraph" w:styleId="a3">
     <w:name w:val="Title"/>
-    <w:basedOn w:val="Normal"/>
-    <w:next w:val="Normal"/>
+    <w:basedOn w:val="a"/>
+    <w:next w:val="a"/>
     <w:uiPriority w:val="10"/>
     <w:qFormat/>
     <w:pPr>
@@ -11059,10 +10315,10 @@
       <w:szCs w:val="52"/>
     </w:rPr>
   </w:style>
-  <w:style w:type="paragraph" w:styleId="Subtitle">
+  <w:style w:type="paragraph" w:styleId="a4">
     <w:name w:val="Subtitle"/>
-    <w:basedOn w:val="Normal"/>
-    <w:next w:val="Normal"/>
+    <w:basedOn w:val="a"/>
+    <w:next w:val="a"/>
     <w:uiPriority w:val="11"/>
     <w:qFormat/>
     <w:pPr>
@@ -11077,10 +10333,10 @@
       <w:szCs w:val="30"/>
     </w:rPr>
   </w:style>
-  <w:style w:type="paragraph" w:styleId="Header">
+  <w:style w:type="paragraph" w:styleId="a5">
     <w:name w:val="header"/>
-    <w:basedOn w:val="Normal"/>
-    <w:link w:val="HeaderChar"/>
+    <w:basedOn w:val="a"/>
+    <w:link w:val="a6"/>
     <w:uiPriority w:val="99"/>
     <w:unhideWhenUsed/>
     <w:rsid w:val="0098524F"/>
@@ -11092,17 +10348,17 @@
       <w:spacing w:line="240" w:lineRule="auto"/>
     </w:pPr>
   </w:style>
-  <w:style w:type="character" w:customStyle="1" w:styleId="HeaderChar">
-    <w:name w:val="Header Char"/>
-    <w:basedOn w:val="DefaultParagraphFont"/>
-    <w:link w:val="Header"/>
+  <w:style w:type="character" w:customStyle="1" w:styleId="a6">
+    <w:name w:val="Верхний колонтитул Знак"/>
+    <w:basedOn w:val="a0"/>
+    <w:link w:val="a5"/>
     <w:uiPriority w:val="99"/>
     <w:rsid w:val="0098524F"/>
   </w:style>
-  <w:style w:type="paragraph" w:styleId="Footer">
+  <w:style w:type="paragraph" w:styleId="a7">
     <w:name w:val="footer"/>
-    <w:basedOn w:val="Normal"/>
-    <w:link w:val="FooterChar"/>
+    <w:basedOn w:val="a"/>
+    <w:link w:val="a8"/>
     <w:uiPriority w:val="99"/>
     <w:unhideWhenUsed/>
     <w:rsid w:val="0098524F"/>
@@ -11114,16 +10370,16 @@
       <w:spacing w:line="240" w:lineRule="auto"/>
     </w:pPr>
   </w:style>
-  <w:style w:type="character" w:customStyle="1" w:styleId="FooterChar">
-    <w:name w:val="Footer Char"/>
-    <w:basedOn w:val="DefaultParagraphFont"/>
-    <w:link w:val="Footer"/>
+  <w:style w:type="character" w:customStyle="1" w:styleId="a8">
+    <w:name w:val="Нижний колонтитул Знак"/>
+    <w:basedOn w:val="a0"/>
+    <w:link w:val="a7"/>
     <w:uiPriority w:val="99"/>
     <w:rsid w:val="0098524F"/>
   </w:style>
-  <w:style w:type="paragraph" w:styleId="ListParagraph">
+  <w:style w:type="paragraph" w:styleId="a9">
     <w:name w:val="List Paragraph"/>
-    <w:basedOn w:val="Normal"/>
+    <w:basedOn w:val="a"/>
     <w:uiPriority w:val="34"/>
     <w:qFormat/>
     <w:rsid w:val="0098524F"/>
@@ -11132,10 +10388,10 @@
       <w:contextualSpacing/>
     </w:pPr>
   </w:style>
-  <w:style w:type="character" w:customStyle="1" w:styleId="Heading1Char">
-    <w:name w:val="Heading 1 Char"/>
-    <w:basedOn w:val="DefaultParagraphFont"/>
-    <w:link w:val="Heading1"/>
+  <w:style w:type="character" w:customStyle="1" w:styleId="10">
+    <w:name w:val="Заголовок 1 Знак"/>
+    <w:basedOn w:val="a0"/>
+    <w:link w:val="1"/>
     <w:uiPriority w:val="9"/>
     <w:rsid w:val="00DE2693"/>
     <w:rPr>
@@ -11143,10 +10399,10 @@
       <w:szCs w:val="40"/>
     </w:rPr>
   </w:style>
-  <w:style w:type="character" w:customStyle="1" w:styleId="Heading2Char">
-    <w:name w:val="Heading 2 Char"/>
-    <w:basedOn w:val="DefaultParagraphFont"/>
-    <w:link w:val="Heading2"/>
+  <w:style w:type="character" w:customStyle="1" w:styleId="20">
+    <w:name w:val="Заголовок 2 Знак"/>
+    <w:basedOn w:val="a0"/>
+    <w:link w:val="2"/>
     <w:uiPriority w:val="9"/>
     <w:rsid w:val="00411297"/>
     <w:rPr>
@@ -11154,10 +10410,10 @@
       <w:szCs w:val="36"/>
     </w:rPr>
   </w:style>
-  <w:style w:type="character" w:customStyle="1" w:styleId="Heading3Char">
-    <w:name w:val="Heading 3 Char"/>
-    <w:basedOn w:val="DefaultParagraphFont"/>
-    <w:link w:val="Heading3"/>
+  <w:style w:type="character" w:customStyle="1" w:styleId="30">
+    <w:name w:val="Заголовок 3 Знак"/>
+    <w:basedOn w:val="a0"/>
+    <w:link w:val="3"/>
     <w:uiPriority w:val="9"/>
     <w:rsid w:val="00811964"/>
     <w:rPr>
@@ -11165,10 +10421,10 @@
       <w:szCs w:val="32"/>
     </w:rPr>
   </w:style>
-  <w:style w:type="paragraph" w:styleId="TOCHeading">
+  <w:style w:type="paragraph" w:styleId="aa">
     <w:name w:val="TOC Heading"/>
-    <w:basedOn w:val="Heading1"/>
-    <w:next w:val="Normal"/>
+    <w:basedOn w:val="1"/>
+    <w:next w:val="a"/>
     <w:uiPriority w:val="39"/>
     <w:unhideWhenUsed/>
     <w:qFormat/>
@@ -11186,10 +10442,10 @@
       <w:lang w:val="ru-RU"/>
     </w:rPr>
   </w:style>
-  <w:style w:type="paragraph" w:styleId="TOC1">
+  <w:style w:type="paragraph" w:styleId="11">
     <w:name w:val="toc 1"/>
-    <w:basedOn w:val="Normal"/>
-    <w:next w:val="Normal"/>
+    <w:basedOn w:val="a"/>
+    <w:next w:val="a"/>
     <w:autoRedefine/>
     <w:uiPriority w:val="39"/>
     <w:unhideWhenUsed/>
@@ -11198,10 +10454,10 @@
       <w:spacing w:after="100"/>
     </w:pPr>
   </w:style>
-  <w:style w:type="paragraph" w:styleId="TOC2">
+  <w:style w:type="paragraph" w:styleId="21">
     <w:name w:val="toc 2"/>
-    <w:basedOn w:val="Normal"/>
-    <w:next w:val="Normal"/>
+    <w:basedOn w:val="a"/>
+    <w:next w:val="a"/>
     <w:autoRedefine/>
     <w:uiPriority w:val="39"/>
     <w:unhideWhenUsed/>
@@ -11211,10 +10467,10 @@
       <w:ind w:left="280"/>
     </w:pPr>
   </w:style>
-  <w:style w:type="paragraph" w:styleId="TOC3">
+  <w:style w:type="paragraph" w:styleId="31">
     <w:name w:val="toc 3"/>
-    <w:basedOn w:val="Normal"/>
-    <w:next w:val="Normal"/>
+    <w:basedOn w:val="a"/>
+    <w:next w:val="a"/>
     <w:autoRedefine/>
     <w:uiPriority w:val="39"/>
     <w:unhideWhenUsed/>
@@ -11224,9 +10480,9 @@
       <w:ind w:left="560"/>
     </w:pPr>
   </w:style>
-  <w:style w:type="character" w:styleId="Hyperlink">
+  <w:style w:type="character" w:styleId="ab">
     <w:name w:val="Hyperlink"/>
-    <w:basedOn w:val="DefaultParagraphFont"/>
+    <w:basedOn w:val="a0"/>
     <w:uiPriority w:val="99"/>
     <w:unhideWhenUsed/>
     <w:rsid w:val="00C73440"/>
@@ -11235,9 +10491,9 @@
       <w:u w:val="single"/>
     </w:rPr>
   </w:style>
-  <w:style w:type="paragraph" w:styleId="NormalWeb">
+  <w:style w:type="paragraph" w:styleId="ac">
     <w:name w:val="Normal (Web)"/>
-    <w:basedOn w:val="Normal"/>
+    <w:basedOn w:val="a"/>
     <w:uiPriority w:val="99"/>
     <w:semiHidden/>
     <w:unhideWhenUsed/>

</xml_diff>